<commit_message>
mappings(s1-cl1): update ICTCLD401 + ICTICT517 assessment mappings
Mapping changes made as a result of the S1 CL1 institutional review step.

Co-Authored-By: Claude Opus 4.8 (1M context) <noreply@anthropic.com>
</commit_message>
<xml_diff>
--- a/S1-CL1-Cloud-Design-Build/mappings/ICTCLD401_Assessment_Mapping.docx
+++ b/S1-CL1-Cloud-Design-Build/mappings/ICTCLD401_Assessment_Mapping.docx
@@ -1,6 +1,6 @@
 
 <file path=word/document.xml><?xml version="1.0" encoding="utf-8"?>
-<w:document xmlns:wpc="http://schemas.microsoft.com/office/word/2010/wordprocessingCanvas" xmlns:cx="http://schemas.microsoft.com/office/drawing/2014/chartex" xmlns:cx1="http://schemas.microsoft.com/office/drawing/2015/9/8/chartex" xmlns:cx2="http://schemas.microsoft.com/office/drawing/2015/10/21/chartex" xmlns:cx3="http://schemas.microsoft.com/office/drawing/2016/5/9/chartex" xmlns:cx4="http://schemas.microsoft.com/office/drawing/2016/5/10/chartex" xmlns:cx5="http://schemas.microsoft.com/office/drawing/2016/5/11/chartex" xmlns:cx6="http://schemas.microsoft.com/office/drawing/2016/5/12/chartex" xmlns:cx7="http://schemas.microsoft.com/office/drawing/2016/5/13/chartex" xmlns:cx8="http://schemas.microsoft.com/office/drawing/2016/5/14/chartex" xmlns:mc="http://schemas.openxmlformats.org/markup-compatibility/2006" xmlns:aink="http://schemas.microsoft.com/office/drawing/2016/ink" xmlns:am3d="http://schemas.microsoft.com/office/drawing/2017/model3d" xmlns:o="urn:schemas-microsoft-com:office:office" xmlns:oel="http://schemas.microsoft.com/office/2019/extlst" xmlns:r="http://schemas.openxmlformats.org/officeDocument/2006/relationships" xmlns:m="http://schemas.openxmlformats.org/officeDocument/2006/math" xmlns:v="urn:schemas-microsoft-com:vml" xmlns:wp14="http://schemas.microsoft.com/office/word/2010/wordprocessingDrawing" xmlns:wp="http://schemas.openxmlformats.org/drawingml/2006/wordprocessingDrawing" xmlns:w10="urn:schemas-microsoft-com:office:word" xmlns:w="http://schemas.openxmlformats.org/wordprocessingml/2006/main" xmlns:w14="http://schemas.microsoft.com/office/word/2010/wordml" xmlns:w15="http://schemas.microsoft.com/office/word/2012/wordml" xmlns:w16cex="http://schemas.microsoft.com/office/word/2018/wordml/cex" xmlns:w16cid="http://schemas.microsoft.com/office/word/2016/wordml/cid" xmlns:w16="http://schemas.microsoft.com/office/word/2018/wordml" xmlns:w16sdtdh="http://schemas.microsoft.com/office/word/2020/wordml/sdtdatahash" xmlns:w16se="http://schemas.microsoft.com/office/word/2015/wordml/symex" xmlns:wpg="http://schemas.microsoft.com/office/word/2010/wordprocessingGroup" xmlns:wpi="http://schemas.microsoft.com/office/word/2010/wordprocessingInk" xmlns:wne="http://schemas.microsoft.com/office/word/2006/wordml" xmlns:wps="http://schemas.microsoft.com/office/word/2010/wordprocessingShape" mc:Ignorable="w14 w15 w16se w16cid w16 w16cex w16sdtdh wp14">
+<w:document xmlns:wpc="http://schemas.microsoft.com/office/word/2010/wordprocessingCanvas" xmlns:cx="http://schemas.microsoft.com/office/drawing/2014/chartex" xmlns:cx1="http://schemas.microsoft.com/office/drawing/2015/9/8/chartex" xmlns:cx2="http://schemas.microsoft.com/office/drawing/2015/10/21/chartex" xmlns:cx3="http://schemas.microsoft.com/office/drawing/2016/5/9/chartex" xmlns:cx4="http://schemas.microsoft.com/office/drawing/2016/5/10/chartex" xmlns:cx5="http://schemas.microsoft.com/office/drawing/2016/5/11/chartex" xmlns:cx6="http://schemas.microsoft.com/office/drawing/2016/5/12/chartex" xmlns:cx7="http://schemas.microsoft.com/office/drawing/2016/5/13/chartex" xmlns:cx8="http://schemas.microsoft.com/office/drawing/2016/5/14/chartex" xmlns:mc="http://schemas.openxmlformats.org/markup-compatibility/2006" xmlns:m="http://schemas.openxmlformats.org/officeDocument/2006/math" xmlns:aink="http://schemas.microsoft.com/office/drawing/2016/ink" xmlns:am3d="http://schemas.microsoft.com/office/drawing/2017/model3d" xmlns:oel="http://schemas.microsoft.com/office/2019/extlst" xmlns:r="http://schemas.openxmlformats.org/officeDocument/2006/relationships" xmlns:wp14="http://schemas.microsoft.com/office/word/2010/wordprocessingDrawing" xmlns:wp="http://schemas.openxmlformats.org/drawingml/2006/wordprocessingDrawing" xmlns:wpg="http://schemas.microsoft.com/office/word/2010/wordprocessingGroup" xmlns:wpi="http://schemas.microsoft.com/office/word/2010/wordprocessingInk" xmlns:wps="http://schemas.microsoft.com/office/word/2010/wordprocessingShape" xmlns:o="urn:schemas-microsoft-com:office:office" xmlns:v="urn:schemas-microsoft-com:vml" xmlns:w10="urn:schemas-microsoft-com:office:word" xmlns:w="http://schemas.openxmlformats.org/wordprocessingml/2006/main" xmlns:w14="http://schemas.microsoft.com/office/word/2010/wordml" xmlns:w15="http://schemas.microsoft.com/office/word/2012/wordml" xmlns:w16cex="http://schemas.microsoft.com/office/word/2018/wordml/cex" xmlns:w16cid="http://schemas.microsoft.com/office/word/2016/wordml/cid" xmlns:w16="http://schemas.microsoft.com/office/word/2018/wordml" xmlns:w16sdtdh="http://schemas.microsoft.com/office/word/2020/wordml/sdtdatahash" xmlns:w16sdtfl="http://schemas.microsoft.com/office/word/2024/wordml/sdtformatlock" xmlns:w16se="http://schemas.microsoft.com/office/word/2015/wordml/symex" xmlns:w16du="http://schemas.microsoft.com/office/word/2023/wordml/word16du" xmlns:wne="http://schemas.microsoft.com/office/word/2006/wordml" mc:Ignorable="w14 w15 w16se w16cid w16 w16cex w16sdtdh w16sdtfl w16du wp14">
   <w:body>
     <w:p>
       <w:pPr>
@@ -74,7 +74,6 @@
               <w:bottom w:val="nil"/>
               <w:right w:val="nil"/>
             </w:tcBorders>
-            <w:shd w:val="clear" w:color="auto" w:fill="auto"/>
           </w:tcPr>
           <w:p>
             <w:r>
@@ -200,7 +199,6 @@
               <w:bottom w:val="single" w:sz="4" w:space="0" w:color="auto"/>
               <w:right w:val="single" w:sz="4" w:space="0" w:color="auto"/>
             </w:tcBorders>
-            <w:shd w:val="clear" w:color="auto" w:fill="auto"/>
             <w:vAlign w:val="center"/>
           </w:tcPr>
           <w:p>
@@ -221,7 +219,6 @@
               <w:bottom w:val="single" w:sz="4" w:space="0" w:color="auto"/>
               <w:right w:val="single" w:sz="4" w:space="0" w:color="auto"/>
             </w:tcBorders>
-            <w:shd w:val="clear" w:color="auto" w:fill="auto"/>
             <w:vAlign w:val="center"/>
           </w:tcPr>
           <w:p>
@@ -242,7 +239,6 @@
               <w:bottom w:val="single" w:sz="4" w:space="0" w:color="auto"/>
               <w:right w:val="single" w:sz="4" w:space="0" w:color="auto"/>
             </w:tcBorders>
-            <w:shd w:val="clear" w:color="auto" w:fill="auto"/>
             <w:vAlign w:val="center"/>
           </w:tcPr>
           <w:p>
@@ -263,7 +259,6 @@
               <w:bottom w:val="single" w:sz="4" w:space="0" w:color="auto"/>
               <w:right w:val="single" w:sz="4" w:space="0" w:color="auto"/>
             </w:tcBorders>
-            <w:shd w:val="clear" w:color="auto" w:fill="auto"/>
             <w:vAlign w:val="center"/>
           </w:tcPr>
           <w:p>
@@ -284,7 +279,6 @@
               <w:bottom w:val="single" w:sz="4" w:space="0" w:color="auto"/>
               <w:right w:val="single" w:sz="4" w:space="0" w:color="auto"/>
             </w:tcBorders>
-            <w:shd w:val="clear" w:color="auto" w:fill="auto"/>
             <w:vAlign w:val="center"/>
           </w:tcPr>
           <w:p>
@@ -305,7 +299,6 @@
               <w:bottom w:val="single" w:sz="4" w:space="0" w:color="auto"/>
               <w:right w:val="nil"/>
             </w:tcBorders>
-            <w:shd w:val="clear" w:color="auto" w:fill="auto"/>
             <w:vAlign w:val="center"/>
           </w:tcPr>
           <w:p>
@@ -328,7 +321,6 @@
               <w:bottom w:val="single" w:sz="4" w:space="0" w:color="auto"/>
               <w:right w:val="single" w:sz="4" w:space="0" w:color="auto"/>
             </w:tcBorders>
-            <w:shd w:val="clear" w:color="auto" w:fill="auto"/>
             <w:vAlign w:val="center"/>
           </w:tcPr>
           <w:p>
@@ -349,7 +341,6 @@
               <w:bottom w:val="single" w:sz="4" w:space="0" w:color="auto"/>
               <w:right w:val="single" w:sz="4" w:space="0" w:color="auto"/>
             </w:tcBorders>
-            <w:shd w:val="clear" w:color="auto" w:fill="auto"/>
             <w:vAlign w:val="center"/>
           </w:tcPr>
           <w:p>
@@ -370,7 +361,6 @@
               <w:bottom w:val="single" w:sz="4" w:space="0" w:color="auto"/>
               <w:right w:val="single" w:sz="4" w:space="0" w:color="auto"/>
             </w:tcBorders>
-            <w:shd w:val="clear" w:color="auto" w:fill="auto"/>
             <w:vAlign w:val="center"/>
           </w:tcPr>
           <w:p>
@@ -392,7 +382,6 @@
               <w:bottom w:val="single" w:sz="4" w:space="0" w:color="auto"/>
               <w:right w:val="nil"/>
             </w:tcBorders>
-            <w:shd w:val="clear" w:color="auto" w:fill="auto"/>
             <w:vAlign w:val="center"/>
           </w:tcPr>
           <w:p>
@@ -415,7 +404,6 @@
               <w:bottom w:val="single" w:sz="4" w:space="0" w:color="auto"/>
               <w:right w:val="single" w:sz="4" w:space="0" w:color="auto"/>
             </w:tcBorders>
-            <w:shd w:val="clear" w:color="auto" w:fill="auto"/>
             <w:vAlign w:val="center"/>
           </w:tcPr>
           <w:p>
@@ -437,7 +425,6 @@
               <w:bottom w:val="single" w:sz="4" w:space="0" w:color="auto"/>
               <w:right w:val="nil"/>
             </w:tcBorders>
-            <w:shd w:val="clear" w:color="auto" w:fill="auto"/>
             <w:vAlign w:val="center"/>
           </w:tcPr>
           <w:p>
@@ -457,7 +444,6 @@
               <w:bottom w:val="single" w:sz="4" w:space="0" w:color="auto"/>
               <w:right w:val="single" w:sz="4" w:space="0" w:color="auto"/>
             </w:tcBorders>
-            <w:shd w:val="clear" w:color="auto" w:fill="auto"/>
             <w:vAlign w:val="center"/>
           </w:tcPr>
           <w:p>
@@ -479,7 +465,6 @@
               <w:bottom w:val="single" w:sz="4" w:space="0" w:color="auto"/>
               <w:right w:val="nil"/>
             </w:tcBorders>
-            <w:shd w:val="clear" w:color="auto" w:fill="auto"/>
             <w:vAlign w:val="center"/>
           </w:tcPr>
           <w:p>
@@ -550,7 +535,6 @@
               <w:bottom w:val="single" w:sz="4" w:space="0" w:color="auto"/>
               <w:right w:val="single" w:sz="4" w:space="0" w:color="auto"/>
             </w:tcBorders>
-            <w:shd w:val="clear" w:color="auto" w:fill="auto"/>
           </w:tcPr>
           <w:p>
             <w:pPr>
@@ -567,7 +551,6 @@
               <w:bottom w:val="single" w:sz="4" w:space="0" w:color="auto"/>
               <w:right w:val="single" w:sz="4" w:space="0" w:color="auto"/>
             </w:tcBorders>
-            <w:shd w:val="clear" w:color="auto" w:fill="auto"/>
             <w:vAlign w:val="center"/>
           </w:tcPr>
           <w:p>
@@ -588,7 +571,6 @@
               <w:bottom w:val="single" w:sz="4" w:space="0" w:color="auto"/>
               <w:right w:val="nil"/>
             </w:tcBorders>
-            <w:shd w:val="clear" w:color="auto" w:fill="auto"/>
             <w:vAlign w:val="center"/>
           </w:tcPr>
           <w:p>
@@ -614,7 +596,6 @@
               <w:bottom w:val="single" w:sz="4" w:space="0" w:color="auto"/>
               <w:right w:val="single" w:sz="4" w:space="0" w:color="auto"/>
             </w:tcBorders>
-            <w:shd w:val="clear" w:color="auto" w:fill="auto"/>
             <w:vAlign w:val="center"/>
           </w:tcPr>
           <w:p>
@@ -638,7 +619,6 @@
               <w:bottom w:val="single" w:sz="4" w:space="0" w:color="auto"/>
               <w:right w:val="single" w:sz="4" w:space="0" w:color="auto"/>
             </w:tcBorders>
-            <w:shd w:val="clear" w:color="auto" w:fill="auto"/>
             <w:vAlign w:val="center"/>
           </w:tcPr>
           <w:p>
@@ -656,7 +636,6 @@
               <w:bottom w:val="single" w:sz="4" w:space="0" w:color="auto"/>
               <w:right w:val="nil"/>
             </w:tcBorders>
-            <w:shd w:val="clear" w:color="auto" w:fill="auto"/>
             <w:vAlign w:val="center"/>
           </w:tcPr>
           <w:p>
@@ -679,7 +658,6 @@
               <w:bottom w:val="single" w:sz="4" w:space="0" w:color="auto"/>
               <w:right w:val="single" w:sz="4" w:space="0" w:color="auto"/>
             </w:tcBorders>
-            <w:shd w:val="clear" w:color="auto" w:fill="auto"/>
             <w:vAlign w:val="center"/>
           </w:tcPr>
           <w:p>
@@ -703,7 +681,6 @@
               <w:bottom w:val="single" w:sz="4" w:space="0" w:color="auto"/>
               <w:right w:val="single" w:sz="4" w:space="0" w:color="auto"/>
             </w:tcBorders>
-            <w:shd w:val="clear" w:color="auto" w:fill="auto"/>
             <w:vAlign w:val="center"/>
           </w:tcPr>
           <w:p>
@@ -721,7 +698,6 @@
               <w:bottom w:val="single" w:sz="4" w:space="0" w:color="auto"/>
               <w:right w:val="nil"/>
             </w:tcBorders>
-            <w:shd w:val="clear" w:color="auto" w:fill="auto"/>
             <w:vAlign w:val="center"/>
           </w:tcPr>
           <w:p>
@@ -744,7 +720,6 @@
               <w:bottom w:val="single" w:sz="4" w:space="0" w:color="auto"/>
               <w:right w:val="single" w:sz="4" w:space="0" w:color="auto"/>
             </w:tcBorders>
-            <w:shd w:val="clear" w:color="auto" w:fill="auto"/>
             <w:vAlign w:val="center"/>
           </w:tcPr>
           <w:p>
@@ -768,7 +743,6 @@
               <w:bottom w:val="single" w:sz="4" w:space="0" w:color="auto"/>
               <w:right w:val="single" w:sz="4" w:space="0" w:color="auto"/>
             </w:tcBorders>
-            <w:shd w:val="clear" w:color="auto" w:fill="auto"/>
             <w:vAlign w:val="center"/>
           </w:tcPr>
           <w:p>
@@ -786,7 +760,6 @@
               <w:bottom w:val="single" w:sz="4" w:space="0" w:color="auto"/>
               <w:right w:val="nil"/>
             </w:tcBorders>
-            <w:shd w:val="clear" w:color="auto" w:fill="auto"/>
             <w:vAlign w:val="center"/>
           </w:tcPr>
           <w:p>
@@ -809,7 +782,6 @@
               <w:bottom w:val="single" w:sz="4" w:space="0" w:color="auto"/>
               <w:right w:val="single" w:sz="4" w:space="0" w:color="auto"/>
             </w:tcBorders>
-            <w:shd w:val="clear" w:color="auto" w:fill="auto"/>
             <w:vAlign w:val="center"/>
           </w:tcPr>
           <w:p>
@@ -833,7 +805,6 @@
               <w:bottom w:val="single" w:sz="4" w:space="0" w:color="auto"/>
               <w:right w:val="single" w:sz="4" w:space="0" w:color="auto"/>
             </w:tcBorders>
-            <w:shd w:val="clear" w:color="auto" w:fill="auto"/>
             <w:vAlign w:val="center"/>
           </w:tcPr>
           <w:p/>
@@ -847,7 +818,6 @@
               <w:bottom w:val="single" w:sz="4" w:space="0" w:color="auto"/>
               <w:right w:val="nil"/>
             </w:tcBorders>
-            <w:shd w:val="clear" w:color="auto" w:fill="auto"/>
             <w:vAlign w:val="center"/>
           </w:tcPr>
           <w:p/>
@@ -866,7 +836,6 @@
               <w:bottom w:val="single" w:sz="4" w:space="0" w:color="auto"/>
               <w:right w:val="single" w:sz="4" w:space="0" w:color="auto"/>
             </w:tcBorders>
-            <w:shd w:val="clear" w:color="auto" w:fill="auto"/>
             <w:vAlign w:val="center"/>
           </w:tcPr>
           <w:p>
@@ -890,7 +859,6 @@
               <w:bottom w:val="single" w:sz="4" w:space="0" w:color="auto"/>
               <w:right w:val="single" w:sz="4" w:space="0" w:color="auto"/>
             </w:tcBorders>
-            <w:shd w:val="clear" w:color="auto" w:fill="auto"/>
             <w:vAlign w:val="center"/>
           </w:tcPr>
           <w:p/>
@@ -904,7 +872,6 @@
               <w:bottom w:val="single" w:sz="4" w:space="0" w:color="auto"/>
               <w:right w:val="nil"/>
             </w:tcBorders>
-            <w:shd w:val="clear" w:color="auto" w:fill="auto"/>
             <w:vAlign w:val="center"/>
           </w:tcPr>
           <w:p/>
@@ -1073,7 +1040,6 @@
               <w:bottom w:val="single" w:sz="4" w:space="0" w:color="auto"/>
               <w:right w:val="single" w:sz="4" w:space="0" w:color="auto"/>
             </w:tcBorders>
-            <w:shd w:val="clear" w:color="auto" w:fill="auto"/>
             <w:vAlign w:val="center"/>
           </w:tcPr>
           <w:p>
@@ -1118,7 +1084,6 @@
               <w:bottom w:val="single" w:sz="4" w:space="0" w:color="auto"/>
               <w:right w:val="single" w:sz="4" w:space="0" w:color="auto"/>
             </w:tcBorders>
-            <w:shd w:val="clear" w:color="auto" w:fill="auto"/>
             <w:vAlign w:val="center"/>
           </w:tcPr>
           <w:p>
@@ -1140,7 +1105,6 @@
               <w:bottom w:val="single" w:sz="4" w:space="0" w:color="auto"/>
               <w:right w:val="single" w:sz="4" w:space="0" w:color="auto"/>
             </w:tcBorders>
-            <w:shd w:val="clear" w:color="auto" w:fill="auto"/>
             <w:vAlign w:val="center"/>
           </w:tcPr>
           <w:p>
@@ -1162,7 +1126,6 @@
               <w:bottom w:val="single" w:sz="4" w:space="0" w:color="auto"/>
               <w:right w:val="single" w:sz="4" w:space="0" w:color="auto"/>
             </w:tcBorders>
-            <w:shd w:val="clear" w:color="auto" w:fill="auto"/>
             <w:vAlign w:val="center"/>
           </w:tcPr>
           <w:p>
@@ -1184,7 +1147,6 @@
               <w:bottom w:val="single" w:sz="4" w:space="0" w:color="auto"/>
               <w:right w:val="single" w:sz="4" w:space="0" w:color="auto"/>
             </w:tcBorders>
-            <w:shd w:val="clear" w:color="auto" w:fill="auto"/>
             <w:vAlign w:val="center"/>
           </w:tcPr>
           <w:p>
@@ -1206,7 +1168,6 @@
               <w:bottom w:val="single" w:sz="4" w:space="0" w:color="auto"/>
               <w:right w:val="nil"/>
             </w:tcBorders>
-            <w:shd w:val="clear" w:color="auto" w:fill="auto"/>
             <w:vAlign w:val="center"/>
           </w:tcPr>
           <w:p>
@@ -1232,7 +1193,6 @@
               <w:left w:val="nil"/>
               <w:right w:val="single" w:sz="4" w:space="0" w:color="auto"/>
             </w:tcBorders>
-            <w:shd w:val="clear" w:color="auto" w:fill="auto"/>
           </w:tcPr>
           <w:p>
             <w:r>
@@ -1248,11 +1208,8 @@
               <w:left w:val="single" w:sz="4" w:space="0" w:color="auto"/>
               <w:right w:val="single" w:sz="4" w:space="0" w:color="auto"/>
             </w:tcBorders>
-            <w:shd w:val="clear" w:color="auto" w:fill="auto"/>
-          </w:tcPr>
-          <w:p>
-            <w:r/>
-          </w:p>
+          </w:tcPr>
+          <w:p/>
         </w:tc>
         <w:tc>
           <w:tcPr>
@@ -1262,7 +1219,6 @@
               <w:left w:val="single" w:sz="4" w:space="0" w:color="auto"/>
               <w:right w:val="single" w:sz="4" w:space="0" w:color="auto"/>
             </w:tcBorders>
-            <w:shd w:val="clear" w:color="auto" w:fill="auto"/>
           </w:tcPr>
           <w:p>
             <w:r>
@@ -1278,7 +1234,6 @@
               <w:left w:val="single" w:sz="4" w:space="0" w:color="auto"/>
               <w:right w:val="single" w:sz="4" w:space="0" w:color="auto"/>
             </w:tcBorders>
-            <w:shd w:val="clear" w:color="auto" w:fill="auto"/>
           </w:tcPr>
           <w:p>
             <w:r>
@@ -1294,11 +1249,8 @@
               <w:left w:val="single" w:sz="4" w:space="0" w:color="auto"/>
               <w:right w:val="single" w:sz="4" w:space="0" w:color="auto"/>
             </w:tcBorders>
-            <w:shd w:val="clear" w:color="auto" w:fill="auto"/>
-          </w:tcPr>
-          <w:p>
-            <w:r/>
-          </w:p>
+          </w:tcPr>
+          <w:p/>
         </w:tc>
         <w:tc>
           <w:tcPr>
@@ -1308,11 +1260,8 @@
               <w:left w:val="single" w:sz="4" w:space="0" w:color="auto"/>
               <w:right w:val="nil"/>
             </w:tcBorders>
-            <w:shd w:val="clear" w:color="auto" w:fill="auto"/>
-          </w:tcPr>
-          <w:p>
-            <w:r/>
-          </w:p>
+          </w:tcPr>
+          <w:p/>
         </w:tc>
       </w:tr>
       <w:tr>
@@ -1327,7 +1276,6 @@
               <w:left w:val="nil"/>
               <w:right w:val="single" w:sz="4" w:space="0" w:color="auto"/>
             </w:tcBorders>
-            <w:shd w:val="clear" w:color="auto" w:fill="auto"/>
           </w:tcPr>
           <w:p>
             <w:r>
@@ -1343,11 +1291,8 @@
               <w:left w:val="single" w:sz="4" w:space="0" w:color="auto"/>
               <w:right w:val="single" w:sz="4" w:space="0" w:color="auto"/>
             </w:tcBorders>
-            <w:shd w:val="clear" w:color="auto" w:fill="auto"/>
-          </w:tcPr>
-          <w:p>
-            <w:r/>
-          </w:p>
+          </w:tcPr>
+          <w:p/>
         </w:tc>
         <w:tc>
           <w:tcPr>
@@ -1357,7 +1302,6 @@
               <w:left w:val="single" w:sz="4" w:space="0" w:color="auto"/>
               <w:right w:val="single" w:sz="4" w:space="0" w:color="auto"/>
             </w:tcBorders>
-            <w:shd w:val="clear" w:color="auto" w:fill="auto"/>
           </w:tcPr>
           <w:p>
             <w:r>
@@ -1373,7 +1317,6 @@
               <w:left w:val="single" w:sz="4" w:space="0" w:color="auto"/>
               <w:right w:val="single" w:sz="4" w:space="0" w:color="auto"/>
             </w:tcBorders>
-            <w:shd w:val="clear" w:color="auto" w:fill="auto"/>
           </w:tcPr>
           <w:p>
             <w:r>
@@ -1389,11 +1332,8 @@
               <w:left w:val="single" w:sz="4" w:space="0" w:color="auto"/>
               <w:right w:val="single" w:sz="4" w:space="0" w:color="auto"/>
             </w:tcBorders>
-            <w:shd w:val="clear" w:color="auto" w:fill="auto"/>
-          </w:tcPr>
-          <w:p>
-            <w:r/>
-          </w:p>
+          </w:tcPr>
+          <w:p/>
         </w:tc>
         <w:tc>
           <w:tcPr>
@@ -1403,11 +1343,8 @@
               <w:left w:val="single" w:sz="4" w:space="0" w:color="auto"/>
               <w:right w:val="nil"/>
             </w:tcBorders>
-            <w:shd w:val="clear" w:color="auto" w:fill="auto"/>
-          </w:tcPr>
-          <w:p>
-            <w:r/>
-          </w:p>
+          </w:tcPr>
+          <w:p/>
         </w:tc>
       </w:tr>
       <w:tr>
@@ -1422,7 +1359,6 @@
               <w:left w:val="nil"/>
               <w:right w:val="single" w:sz="4" w:space="0" w:color="auto"/>
             </w:tcBorders>
-            <w:shd w:val="clear" w:color="auto" w:fill="auto"/>
           </w:tcPr>
           <w:p>
             <w:r>
@@ -1438,11 +1374,8 @@
               <w:left w:val="single" w:sz="4" w:space="0" w:color="auto"/>
               <w:right w:val="single" w:sz="4" w:space="0" w:color="auto"/>
             </w:tcBorders>
-            <w:shd w:val="clear" w:color="auto" w:fill="auto"/>
-          </w:tcPr>
-          <w:p>
-            <w:r/>
-          </w:p>
+          </w:tcPr>
+          <w:p/>
         </w:tc>
         <w:tc>
           <w:tcPr>
@@ -1452,7 +1385,6 @@
               <w:left w:val="single" w:sz="4" w:space="0" w:color="auto"/>
               <w:right w:val="single" w:sz="4" w:space="0" w:color="auto"/>
             </w:tcBorders>
-            <w:shd w:val="clear" w:color="auto" w:fill="auto"/>
           </w:tcPr>
           <w:p>
             <w:r>
@@ -1468,7 +1400,6 @@
               <w:left w:val="single" w:sz="4" w:space="0" w:color="auto"/>
               <w:right w:val="single" w:sz="4" w:space="0" w:color="auto"/>
             </w:tcBorders>
-            <w:shd w:val="clear" w:color="auto" w:fill="auto"/>
           </w:tcPr>
           <w:p>
             <w:r>
@@ -1484,11 +1415,8 @@
               <w:left w:val="single" w:sz="4" w:space="0" w:color="auto"/>
               <w:right w:val="single" w:sz="4" w:space="0" w:color="auto"/>
             </w:tcBorders>
-            <w:shd w:val="clear" w:color="auto" w:fill="auto"/>
-          </w:tcPr>
-          <w:p>
-            <w:r/>
-          </w:p>
+          </w:tcPr>
+          <w:p/>
         </w:tc>
         <w:tc>
           <w:tcPr>
@@ -1498,11 +1426,8 @@
               <w:left w:val="single" w:sz="4" w:space="0" w:color="auto"/>
               <w:right w:val="nil"/>
             </w:tcBorders>
-            <w:shd w:val="clear" w:color="auto" w:fill="auto"/>
-          </w:tcPr>
-          <w:p>
-            <w:r/>
-          </w:p>
+          </w:tcPr>
+          <w:p/>
         </w:tc>
       </w:tr>
       <w:tr>
@@ -1517,7 +1442,6 @@
               <w:left w:val="nil"/>
               <w:right w:val="single" w:sz="4" w:space="0" w:color="auto"/>
             </w:tcBorders>
-            <w:shd w:val="clear" w:color="auto" w:fill="auto"/>
           </w:tcPr>
           <w:p>
             <w:r>
@@ -1533,7 +1457,6 @@
               <w:left w:val="single" w:sz="4" w:space="0" w:color="auto"/>
               <w:right w:val="single" w:sz="4" w:space="0" w:color="auto"/>
             </w:tcBorders>
-            <w:shd w:val="clear" w:color="auto" w:fill="auto"/>
           </w:tcPr>
           <w:p>
             <w:r>
@@ -1549,7 +1472,6 @@
               <w:left w:val="single" w:sz="4" w:space="0" w:color="auto"/>
               <w:right w:val="single" w:sz="4" w:space="0" w:color="auto"/>
             </w:tcBorders>
-            <w:shd w:val="clear" w:color="auto" w:fill="auto"/>
           </w:tcPr>
           <w:p>
             <w:r>
@@ -1565,7 +1487,6 @@
               <w:left w:val="single" w:sz="4" w:space="0" w:color="auto"/>
               <w:right w:val="single" w:sz="4" w:space="0" w:color="auto"/>
             </w:tcBorders>
-            <w:shd w:val="clear" w:color="auto" w:fill="auto"/>
           </w:tcPr>
           <w:p>
             <w:r>
@@ -1581,11 +1502,8 @@
               <w:left w:val="single" w:sz="4" w:space="0" w:color="auto"/>
               <w:right w:val="single" w:sz="4" w:space="0" w:color="auto"/>
             </w:tcBorders>
-            <w:shd w:val="clear" w:color="auto" w:fill="auto"/>
-          </w:tcPr>
-          <w:p>
-            <w:r/>
-          </w:p>
+          </w:tcPr>
+          <w:p/>
         </w:tc>
         <w:tc>
           <w:tcPr>
@@ -1595,11 +1513,8 @@
               <w:left w:val="single" w:sz="4" w:space="0" w:color="auto"/>
               <w:right w:val="nil"/>
             </w:tcBorders>
-            <w:shd w:val="clear" w:color="auto" w:fill="auto"/>
-          </w:tcPr>
-          <w:p>
-            <w:r/>
-          </w:p>
+          </w:tcPr>
+          <w:p/>
         </w:tc>
       </w:tr>
       <w:tr>
@@ -1614,7 +1529,6 @@
               <w:left w:val="nil"/>
               <w:right w:val="single" w:sz="4" w:space="0" w:color="auto"/>
             </w:tcBorders>
-            <w:shd w:val="clear" w:color="auto" w:fill="auto"/>
           </w:tcPr>
           <w:p>
             <w:r>
@@ -1630,7 +1544,6 @@
               <w:left w:val="single" w:sz="4" w:space="0" w:color="auto"/>
               <w:right w:val="single" w:sz="4" w:space="0" w:color="auto"/>
             </w:tcBorders>
-            <w:shd w:val="clear" w:color="auto" w:fill="auto"/>
           </w:tcPr>
           <w:p>
             <w:r>
@@ -1646,7 +1559,6 @@
               <w:left w:val="single" w:sz="4" w:space="0" w:color="auto"/>
               <w:right w:val="single" w:sz="4" w:space="0" w:color="auto"/>
             </w:tcBorders>
-            <w:shd w:val="clear" w:color="auto" w:fill="auto"/>
           </w:tcPr>
           <w:p>
             <w:r>
@@ -1662,7 +1574,6 @@
               <w:left w:val="single" w:sz="4" w:space="0" w:color="auto"/>
               <w:right w:val="single" w:sz="4" w:space="0" w:color="auto"/>
             </w:tcBorders>
-            <w:shd w:val="clear" w:color="auto" w:fill="auto"/>
           </w:tcPr>
           <w:p>
             <w:r>
@@ -1678,11 +1589,8 @@
               <w:left w:val="single" w:sz="4" w:space="0" w:color="auto"/>
               <w:right w:val="single" w:sz="4" w:space="0" w:color="auto"/>
             </w:tcBorders>
-            <w:shd w:val="clear" w:color="auto" w:fill="auto"/>
-          </w:tcPr>
-          <w:p>
-            <w:r/>
-          </w:p>
+          </w:tcPr>
+          <w:p/>
         </w:tc>
         <w:tc>
           <w:tcPr>
@@ -1692,11 +1600,8 @@
               <w:left w:val="single" w:sz="4" w:space="0" w:color="auto"/>
               <w:right w:val="nil"/>
             </w:tcBorders>
-            <w:shd w:val="clear" w:color="auto" w:fill="auto"/>
-          </w:tcPr>
-          <w:p>
-            <w:r/>
-          </w:p>
+          </w:tcPr>
+          <w:p/>
         </w:tc>
       </w:tr>
     </w:tbl>
@@ -1858,7 +1763,6 @@
               <w:bottom w:val="single" w:sz="4" w:space="0" w:color="auto"/>
               <w:right w:val="single" w:sz="4" w:space="0" w:color="auto"/>
             </w:tcBorders>
-            <w:shd w:val="clear" w:color="auto" w:fill="auto"/>
             <w:vAlign w:val="center"/>
           </w:tcPr>
           <w:p>
@@ -1882,7 +1786,6 @@
               <w:bottom w:val="single" w:sz="4" w:space="0" w:color="auto"/>
               <w:right w:val="single" w:sz="4" w:space="0" w:color="auto"/>
             </w:tcBorders>
-            <w:shd w:val="clear" w:color="auto" w:fill="auto"/>
             <w:vAlign w:val="center"/>
           </w:tcPr>
           <w:p>
@@ -1921,7 +1824,6 @@
               <w:bottom w:val="single" w:sz="4" w:space="0" w:color="auto"/>
               <w:right w:val="single" w:sz="4" w:space="0" w:color="auto"/>
             </w:tcBorders>
-            <w:shd w:val="clear" w:color="auto" w:fill="auto"/>
             <w:vAlign w:val="center"/>
           </w:tcPr>
           <w:p>
@@ -1943,7 +1845,6 @@
               <w:bottom w:val="single" w:sz="4" w:space="0" w:color="auto"/>
               <w:right w:val="single" w:sz="4" w:space="0" w:color="auto"/>
             </w:tcBorders>
-            <w:shd w:val="clear" w:color="auto" w:fill="auto"/>
             <w:vAlign w:val="center"/>
           </w:tcPr>
           <w:p>
@@ -1965,7 +1866,6 @@
               <w:bottom w:val="single" w:sz="4" w:space="0" w:color="auto"/>
               <w:right w:val="single" w:sz="4" w:space="0" w:color="auto"/>
             </w:tcBorders>
-            <w:shd w:val="clear" w:color="auto" w:fill="auto"/>
             <w:vAlign w:val="center"/>
           </w:tcPr>
           <w:p>
@@ -1987,7 +1887,6 @@
               <w:bottom w:val="single" w:sz="4" w:space="0" w:color="auto"/>
               <w:right w:val="single" w:sz="4" w:space="0" w:color="auto"/>
             </w:tcBorders>
-            <w:shd w:val="clear" w:color="auto" w:fill="auto"/>
             <w:vAlign w:val="center"/>
           </w:tcPr>
           <w:p>
@@ -2009,7 +1908,6 @@
               <w:bottom w:val="single" w:sz="4" w:space="0" w:color="auto"/>
               <w:right w:val="nil"/>
             </w:tcBorders>
-            <w:shd w:val="clear" w:color="auto" w:fill="auto"/>
             <w:vAlign w:val="center"/>
           </w:tcPr>
           <w:p>
@@ -2035,7 +1933,6 @@
               <w:left w:val="nil"/>
               <w:right w:val="single" w:sz="4" w:space="0" w:color="auto"/>
             </w:tcBorders>
-            <w:shd w:val="clear" w:color="auto" w:fill="auto"/>
           </w:tcPr>
           <w:p>
             <w:r>
@@ -2051,7 +1948,6 @@
               <w:left w:val="single" w:sz="4" w:space="0" w:color="auto"/>
               <w:right w:val="single" w:sz="4" w:space="0" w:color="auto"/>
             </w:tcBorders>
-            <w:shd w:val="clear" w:color="auto" w:fill="auto"/>
           </w:tcPr>
           <w:p>
             <w:r>
@@ -2067,11 +1963,8 @@
               <w:left w:val="single" w:sz="4" w:space="0" w:color="auto"/>
               <w:right w:val="single" w:sz="4" w:space="0" w:color="auto"/>
             </w:tcBorders>
-            <w:shd w:val="clear" w:color="auto" w:fill="auto"/>
-          </w:tcPr>
-          <w:p>
-            <w:r/>
-          </w:p>
+          </w:tcPr>
+          <w:p/>
         </w:tc>
         <w:tc>
           <w:tcPr>
@@ -2081,7 +1974,6 @@
               <w:left w:val="single" w:sz="4" w:space="0" w:color="auto"/>
               <w:right w:val="single" w:sz="4" w:space="0" w:color="auto"/>
             </w:tcBorders>
-            <w:shd w:val="clear" w:color="auto" w:fill="auto"/>
           </w:tcPr>
           <w:p>
             <w:r>
@@ -2097,11 +1989,8 @@
               <w:left w:val="single" w:sz="4" w:space="0" w:color="auto"/>
               <w:right w:val="single" w:sz="4" w:space="0" w:color="auto"/>
             </w:tcBorders>
-            <w:shd w:val="clear" w:color="auto" w:fill="auto"/>
-          </w:tcPr>
-          <w:p>
-            <w:r/>
-          </w:p>
+          </w:tcPr>
+          <w:p/>
         </w:tc>
         <w:tc>
           <w:tcPr>
@@ -2111,11 +2000,8 @@
               <w:left w:val="single" w:sz="4" w:space="0" w:color="auto"/>
               <w:right w:val="single" w:sz="4" w:space="0" w:color="auto"/>
             </w:tcBorders>
-            <w:shd w:val="clear" w:color="auto" w:fill="auto"/>
-          </w:tcPr>
-          <w:p>
-            <w:r/>
-          </w:p>
+          </w:tcPr>
+          <w:p/>
         </w:tc>
         <w:tc>
           <w:tcPr>
@@ -2125,11 +2011,8 @@
               <w:left w:val="single" w:sz="4" w:space="0" w:color="auto"/>
               <w:right w:val="nil"/>
             </w:tcBorders>
-            <w:shd w:val="clear" w:color="auto" w:fill="auto"/>
-          </w:tcPr>
-          <w:p>
-            <w:r/>
-          </w:p>
+          </w:tcPr>
+          <w:p/>
         </w:tc>
       </w:tr>
       <w:tr>
@@ -2144,11 +2027,8 @@
               <w:left w:val="nil"/>
               <w:right w:val="single" w:sz="4" w:space="0" w:color="auto"/>
             </w:tcBorders>
-            <w:shd w:val="clear" w:color="auto" w:fill="auto"/>
-          </w:tcPr>
-          <w:p>
-            <w:r/>
-          </w:p>
+          </w:tcPr>
+          <w:p/>
         </w:tc>
         <w:tc>
           <w:tcPr>
@@ -2158,7 +2038,6 @@
               <w:left w:val="single" w:sz="4" w:space="0" w:color="auto"/>
               <w:right w:val="single" w:sz="4" w:space="0" w:color="auto"/>
             </w:tcBorders>
-            <w:shd w:val="clear" w:color="auto" w:fill="auto"/>
           </w:tcPr>
           <w:p>
             <w:r>
@@ -2174,11 +2053,8 @@
               <w:left w:val="single" w:sz="4" w:space="0" w:color="auto"/>
               <w:right w:val="single" w:sz="4" w:space="0" w:color="auto"/>
             </w:tcBorders>
-            <w:shd w:val="clear" w:color="auto" w:fill="auto"/>
-          </w:tcPr>
-          <w:p>
-            <w:r/>
-          </w:p>
+          </w:tcPr>
+          <w:p/>
         </w:tc>
         <w:tc>
           <w:tcPr>
@@ -2188,7 +2064,6 @@
               <w:left w:val="single" w:sz="4" w:space="0" w:color="auto"/>
               <w:right w:val="single" w:sz="4" w:space="0" w:color="auto"/>
             </w:tcBorders>
-            <w:shd w:val="clear" w:color="auto" w:fill="auto"/>
           </w:tcPr>
           <w:p>
             <w:r>
@@ -2204,11 +2079,8 @@
               <w:left w:val="single" w:sz="4" w:space="0" w:color="auto"/>
               <w:right w:val="single" w:sz="4" w:space="0" w:color="auto"/>
             </w:tcBorders>
-            <w:shd w:val="clear" w:color="auto" w:fill="auto"/>
-          </w:tcPr>
-          <w:p>
-            <w:r/>
-          </w:p>
+          </w:tcPr>
+          <w:p/>
         </w:tc>
         <w:tc>
           <w:tcPr>
@@ -2218,11 +2090,8 @@
               <w:left w:val="single" w:sz="4" w:space="0" w:color="auto"/>
               <w:right w:val="single" w:sz="4" w:space="0" w:color="auto"/>
             </w:tcBorders>
-            <w:shd w:val="clear" w:color="auto" w:fill="auto"/>
-          </w:tcPr>
-          <w:p>
-            <w:r/>
-          </w:p>
+          </w:tcPr>
+          <w:p/>
         </w:tc>
         <w:tc>
           <w:tcPr>
@@ -2232,11 +2101,8 @@
               <w:left w:val="single" w:sz="4" w:space="0" w:color="auto"/>
               <w:right w:val="nil"/>
             </w:tcBorders>
-            <w:shd w:val="clear" w:color="auto" w:fill="auto"/>
-          </w:tcPr>
-          <w:p>
-            <w:r/>
-          </w:p>
+          </w:tcPr>
+          <w:p/>
         </w:tc>
       </w:tr>
       <w:tr>
@@ -2251,11 +2117,8 @@
               <w:left w:val="nil"/>
               <w:right w:val="single" w:sz="4" w:space="0" w:color="auto"/>
             </w:tcBorders>
-            <w:shd w:val="clear" w:color="auto" w:fill="auto"/>
-          </w:tcPr>
-          <w:p>
-            <w:r/>
-          </w:p>
+          </w:tcPr>
+          <w:p/>
         </w:tc>
         <w:tc>
           <w:tcPr>
@@ -2265,7 +2128,6 @@
               <w:left w:val="single" w:sz="4" w:space="0" w:color="auto"/>
               <w:right w:val="single" w:sz="4" w:space="0" w:color="auto"/>
             </w:tcBorders>
-            <w:shd w:val="clear" w:color="auto" w:fill="auto"/>
           </w:tcPr>
           <w:p>
             <w:r>
@@ -2281,11 +2143,8 @@
               <w:left w:val="single" w:sz="4" w:space="0" w:color="auto"/>
               <w:right w:val="single" w:sz="4" w:space="0" w:color="auto"/>
             </w:tcBorders>
-            <w:shd w:val="clear" w:color="auto" w:fill="auto"/>
-          </w:tcPr>
-          <w:p>
-            <w:r/>
-          </w:p>
+          </w:tcPr>
+          <w:p/>
         </w:tc>
         <w:tc>
           <w:tcPr>
@@ -2295,7 +2154,6 @@
               <w:left w:val="single" w:sz="4" w:space="0" w:color="auto"/>
               <w:right w:val="single" w:sz="4" w:space="0" w:color="auto"/>
             </w:tcBorders>
-            <w:shd w:val="clear" w:color="auto" w:fill="auto"/>
           </w:tcPr>
           <w:p>
             <w:r>
@@ -2311,11 +2169,8 @@
               <w:left w:val="single" w:sz="4" w:space="0" w:color="auto"/>
               <w:right w:val="single" w:sz="4" w:space="0" w:color="auto"/>
             </w:tcBorders>
-            <w:shd w:val="clear" w:color="auto" w:fill="auto"/>
-          </w:tcPr>
-          <w:p>
-            <w:r/>
-          </w:p>
+          </w:tcPr>
+          <w:p/>
         </w:tc>
         <w:tc>
           <w:tcPr>
@@ -2325,11 +2180,8 @@
               <w:left w:val="single" w:sz="4" w:space="0" w:color="auto"/>
               <w:right w:val="single" w:sz="4" w:space="0" w:color="auto"/>
             </w:tcBorders>
-            <w:shd w:val="clear" w:color="auto" w:fill="auto"/>
-          </w:tcPr>
-          <w:p>
-            <w:r/>
-          </w:p>
+          </w:tcPr>
+          <w:p/>
         </w:tc>
         <w:tc>
           <w:tcPr>
@@ -2339,11 +2191,8 @@
               <w:left w:val="single" w:sz="4" w:space="0" w:color="auto"/>
               <w:right w:val="nil"/>
             </w:tcBorders>
-            <w:shd w:val="clear" w:color="auto" w:fill="auto"/>
-          </w:tcPr>
-          <w:p>
-            <w:r/>
-          </w:p>
+          </w:tcPr>
+          <w:p/>
         </w:tc>
       </w:tr>
       <w:tr>
@@ -2358,11 +2207,8 @@
               <w:left w:val="nil"/>
               <w:right w:val="single" w:sz="4" w:space="0" w:color="auto"/>
             </w:tcBorders>
-            <w:shd w:val="clear" w:color="auto" w:fill="auto"/>
-          </w:tcPr>
-          <w:p>
-            <w:r/>
-          </w:p>
+          </w:tcPr>
+          <w:p/>
         </w:tc>
         <w:tc>
           <w:tcPr>
@@ -2372,7 +2218,6 @@
               <w:left w:val="single" w:sz="4" w:space="0" w:color="auto"/>
               <w:right w:val="single" w:sz="4" w:space="0" w:color="auto"/>
             </w:tcBorders>
-            <w:shd w:val="clear" w:color="auto" w:fill="auto"/>
           </w:tcPr>
           <w:p>
             <w:r>
@@ -2388,11 +2233,8 @@
               <w:left w:val="single" w:sz="4" w:space="0" w:color="auto"/>
               <w:right w:val="single" w:sz="4" w:space="0" w:color="auto"/>
             </w:tcBorders>
-            <w:shd w:val="clear" w:color="auto" w:fill="auto"/>
-          </w:tcPr>
-          <w:p>
-            <w:r/>
-          </w:p>
+          </w:tcPr>
+          <w:p/>
         </w:tc>
         <w:tc>
           <w:tcPr>
@@ -2402,7 +2244,6 @@
               <w:left w:val="single" w:sz="4" w:space="0" w:color="auto"/>
               <w:right w:val="single" w:sz="4" w:space="0" w:color="auto"/>
             </w:tcBorders>
-            <w:shd w:val="clear" w:color="auto" w:fill="auto"/>
           </w:tcPr>
           <w:p>
             <w:r>
@@ -2418,11 +2259,8 @@
               <w:left w:val="single" w:sz="4" w:space="0" w:color="auto"/>
               <w:right w:val="single" w:sz="4" w:space="0" w:color="auto"/>
             </w:tcBorders>
-            <w:shd w:val="clear" w:color="auto" w:fill="auto"/>
-          </w:tcPr>
-          <w:p>
-            <w:r/>
-          </w:p>
+          </w:tcPr>
+          <w:p/>
         </w:tc>
         <w:tc>
           <w:tcPr>
@@ -2432,11 +2270,8 @@
               <w:left w:val="single" w:sz="4" w:space="0" w:color="auto"/>
               <w:right w:val="single" w:sz="4" w:space="0" w:color="auto"/>
             </w:tcBorders>
-            <w:shd w:val="clear" w:color="auto" w:fill="auto"/>
-          </w:tcPr>
-          <w:p>
-            <w:r/>
-          </w:p>
+          </w:tcPr>
+          <w:p/>
         </w:tc>
         <w:tc>
           <w:tcPr>
@@ -2446,11 +2281,8 @@
               <w:left w:val="single" w:sz="4" w:space="0" w:color="auto"/>
               <w:right w:val="nil"/>
             </w:tcBorders>
-            <w:shd w:val="clear" w:color="auto" w:fill="auto"/>
-          </w:tcPr>
-          <w:p>
-            <w:r/>
-          </w:p>
+          </w:tcPr>
+          <w:p/>
         </w:tc>
       </w:tr>
       <w:tr>
@@ -2465,11 +2297,8 @@
               <w:left w:val="nil"/>
               <w:right w:val="single" w:sz="4" w:space="0" w:color="auto"/>
             </w:tcBorders>
-            <w:shd w:val="clear" w:color="auto" w:fill="auto"/>
-          </w:tcPr>
-          <w:p>
-            <w:r/>
-          </w:p>
+          </w:tcPr>
+          <w:p/>
         </w:tc>
         <w:tc>
           <w:tcPr>
@@ -2479,7 +2308,6 @@
               <w:left w:val="single" w:sz="4" w:space="0" w:color="auto"/>
               <w:right w:val="single" w:sz="4" w:space="0" w:color="auto"/>
             </w:tcBorders>
-            <w:shd w:val="clear" w:color="auto" w:fill="auto"/>
           </w:tcPr>
           <w:p>
             <w:r>
@@ -2495,11 +2323,8 @@
               <w:left w:val="single" w:sz="4" w:space="0" w:color="auto"/>
               <w:right w:val="single" w:sz="4" w:space="0" w:color="auto"/>
             </w:tcBorders>
-            <w:shd w:val="clear" w:color="auto" w:fill="auto"/>
-          </w:tcPr>
-          <w:p>
-            <w:r/>
-          </w:p>
+          </w:tcPr>
+          <w:p/>
         </w:tc>
         <w:tc>
           <w:tcPr>
@@ -2509,7 +2334,6 @@
               <w:left w:val="single" w:sz="4" w:space="0" w:color="auto"/>
               <w:right w:val="single" w:sz="4" w:space="0" w:color="auto"/>
             </w:tcBorders>
-            <w:shd w:val="clear" w:color="auto" w:fill="auto"/>
           </w:tcPr>
           <w:p>
             <w:r>
@@ -2525,11 +2349,8 @@
               <w:left w:val="single" w:sz="4" w:space="0" w:color="auto"/>
               <w:right w:val="single" w:sz="4" w:space="0" w:color="auto"/>
             </w:tcBorders>
-            <w:shd w:val="clear" w:color="auto" w:fill="auto"/>
-          </w:tcPr>
-          <w:p>
-            <w:r/>
-          </w:p>
+          </w:tcPr>
+          <w:p/>
         </w:tc>
         <w:tc>
           <w:tcPr>
@@ -2539,11 +2360,8 @@
               <w:left w:val="single" w:sz="4" w:space="0" w:color="auto"/>
               <w:right w:val="single" w:sz="4" w:space="0" w:color="auto"/>
             </w:tcBorders>
-            <w:shd w:val="clear" w:color="auto" w:fill="auto"/>
-          </w:tcPr>
-          <w:p>
-            <w:r/>
-          </w:p>
+          </w:tcPr>
+          <w:p/>
         </w:tc>
         <w:tc>
           <w:tcPr>
@@ -2553,11 +2371,8 @@
               <w:left w:val="single" w:sz="4" w:space="0" w:color="auto"/>
               <w:right w:val="nil"/>
             </w:tcBorders>
-            <w:shd w:val="clear" w:color="auto" w:fill="auto"/>
-          </w:tcPr>
-          <w:p>
-            <w:r/>
-          </w:p>
+          </w:tcPr>
+          <w:p/>
         </w:tc>
       </w:tr>
       <w:tr>
@@ -2572,11 +2387,8 @@
               <w:left w:val="nil"/>
               <w:right w:val="single" w:sz="4" w:space="0" w:color="auto"/>
             </w:tcBorders>
-            <w:shd w:val="clear" w:color="auto" w:fill="auto"/>
-          </w:tcPr>
-          <w:p>
-            <w:r/>
-          </w:p>
+          </w:tcPr>
+          <w:p/>
         </w:tc>
         <w:tc>
           <w:tcPr>
@@ -2586,7 +2398,6 @@
               <w:left w:val="single" w:sz="4" w:space="0" w:color="auto"/>
               <w:right w:val="single" w:sz="4" w:space="0" w:color="auto"/>
             </w:tcBorders>
-            <w:shd w:val="clear" w:color="auto" w:fill="auto"/>
           </w:tcPr>
           <w:p>
             <w:r>
@@ -2602,11 +2413,8 @@
               <w:left w:val="single" w:sz="4" w:space="0" w:color="auto"/>
               <w:right w:val="single" w:sz="4" w:space="0" w:color="auto"/>
             </w:tcBorders>
-            <w:shd w:val="clear" w:color="auto" w:fill="auto"/>
-          </w:tcPr>
-          <w:p>
-            <w:r/>
-          </w:p>
+          </w:tcPr>
+          <w:p/>
         </w:tc>
         <w:tc>
           <w:tcPr>
@@ -2616,7 +2424,6 @@
               <w:left w:val="single" w:sz="4" w:space="0" w:color="auto"/>
               <w:right w:val="single" w:sz="4" w:space="0" w:color="auto"/>
             </w:tcBorders>
-            <w:shd w:val="clear" w:color="auto" w:fill="auto"/>
           </w:tcPr>
           <w:p>
             <w:r>
@@ -2632,11 +2439,8 @@
               <w:left w:val="single" w:sz="4" w:space="0" w:color="auto"/>
               <w:right w:val="single" w:sz="4" w:space="0" w:color="auto"/>
             </w:tcBorders>
-            <w:shd w:val="clear" w:color="auto" w:fill="auto"/>
-          </w:tcPr>
-          <w:p>
-            <w:r/>
-          </w:p>
+          </w:tcPr>
+          <w:p/>
         </w:tc>
         <w:tc>
           <w:tcPr>
@@ -2646,11 +2450,8 @@
               <w:left w:val="single" w:sz="4" w:space="0" w:color="auto"/>
               <w:right w:val="single" w:sz="4" w:space="0" w:color="auto"/>
             </w:tcBorders>
-            <w:shd w:val="clear" w:color="auto" w:fill="auto"/>
-          </w:tcPr>
-          <w:p>
-            <w:r/>
-          </w:p>
+          </w:tcPr>
+          <w:p/>
         </w:tc>
         <w:tc>
           <w:tcPr>
@@ -2660,11 +2461,8 @@
               <w:left w:val="single" w:sz="4" w:space="0" w:color="auto"/>
               <w:right w:val="nil"/>
             </w:tcBorders>
-            <w:shd w:val="clear" w:color="auto" w:fill="auto"/>
-          </w:tcPr>
-          <w:p>
-            <w:r/>
-          </w:p>
+          </w:tcPr>
+          <w:p/>
         </w:tc>
       </w:tr>
       <w:tr>
@@ -2679,11 +2477,8 @@
               <w:left w:val="nil"/>
               <w:right w:val="single" w:sz="4" w:space="0" w:color="auto"/>
             </w:tcBorders>
-            <w:shd w:val="clear" w:color="auto" w:fill="auto"/>
-          </w:tcPr>
-          <w:p>
-            <w:r/>
-          </w:p>
+          </w:tcPr>
+          <w:p/>
         </w:tc>
         <w:tc>
           <w:tcPr>
@@ -2693,7 +2488,6 @@
               <w:left w:val="single" w:sz="4" w:space="0" w:color="auto"/>
               <w:right w:val="single" w:sz="4" w:space="0" w:color="auto"/>
             </w:tcBorders>
-            <w:shd w:val="clear" w:color="auto" w:fill="auto"/>
           </w:tcPr>
           <w:p>
             <w:r>
@@ -2709,11 +2503,8 @@
               <w:left w:val="single" w:sz="4" w:space="0" w:color="auto"/>
               <w:right w:val="single" w:sz="4" w:space="0" w:color="auto"/>
             </w:tcBorders>
-            <w:shd w:val="clear" w:color="auto" w:fill="auto"/>
-          </w:tcPr>
-          <w:p>
-            <w:r/>
-          </w:p>
+          </w:tcPr>
+          <w:p/>
         </w:tc>
         <w:tc>
           <w:tcPr>
@@ -2723,7 +2514,6 @@
               <w:left w:val="single" w:sz="4" w:space="0" w:color="auto"/>
               <w:right w:val="single" w:sz="4" w:space="0" w:color="auto"/>
             </w:tcBorders>
-            <w:shd w:val="clear" w:color="auto" w:fill="auto"/>
           </w:tcPr>
           <w:p>
             <w:r>
@@ -2739,11 +2529,8 @@
               <w:left w:val="single" w:sz="4" w:space="0" w:color="auto"/>
               <w:right w:val="single" w:sz="4" w:space="0" w:color="auto"/>
             </w:tcBorders>
-            <w:shd w:val="clear" w:color="auto" w:fill="auto"/>
-          </w:tcPr>
-          <w:p>
-            <w:r/>
-          </w:p>
+          </w:tcPr>
+          <w:p/>
         </w:tc>
         <w:tc>
           <w:tcPr>
@@ -2753,11 +2540,8 @@
               <w:left w:val="single" w:sz="4" w:space="0" w:color="auto"/>
               <w:right w:val="single" w:sz="4" w:space="0" w:color="auto"/>
             </w:tcBorders>
-            <w:shd w:val="clear" w:color="auto" w:fill="auto"/>
-          </w:tcPr>
-          <w:p>
-            <w:r/>
-          </w:p>
+          </w:tcPr>
+          <w:p/>
         </w:tc>
         <w:tc>
           <w:tcPr>
@@ -2767,11 +2551,8 @@
               <w:left w:val="single" w:sz="4" w:space="0" w:color="auto"/>
               <w:right w:val="nil"/>
             </w:tcBorders>
-            <w:shd w:val="clear" w:color="auto" w:fill="auto"/>
-          </w:tcPr>
-          <w:p>
-            <w:r/>
-          </w:p>
+          </w:tcPr>
+          <w:p/>
         </w:tc>
       </w:tr>
       <w:tr>
@@ -2786,11 +2567,8 @@
               <w:left w:val="nil"/>
               <w:right w:val="single" w:sz="4" w:space="0" w:color="auto"/>
             </w:tcBorders>
-            <w:shd w:val="clear" w:color="auto" w:fill="auto"/>
-          </w:tcPr>
-          <w:p>
-            <w:r/>
-          </w:p>
+          </w:tcPr>
+          <w:p/>
         </w:tc>
         <w:tc>
           <w:tcPr>
@@ -2800,7 +2578,6 @@
               <w:left w:val="single" w:sz="4" w:space="0" w:color="auto"/>
               <w:right w:val="single" w:sz="4" w:space="0" w:color="auto"/>
             </w:tcBorders>
-            <w:shd w:val="clear" w:color="auto" w:fill="auto"/>
           </w:tcPr>
           <w:p>
             <w:r>
@@ -2816,7 +2593,6 @@
               <w:left w:val="single" w:sz="4" w:space="0" w:color="auto"/>
               <w:right w:val="single" w:sz="4" w:space="0" w:color="auto"/>
             </w:tcBorders>
-            <w:shd w:val="clear" w:color="auto" w:fill="auto"/>
           </w:tcPr>
           <w:p>
             <w:r>
@@ -2832,11 +2608,8 @@
               <w:left w:val="single" w:sz="4" w:space="0" w:color="auto"/>
               <w:right w:val="single" w:sz="4" w:space="0" w:color="auto"/>
             </w:tcBorders>
-            <w:shd w:val="clear" w:color="auto" w:fill="auto"/>
-          </w:tcPr>
-          <w:p>
-            <w:r/>
-          </w:p>
+          </w:tcPr>
+          <w:p/>
         </w:tc>
         <w:tc>
           <w:tcPr>
@@ -2846,11 +2619,8 @@
               <w:left w:val="single" w:sz="4" w:space="0" w:color="auto"/>
               <w:right w:val="single" w:sz="4" w:space="0" w:color="auto"/>
             </w:tcBorders>
-            <w:shd w:val="clear" w:color="auto" w:fill="auto"/>
-          </w:tcPr>
-          <w:p>
-            <w:r/>
-          </w:p>
+          </w:tcPr>
+          <w:p/>
         </w:tc>
         <w:tc>
           <w:tcPr>
@@ -2860,11 +2630,8 @@
               <w:left w:val="single" w:sz="4" w:space="0" w:color="auto"/>
               <w:right w:val="single" w:sz="4" w:space="0" w:color="auto"/>
             </w:tcBorders>
-            <w:shd w:val="clear" w:color="auto" w:fill="auto"/>
-          </w:tcPr>
-          <w:p>
-            <w:r/>
-          </w:p>
+          </w:tcPr>
+          <w:p/>
         </w:tc>
         <w:tc>
           <w:tcPr>
@@ -2874,11 +2641,8 @@
               <w:left w:val="single" w:sz="4" w:space="0" w:color="auto"/>
               <w:right w:val="nil"/>
             </w:tcBorders>
-            <w:shd w:val="clear" w:color="auto" w:fill="auto"/>
-          </w:tcPr>
-          <w:p>
-            <w:r/>
-          </w:p>
+          </w:tcPr>
+          <w:p/>
         </w:tc>
       </w:tr>
       <w:tr>
@@ -2893,10 +2657,10 @@
               <w:left w:val="nil"/>
               <w:right w:val="single" w:sz="4" w:space="0" w:color="auto"/>
             </w:tcBorders>
-            <w:shd w:val="clear" w:color="auto" w:fill="auto"/>
-          </w:tcPr>
-          <w:p>
-            <w:r>
+          </w:tcPr>
+          <w:p>
+            <w:r>
+              <w:lastRenderedPageBreak/>
               <w:t>2. Deploy virtual network</w:t>
             </w:r>
           </w:p>
@@ -2909,7 +2673,6 @@
               <w:left w:val="single" w:sz="4" w:space="0" w:color="auto"/>
               <w:right w:val="single" w:sz="4" w:space="0" w:color="auto"/>
             </w:tcBorders>
-            <w:shd w:val="clear" w:color="auto" w:fill="auto"/>
           </w:tcPr>
           <w:p>
             <w:r>
@@ -2925,11 +2688,8 @@
               <w:left w:val="single" w:sz="4" w:space="0" w:color="auto"/>
               <w:right w:val="single" w:sz="4" w:space="0" w:color="auto"/>
             </w:tcBorders>
-            <w:shd w:val="clear" w:color="auto" w:fill="auto"/>
-          </w:tcPr>
-          <w:p>
-            <w:r/>
-          </w:p>
+          </w:tcPr>
+          <w:p/>
         </w:tc>
         <w:tc>
           <w:tcPr>
@@ -2939,7 +2699,6 @@
               <w:left w:val="single" w:sz="4" w:space="0" w:color="auto"/>
               <w:right w:val="single" w:sz="4" w:space="0" w:color="auto"/>
             </w:tcBorders>
-            <w:shd w:val="clear" w:color="auto" w:fill="auto"/>
           </w:tcPr>
           <w:p>
             <w:r>
@@ -2955,11 +2714,8 @@
               <w:left w:val="single" w:sz="4" w:space="0" w:color="auto"/>
               <w:right w:val="single" w:sz="4" w:space="0" w:color="auto"/>
             </w:tcBorders>
-            <w:shd w:val="clear" w:color="auto" w:fill="auto"/>
-          </w:tcPr>
-          <w:p>
-            <w:r/>
-          </w:p>
+          </w:tcPr>
+          <w:p/>
         </w:tc>
         <w:tc>
           <w:tcPr>
@@ -2969,11 +2725,8 @@
               <w:left w:val="single" w:sz="4" w:space="0" w:color="auto"/>
               <w:right w:val="single" w:sz="4" w:space="0" w:color="auto"/>
             </w:tcBorders>
-            <w:shd w:val="clear" w:color="auto" w:fill="auto"/>
-          </w:tcPr>
-          <w:p>
-            <w:r/>
-          </w:p>
+          </w:tcPr>
+          <w:p/>
         </w:tc>
         <w:tc>
           <w:tcPr>
@@ -2983,11 +2736,8 @@
               <w:left w:val="single" w:sz="4" w:space="0" w:color="auto"/>
               <w:right w:val="nil"/>
             </w:tcBorders>
-            <w:shd w:val="clear" w:color="auto" w:fill="auto"/>
-          </w:tcPr>
-          <w:p>
-            <w:r/>
-          </w:p>
+          </w:tcPr>
+          <w:p/>
         </w:tc>
       </w:tr>
       <w:tr>
@@ -3002,11 +2752,8 @@
               <w:left w:val="nil"/>
               <w:right w:val="single" w:sz="4" w:space="0" w:color="auto"/>
             </w:tcBorders>
-            <w:shd w:val="clear" w:color="auto" w:fill="auto"/>
-          </w:tcPr>
-          <w:p>
-            <w:r/>
-          </w:p>
+          </w:tcPr>
+          <w:p/>
         </w:tc>
         <w:tc>
           <w:tcPr>
@@ -3016,7 +2763,6 @@
               <w:left w:val="single" w:sz="4" w:space="0" w:color="auto"/>
               <w:right w:val="single" w:sz="4" w:space="0" w:color="auto"/>
             </w:tcBorders>
-            <w:shd w:val="clear" w:color="auto" w:fill="auto"/>
           </w:tcPr>
           <w:p>
             <w:r>
@@ -3032,11 +2778,8 @@
               <w:left w:val="single" w:sz="4" w:space="0" w:color="auto"/>
               <w:right w:val="single" w:sz="4" w:space="0" w:color="auto"/>
             </w:tcBorders>
-            <w:shd w:val="clear" w:color="auto" w:fill="auto"/>
-          </w:tcPr>
-          <w:p>
-            <w:r/>
-          </w:p>
+          </w:tcPr>
+          <w:p/>
         </w:tc>
         <w:tc>
           <w:tcPr>
@@ -3046,7 +2789,6 @@
               <w:left w:val="single" w:sz="4" w:space="0" w:color="auto"/>
               <w:right w:val="single" w:sz="4" w:space="0" w:color="auto"/>
             </w:tcBorders>
-            <w:shd w:val="clear" w:color="auto" w:fill="auto"/>
           </w:tcPr>
           <w:p>
             <w:r>
@@ -3062,11 +2804,8 @@
               <w:left w:val="single" w:sz="4" w:space="0" w:color="auto"/>
               <w:right w:val="single" w:sz="4" w:space="0" w:color="auto"/>
             </w:tcBorders>
-            <w:shd w:val="clear" w:color="auto" w:fill="auto"/>
-          </w:tcPr>
-          <w:p>
-            <w:r/>
-          </w:p>
+          </w:tcPr>
+          <w:p/>
         </w:tc>
         <w:tc>
           <w:tcPr>
@@ -3076,11 +2815,8 @@
               <w:left w:val="single" w:sz="4" w:space="0" w:color="auto"/>
               <w:right w:val="single" w:sz="4" w:space="0" w:color="auto"/>
             </w:tcBorders>
-            <w:shd w:val="clear" w:color="auto" w:fill="auto"/>
-          </w:tcPr>
-          <w:p>
-            <w:r/>
-          </w:p>
+          </w:tcPr>
+          <w:p/>
         </w:tc>
         <w:tc>
           <w:tcPr>
@@ -3090,11 +2826,8 @@
               <w:left w:val="single" w:sz="4" w:space="0" w:color="auto"/>
               <w:right w:val="nil"/>
             </w:tcBorders>
-            <w:shd w:val="clear" w:color="auto" w:fill="auto"/>
-          </w:tcPr>
-          <w:p>
-            <w:r/>
-          </w:p>
+          </w:tcPr>
+          <w:p/>
         </w:tc>
       </w:tr>
       <w:tr>
@@ -3109,11 +2842,8 @@
               <w:left w:val="nil"/>
               <w:right w:val="single" w:sz="4" w:space="0" w:color="auto"/>
             </w:tcBorders>
-            <w:shd w:val="clear" w:color="auto" w:fill="auto"/>
-          </w:tcPr>
-          <w:p>
-            <w:r/>
-          </w:p>
+          </w:tcPr>
+          <w:p/>
         </w:tc>
         <w:tc>
           <w:tcPr>
@@ -3123,7 +2853,6 @@
               <w:left w:val="single" w:sz="4" w:space="0" w:color="auto"/>
               <w:right w:val="single" w:sz="4" w:space="0" w:color="auto"/>
             </w:tcBorders>
-            <w:shd w:val="clear" w:color="auto" w:fill="auto"/>
           </w:tcPr>
           <w:p>
             <w:r>
@@ -3139,11 +2868,8 @@
               <w:left w:val="single" w:sz="4" w:space="0" w:color="auto"/>
               <w:right w:val="single" w:sz="4" w:space="0" w:color="auto"/>
             </w:tcBorders>
-            <w:shd w:val="clear" w:color="auto" w:fill="auto"/>
-          </w:tcPr>
-          <w:p>
-            <w:r/>
-          </w:p>
+          </w:tcPr>
+          <w:p/>
         </w:tc>
         <w:tc>
           <w:tcPr>
@@ -3153,7 +2879,6 @@
               <w:left w:val="single" w:sz="4" w:space="0" w:color="auto"/>
               <w:right w:val="single" w:sz="4" w:space="0" w:color="auto"/>
             </w:tcBorders>
-            <w:shd w:val="clear" w:color="auto" w:fill="auto"/>
           </w:tcPr>
           <w:p>
             <w:r>
@@ -3169,11 +2894,8 @@
               <w:left w:val="single" w:sz="4" w:space="0" w:color="auto"/>
               <w:right w:val="single" w:sz="4" w:space="0" w:color="auto"/>
             </w:tcBorders>
-            <w:shd w:val="clear" w:color="auto" w:fill="auto"/>
-          </w:tcPr>
-          <w:p>
-            <w:r/>
-          </w:p>
+          </w:tcPr>
+          <w:p/>
         </w:tc>
         <w:tc>
           <w:tcPr>
@@ -3183,11 +2905,8 @@
               <w:left w:val="single" w:sz="4" w:space="0" w:color="auto"/>
               <w:right w:val="single" w:sz="4" w:space="0" w:color="auto"/>
             </w:tcBorders>
-            <w:shd w:val="clear" w:color="auto" w:fill="auto"/>
-          </w:tcPr>
-          <w:p>
-            <w:r/>
-          </w:p>
+          </w:tcPr>
+          <w:p/>
         </w:tc>
         <w:tc>
           <w:tcPr>
@@ -3197,11 +2916,8 @@
               <w:left w:val="single" w:sz="4" w:space="0" w:color="auto"/>
               <w:right w:val="nil"/>
             </w:tcBorders>
-            <w:shd w:val="clear" w:color="auto" w:fill="auto"/>
-          </w:tcPr>
-          <w:p>
-            <w:r/>
-          </w:p>
+          </w:tcPr>
+          <w:p/>
         </w:tc>
       </w:tr>
       <w:tr>
@@ -3216,11 +2932,8 @@
               <w:left w:val="nil"/>
               <w:right w:val="single" w:sz="4" w:space="0" w:color="auto"/>
             </w:tcBorders>
-            <w:shd w:val="clear" w:color="auto" w:fill="auto"/>
-          </w:tcPr>
-          <w:p>
-            <w:r/>
-          </w:p>
+          </w:tcPr>
+          <w:p/>
         </w:tc>
         <w:tc>
           <w:tcPr>
@@ -3230,7 +2943,6 @@
               <w:left w:val="single" w:sz="4" w:space="0" w:color="auto"/>
               <w:right w:val="single" w:sz="4" w:space="0" w:color="auto"/>
             </w:tcBorders>
-            <w:shd w:val="clear" w:color="auto" w:fill="auto"/>
           </w:tcPr>
           <w:p>
             <w:r>
@@ -3246,11 +2958,8 @@
               <w:left w:val="single" w:sz="4" w:space="0" w:color="auto"/>
               <w:right w:val="single" w:sz="4" w:space="0" w:color="auto"/>
             </w:tcBorders>
-            <w:shd w:val="clear" w:color="auto" w:fill="auto"/>
-          </w:tcPr>
-          <w:p>
-            <w:r/>
-          </w:p>
+          </w:tcPr>
+          <w:p/>
         </w:tc>
         <w:tc>
           <w:tcPr>
@@ -3260,7 +2969,6 @@
               <w:left w:val="single" w:sz="4" w:space="0" w:color="auto"/>
               <w:right w:val="single" w:sz="4" w:space="0" w:color="auto"/>
             </w:tcBorders>
-            <w:shd w:val="clear" w:color="auto" w:fill="auto"/>
           </w:tcPr>
           <w:p>
             <w:r>
@@ -3276,11 +2984,8 @@
               <w:left w:val="single" w:sz="4" w:space="0" w:color="auto"/>
               <w:right w:val="single" w:sz="4" w:space="0" w:color="auto"/>
             </w:tcBorders>
-            <w:shd w:val="clear" w:color="auto" w:fill="auto"/>
-          </w:tcPr>
-          <w:p>
-            <w:r/>
-          </w:p>
+          </w:tcPr>
+          <w:p/>
         </w:tc>
         <w:tc>
           <w:tcPr>
@@ -3290,11 +2995,8 @@
               <w:left w:val="single" w:sz="4" w:space="0" w:color="auto"/>
               <w:right w:val="single" w:sz="4" w:space="0" w:color="auto"/>
             </w:tcBorders>
-            <w:shd w:val="clear" w:color="auto" w:fill="auto"/>
-          </w:tcPr>
-          <w:p>
-            <w:r/>
-          </w:p>
+          </w:tcPr>
+          <w:p/>
         </w:tc>
         <w:tc>
           <w:tcPr>
@@ -3304,11 +3006,8 @@
               <w:left w:val="single" w:sz="4" w:space="0" w:color="auto"/>
               <w:right w:val="nil"/>
             </w:tcBorders>
-            <w:shd w:val="clear" w:color="auto" w:fill="auto"/>
-          </w:tcPr>
-          <w:p>
-            <w:r/>
-          </w:p>
+          </w:tcPr>
+          <w:p/>
         </w:tc>
       </w:tr>
       <w:tr>
@@ -3323,11 +3022,8 @@
               <w:left w:val="nil"/>
               <w:right w:val="single" w:sz="4" w:space="0" w:color="auto"/>
             </w:tcBorders>
-            <w:shd w:val="clear" w:color="auto" w:fill="auto"/>
-          </w:tcPr>
-          <w:p>
-            <w:r/>
-          </w:p>
+          </w:tcPr>
+          <w:p/>
         </w:tc>
         <w:tc>
           <w:tcPr>
@@ -3337,7 +3033,6 @@
               <w:left w:val="single" w:sz="4" w:space="0" w:color="auto"/>
               <w:right w:val="single" w:sz="4" w:space="0" w:color="auto"/>
             </w:tcBorders>
-            <w:shd w:val="clear" w:color="auto" w:fill="auto"/>
           </w:tcPr>
           <w:p>
             <w:r>
@@ -3353,11 +3048,8 @@
               <w:left w:val="single" w:sz="4" w:space="0" w:color="auto"/>
               <w:right w:val="single" w:sz="4" w:space="0" w:color="auto"/>
             </w:tcBorders>
-            <w:shd w:val="clear" w:color="auto" w:fill="auto"/>
-          </w:tcPr>
-          <w:p>
-            <w:r/>
-          </w:p>
+          </w:tcPr>
+          <w:p/>
         </w:tc>
         <w:tc>
           <w:tcPr>
@@ -3367,7 +3059,6 @@
               <w:left w:val="single" w:sz="4" w:space="0" w:color="auto"/>
               <w:right w:val="single" w:sz="4" w:space="0" w:color="auto"/>
             </w:tcBorders>
-            <w:shd w:val="clear" w:color="auto" w:fill="auto"/>
           </w:tcPr>
           <w:p>
             <w:r>
@@ -3383,11 +3074,8 @@
               <w:left w:val="single" w:sz="4" w:space="0" w:color="auto"/>
               <w:right w:val="single" w:sz="4" w:space="0" w:color="auto"/>
             </w:tcBorders>
-            <w:shd w:val="clear" w:color="auto" w:fill="auto"/>
-          </w:tcPr>
-          <w:p>
-            <w:r/>
-          </w:p>
+          </w:tcPr>
+          <w:p/>
         </w:tc>
         <w:tc>
           <w:tcPr>
@@ -3397,11 +3085,8 @@
               <w:left w:val="single" w:sz="4" w:space="0" w:color="auto"/>
               <w:right w:val="single" w:sz="4" w:space="0" w:color="auto"/>
             </w:tcBorders>
-            <w:shd w:val="clear" w:color="auto" w:fill="auto"/>
-          </w:tcPr>
-          <w:p>
-            <w:r/>
-          </w:p>
+          </w:tcPr>
+          <w:p/>
         </w:tc>
         <w:tc>
           <w:tcPr>
@@ -3411,11 +3096,8 @@
               <w:left w:val="single" w:sz="4" w:space="0" w:color="auto"/>
               <w:right w:val="nil"/>
             </w:tcBorders>
-            <w:shd w:val="clear" w:color="auto" w:fill="auto"/>
-          </w:tcPr>
-          <w:p>
-            <w:r/>
-          </w:p>
+          </w:tcPr>
+          <w:p/>
         </w:tc>
       </w:tr>
       <w:tr>
@@ -3430,11 +3112,8 @@
               <w:left w:val="nil"/>
               <w:right w:val="single" w:sz="4" w:space="0" w:color="auto"/>
             </w:tcBorders>
-            <w:shd w:val="clear" w:color="auto" w:fill="auto"/>
-          </w:tcPr>
-          <w:p>
-            <w:r/>
-          </w:p>
+          </w:tcPr>
+          <w:p/>
         </w:tc>
         <w:tc>
           <w:tcPr>
@@ -3444,7 +3123,6 @@
               <w:left w:val="single" w:sz="4" w:space="0" w:color="auto"/>
               <w:right w:val="single" w:sz="4" w:space="0" w:color="auto"/>
             </w:tcBorders>
-            <w:shd w:val="clear" w:color="auto" w:fill="auto"/>
           </w:tcPr>
           <w:p>
             <w:r>
@@ -3460,11 +3138,8 @@
               <w:left w:val="single" w:sz="4" w:space="0" w:color="auto"/>
               <w:right w:val="single" w:sz="4" w:space="0" w:color="auto"/>
             </w:tcBorders>
-            <w:shd w:val="clear" w:color="auto" w:fill="auto"/>
-          </w:tcPr>
-          <w:p>
-            <w:r/>
-          </w:p>
+          </w:tcPr>
+          <w:p/>
         </w:tc>
         <w:tc>
           <w:tcPr>
@@ -3474,7 +3149,6 @@
               <w:left w:val="single" w:sz="4" w:space="0" w:color="auto"/>
               <w:right w:val="single" w:sz="4" w:space="0" w:color="auto"/>
             </w:tcBorders>
-            <w:shd w:val="clear" w:color="auto" w:fill="auto"/>
           </w:tcPr>
           <w:p>
             <w:r>
@@ -3490,11 +3164,8 @@
               <w:left w:val="single" w:sz="4" w:space="0" w:color="auto"/>
               <w:right w:val="single" w:sz="4" w:space="0" w:color="auto"/>
             </w:tcBorders>
-            <w:shd w:val="clear" w:color="auto" w:fill="auto"/>
-          </w:tcPr>
-          <w:p>
-            <w:r/>
-          </w:p>
+          </w:tcPr>
+          <w:p/>
         </w:tc>
         <w:tc>
           <w:tcPr>
@@ -3504,11 +3175,8 @@
               <w:left w:val="single" w:sz="4" w:space="0" w:color="auto"/>
               <w:right w:val="single" w:sz="4" w:space="0" w:color="auto"/>
             </w:tcBorders>
-            <w:shd w:val="clear" w:color="auto" w:fill="auto"/>
-          </w:tcPr>
-          <w:p>
-            <w:r/>
-          </w:p>
+          </w:tcPr>
+          <w:p/>
         </w:tc>
         <w:tc>
           <w:tcPr>
@@ -3518,11 +3186,8 @@
               <w:left w:val="single" w:sz="4" w:space="0" w:color="auto"/>
               <w:right w:val="nil"/>
             </w:tcBorders>
-            <w:shd w:val="clear" w:color="auto" w:fill="auto"/>
-          </w:tcPr>
-          <w:p>
-            <w:r/>
-          </w:p>
+          </w:tcPr>
+          <w:p/>
         </w:tc>
       </w:tr>
       <w:tr>
@@ -3537,7 +3202,6 @@
               <w:left w:val="nil"/>
               <w:right w:val="single" w:sz="4" w:space="0" w:color="auto"/>
             </w:tcBorders>
-            <w:shd w:val="clear" w:color="auto" w:fill="auto"/>
           </w:tcPr>
           <w:p>
             <w:r>
@@ -3553,7 +3217,6 @@
               <w:left w:val="single" w:sz="4" w:space="0" w:color="auto"/>
               <w:right w:val="single" w:sz="4" w:space="0" w:color="auto"/>
             </w:tcBorders>
-            <w:shd w:val="clear" w:color="auto" w:fill="auto"/>
           </w:tcPr>
           <w:p>
             <w:r>
@@ -3569,11 +3232,8 @@
               <w:left w:val="single" w:sz="4" w:space="0" w:color="auto"/>
               <w:right w:val="single" w:sz="4" w:space="0" w:color="auto"/>
             </w:tcBorders>
-            <w:shd w:val="clear" w:color="auto" w:fill="auto"/>
-          </w:tcPr>
-          <w:p>
-            <w:r/>
-          </w:p>
+          </w:tcPr>
+          <w:p/>
         </w:tc>
         <w:tc>
           <w:tcPr>
@@ -3583,7 +3243,6 @@
               <w:left w:val="single" w:sz="4" w:space="0" w:color="auto"/>
               <w:right w:val="single" w:sz="4" w:space="0" w:color="auto"/>
             </w:tcBorders>
-            <w:shd w:val="clear" w:color="auto" w:fill="auto"/>
           </w:tcPr>
           <w:p>
             <w:r>
@@ -3599,11 +3258,8 @@
               <w:left w:val="single" w:sz="4" w:space="0" w:color="auto"/>
               <w:right w:val="single" w:sz="4" w:space="0" w:color="auto"/>
             </w:tcBorders>
-            <w:shd w:val="clear" w:color="auto" w:fill="auto"/>
-          </w:tcPr>
-          <w:p>
-            <w:r/>
-          </w:p>
+          </w:tcPr>
+          <w:p/>
         </w:tc>
         <w:tc>
           <w:tcPr>
@@ -3613,11 +3269,8 @@
               <w:left w:val="single" w:sz="4" w:space="0" w:color="auto"/>
               <w:right w:val="single" w:sz="4" w:space="0" w:color="auto"/>
             </w:tcBorders>
-            <w:shd w:val="clear" w:color="auto" w:fill="auto"/>
-          </w:tcPr>
-          <w:p>
-            <w:r/>
-          </w:p>
+          </w:tcPr>
+          <w:p/>
         </w:tc>
         <w:tc>
           <w:tcPr>
@@ -3627,11 +3280,8 @@
               <w:left w:val="single" w:sz="4" w:space="0" w:color="auto"/>
               <w:right w:val="nil"/>
             </w:tcBorders>
-            <w:shd w:val="clear" w:color="auto" w:fill="auto"/>
-          </w:tcPr>
-          <w:p>
-            <w:r/>
-          </w:p>
+          </w:tcPr>
+          <w:p/>
         </w:tc>
       </w:tr>
       <w:tr>
@@ -3646,11 +3296,8 @@
               <w:left w:val="nil"/>
               <w:right w:val="single" w:sz="4" w:space="0" w:color="auto"/>
             </w:tcBorders>
-            <w:shd w:val="clear" w:color="auto" w:fill="auto"/>
-          </w:tcPr>
-          <w:p>
-            <w:r/>
-          </w:p>
+          </w:tcPr>
+          <w:p/>
         </w:tc>
         <w:tc>
           <w:tcPr>
@@ -3660,7 +3307,6 @@
               <w:left w:val="single" w:sz="4" w:space="0" w:color="auto"/>
               <w:right w:val="single" w:sz="4" w:space="0" w:color="auto"/>
             </w:tcBorders>
-            <w:shd w:val="clear" w:color="auto" w:fill="auto"/>
           </w:tcPr>
           <w:p>
             <w:r>
@@ -3676,11 +3322,8 @@
               <w:left w:val="single" w:sz="4" w:space="0" w:color="auto"/>
               <w:right w:val="single" w:sz="4" w:space="0" w:color="auto"/>
             </w:tcBorders>
-            <w:shd w:val="clear" w:color="auto" w:fill="auto"/>
-          </w:tcPr>
-          <w:p>
-            <w:r/>
-          </w:p>
+          </w:tcPr>
+          <w:p/>
         </w:tc>
         <w:tc>
           <w:tcPr>
@@ -3690,7 +3333,6 @@
               <w:left w:val="single" w:sz="4" w:space="0" w:color="auto"/>
               <w:right w:val="single" w:sz="4" w:space="0" w:color="auto"/>
             </w:tcBorders>
-            <w:shd w:val="clear" w:color="auto" w:fill="auto"/>
           </w:tcPr>
           <w:p>
             <w:r>
@@ -3706,11 +3348,8 @@
               <w:left w:val="single" w:sz="4" w:space="0" w:color="auto"/>
               <w:right w:val="single" w:sz="4" w:space="0" w:color="auto"/>
             </w:tcBorders>
-            <w:shd w:val="clear" w:color="auto" w:fill="auto"/>
-          </w:tcPr>
-          <w:p>
-            <w:r/>
-          </w:p>
+          </w:tcPr>
+          <w:p/>
         </w:tc>
         <w:tc>
           <w:tcPr>
@@ -3720,11 +3359,8 @@
               <w:left w:val="single" w:sz="4" w:space="0" w:color="auto"/>
               <w:right w:val="single" w:sz="4" w:space="0" w:color="auto"/>
             </w:tcBorders>
-            <w:shd w:val="clear" w:color="auto" w:fill="auto"/>
-          </w:tcPr>
-          <w:p>
-            <w:r/>
-          </w:p>
+          </w:tcPr>
+          <w:p/>
         </w:tc>
         <w:tc>
           <w:tcPr>
@@ -3734,11 +3370,8 @@
               <w:left w:val="single" w:sz="4" w:space="0" w:color="auto"/>
               <w:right w:val="nil"/>
             </w:tcBorders>
-            <w:shd w:val="clear" w:color="auto" w:fill="auto"/>
-          </w:tcPr>
-          <w:p>
-            <w:r/>
-          </w:p>
+          </w:tcPr>
+          <w:p/>
         </w:tc>
       </w:tr>
       <w:tr>
@@ -3753,7 +3386,6 @@
               <w:left w:val="nil"/>
               <w:right w:val="single" w:sz="4" w:space="0" w:color="auto"/>
             </w:tcBorders>
-            <w:shd w:val="clear" w:color="auto" w:fill="auto"/>
           </w:tcPr>
           <w:p>
             <w:r>
@@ -3769,7 +3401,6 @@
               <w:left w:val="single" w:sz="4" w:space="0" w:color="auto"/>
               <w:right w:val="single" w:sz="4" w:space="0" w:color="auto"/>
             </w:tcBorders>
-            <w:shd w:val="clear" w:color="auto" w:fill="auto"/>
           </w:tcPr>
           <w:p>
             <w:r>
@@ -3785,7 +3416,6 @@
               <w:left w:val="single" w:sz="4" w:space="0" w:color="auto"/>
               <w:right w:val="single" w:sz="4" w:space="0" w:color="auto"/>
             </w:tcBorders>
-            <w:shd w:val="clear" w:color="auto" w:fill="auto"/>
           </w:tcPr>
           <w:p>
             <w:r>
@@ -3801,11 +3431,8 @@
               <w:left w:val="single" w:sz="4" w:space="0" w:color="auto"/>
               <w:right w:val="single" w:sz="4" w:space="0" w:color="auto"/>
             </w:tcBorders>
-            <w:shd w:val="clear" w:color="auto" w:fill="auto"/>
-          </w:tcPr>
-          <w:p>
-            <w:r/>
-          </w:p>
+          </w:tcPr>
+          <w:p/>
         </w:tc>
         <w:tc>
           <w:tcPr>
@@ -3815,7 +3442,6 @@
               <w:left w:val="single" w:sz="4" w:space="0" w:color="auto"/>
               <w:right w:val="single" w:sz="4" w:space="0" w:color="auto"/>
             </w:tcBorders>
-            <w:shd w:val="clear" w:color="auto" w:fill="auto"/>
           </w:tcPr>
           <w:p>
             <w:r>
@@ -3831,11 +3457,8 @@
               <w:left w:val="single" w:sz="4" w:space="0" w:color="auto"/>
               <w:right w:val="single" w:sz="4" w:space="0" w:color="auto"/>
             </w:tcBorders>
-            <w:shd w:val="clear" w:color="auto" w:fill="auto"/>
-          </w:tcPr>
-          <w:p>
-            <w:r/>
-          </w:p>
+          </w:tcPr>
+          <w:p/>
         </w:tc>
         <w:tc>
           <w:tcPr>
@@ -3845,11 +3468,8 @@
               <w:left w:val="single" w:sz="4" w:space="0" w:color="auto"/>
               <w:right w:val="nil"/>
             </w:tcBorders>
-            <w:shd w:val="clear" w:color="auto" w:fill="auto"/>
-          </w:tcPr>
-          <w:p>
-            <w:r/>
-          </w:p>
+          </w:tcPr>
+          <w:p/>
         </w:tc>
       </w:tr>
       <w:tr>
@@ -3864,11 +3484,8 @@
               <w:left w:val="nil"/>
               <w:right w:val="single" w:sz="4" w:space="0" w:color="auto"/>
             </w:tcBorders>
-            <w:shd w:val="clear" w:color="auto" w:fill="auto"/>
-          </w:tcPr>
-          <w:p>
-            <w:r/>
-          </w:p>
+          </w:tcPr>
+          <w:p/>
         </w:tc>
         <w:tc>
           <w:tcPr>
@@ -3878,7 +3495,6 @@
               <w:left w:val="single" w:sz="4" w:space="0" w:color="auto"/>
               <w:right w:val="single" w:sz="4" w:space="0" w:color="auto"/>
             </w:tcBorders>
-            <w:shd w:val="clear" w:color="auto" w:fill="auto"/>
           </w:tcPr>
           <w:p>
             <w:r>
@@ -3894,7 +3510,6 @@
               <w:left w:val="single" w:sz="4" w:space="0" w:color="auto"/>
               <w:right w:val="single" w:sz="4" w:space="0" w:color="auto"/>
             </w:tcBorders>
-            <w:shd w:val="clear" w:color="auto" w:fill="auto"/>
           </w:tcPr>
           <w:p>
             <w:r>
@@ -3910,11 +3525,8 @@
               <w:left w:val="single" w:sz="4" w:space="0" w:color="auto"/>
               <w:right w:val="single" w:sz="4" w:space="0" w:color="auto"/>
             </w:tcBorders>
-            <w:shd w:val="clear" w:color="auto" w:fill="auto"/>
-          </w:tcPr>
-          <w:p>
-            <w:r/>
-          </w:p>
+          </w:tcPr>
+          <w:p/>
         </w:tc>
         <w:tc>
           <w:tcPr>
@@ -3924,11 +3536,8 @@
               <w:left w:val="single" w:sz="4" w:space="0" w:color="auto"/>
               <w:right w:val="single" w:sz="4" w:space="0" w:color="auto"/>
             </w:tcBorders>
-            <w:shd w:val="clear" w:color="auto" w:fill="auto"/>
-          </w:tcPr>
-          <w:p>
-            <w:r/>
-          </w:p>
+          </w:tcPr>
+          <w:p/>
         </w:tc>
         <w:tc>
           <w:tcPr>
@@ -3938,11 +3547,8 @@
               <w:left w:val="single" w:sz="4" w:space="0" w:color="auto"/>
               <w:right w:val="single" w:sz="4" w:space="0" w:color="auto"/>
             </w:tcBorders>
-            <w:shd w:val="clear" w:color="auto" w:fill="auto"/>
-          </w:tcPr>
-          <w:p>
-            <w:r/>
-          </w:p>
+          </w:tcPr>
+          <w:p/>
         </w:tc>
         <w:tc>
           <w:tcPr>
@@ -3952,11 +3558,8 @@
               <w:left w:val="single" w:sz="4" w:space="0" w:color="auto"/>
               <w:right w:val="nil"/>
             </w:tcBorders>
-            <w:shd w:val="clear" w:color="auto" w:fill="auto"/>
-          </w:tcPr>
-          <w:p>
-            <w:r/>
-          </w:p>
+          </w:tcPr>
+          <w:p/>
         </w:tc>
       </w:tr>
       <w:tr>
@@ -3971,11 +3574,8 @@
               <w:left w:val="nil"/>
               <w:right w:val="single" w:sz="4" w:space="0" w:color="auto"/>
             </w:tcBorders>
-            <w:shd w:val="clear" w:color="auto" w:fill="auto"/>
-          </w:tcPr>
-          <w:p>
-            <w:r/>
-          </w:p>
+          </w:tcPr>
+          <w:p/>
         </w:tc>
         <w:tc>
           <w:tcPr>
@@ -3985,7 +3585,6 @@
               <w:left w:val="single" w:sz="4" w:space="0" w:color="auto"/>
               <w:right w:val="single" w:sz="4" w:space="0" w:color="auto"/>
             </w:tcBorders>
-            <w:shd w:val="clear" w:color="auto" w:fill="auto"/>
           </w:tcPr>
           <w:p>
             <w:r>
@@ -4001,11 +3600,8 @@
               <w:left w:val="single" w:sz="4" w:space="0" w:color="auto"/>
               <w:right w:val="single" w:sz="4" w:space="0" w:color="auto"/>
             </w:tcBorders>
-            <w:shd w:val="clear" w:color="auto" w:fill="auto"/>
-          </w:tcPr>
-          <w:p>
-            <w:r/>
-          </w:p>
+          </w:tcPr>
+          <w:p/>
         </w:tc>
         <w:tc>
           <w:tcPr>
@@ -4015,7 +3611,6 @@
               <w:left w:val="single" w:sz="4" w:space="0" w:color="auto"/>
               <w:right w:val="single" w:sz="4" w:space="0" w:color="auto"/>
             </w:tcBorders>
-            <w:shd w:val="clear" w:color="auto" w:fill="auto"/>
           </w:tcPr>
           <w:p>
             <w:r>
@@ -4031,7 +3626,6 @@
               <w:left w:val="single" w:sz="4" w:space="0" w:color="auto"/>
               <w:right w:val="single" w:sz="4" w:space="0" w:color="auto"/>
             </w:tcBorders>
-            <w:shd w:val="clear" w:color="auto" w:fill="auto"/>
           </w:tcPr>
           <w:p>
             <w:r>
@@ -4047,11 +3641,8 @@
               <w:left w:val="single" w:sz="4" w:space="0" w:color="auto"/>
               <w:right w:val="single" w:sz="4" w:space="0" w:color="auto"/>
             </w:tcBorders>
-            <w:shd w:val="clear" w:color="auto" w:fill="auto"/>
-          </w:tcPr>
-          <w:p>
-            <w:r/>
-          </w:p>
+          </w:tcPr>
+          <w:p/>
         </w:tc>
         <w:tc>
           <w:tcPr>
@@ -4061,14 +3652,41 @@
               <w:left w:val="single" w:sz="4" w:space="0" w:color="auto"/>
               <w:right w:val="nil"/>
             </w:tcBorders>
-            <w:shd w:val="clear" w:color="auto" w:fill="auto"/>
-          </w:tcPr>
-          <w:p>
-            <w:r/>
-          </w:p>
+          </w:tcPr>
+          <w:p/>
         </w:tc>
       </w:tr>
     </w:tbl>
+    <w:p>
+      <w:pPr>
+        <w:pStyle w:val="NoSpacing"/>
+      </w:pPr>
+    </w:p>
+    <w:p>
+      <w:pPr>
+        <w:pStyle w:val="NoSpacing"/>
+      </w:pPr>
+    </w:p>
+    <w:p>
+      <w:pPr>
+        <w:pStyle w:val="NoSpacing"/>
+      </w:pPr>
+    </w:p>
+    <w:p>
+      <w:pPr>
+        <w:pStyle w:val="NoSpacing"/>
+      </w:pPr>
+    </w:p>
+    <w:p>
+      <w:pPr>
+        <w:pStyle w:val="NoSpacing"/>
+      </w:pPr>
+    </w:p>
+    <w:p>
+      <w:pPr>
+        <w:pStyle w:val="NoSpacing"/>
+      </w:pPr>
+    </w:p>
     <w:p>
       <w:pPr>
         <w:pStyle w:val="NoSpacing"/>
@@ -4234,7 +3852,6 @@
               <w:bottom w:val="single" w:sz="4" w:space="0" w:color="auto"/>
               <w:right w:val="single" w:sz="4" w:space="0" w:color="auto"/>
             </w:tcBorders>
-            <w:shd w:val="clear" w:color="auto" w:fill="auto"/>
             <w:vAlign w:val="center"/>
           </w:tcPr>
           <w:p>
@@ -4270,7 +3887,6 @@
               <w:bottom w:val="single" w:sz="4" w:space="0" w:color="auto"/>
               <w:right w:val="single" w:sz="4" w:space="0" w:color="auto"/>
             </w:tcBorders>
-            <w:shd w:val="clear" w:color="auto" w:fill="auto"/>
             <w:vAlign w:val="center"/>
           </w:tcPr>
           <w:p>
@@ -4292,7 +3908,6 @@
               <w:bottom w:val="single" w:sz="4" w:space="0" w:color="auto"/>
               <w:right w:val="single" w:sz="4" w:space="0" w:color="auto"/>
             </w:tcBorders>
-            <w:shd w:val="clear" w:color="auto" w:fill="auto"/>
             <w:vAlign w:val="center"/>
           </w:tcPr>
           <w:p>
@@ -4314,7 +3929,6 @@
               <w:bottom w:val="single" w:sz="4" w:space="0" w:color="auto"/>
               <w:right w:val="single" w:sz="4" w:space="0" w:color="auto"/>
             </w:tcBorders>
-            <w:shd w:val="clear" w:color="auto" w:fill="auto"/>
             <w:vAlign w:val="center"/>
           </w:tcPr>
           <w:p>
@@ -4336,7 +3950,6 @@
               <w:bottom w:val="single" w:sz="4" w:space="0" w:color="auto"/>
               <w:right w:val="single" w:sz="4" w:space="0" w:color="auto"/>
             </w:tcBorders>
-            <w:shd w:val="clear" w:color="auto" w:fill="auto"/>
             <w:vAlign w:val="center"/>
           </w:tcPr>
           <w:p>
@@ -4358,7 +3971,6 @@
               <w:bottom w:val="single" w:sz="4" w:space="0" w:color="auto"/>
               <w:right w:val="nil"/>
             </w:tcBorders>
-            <w:shd w:val="clear" w:color="auto" w:fill="auto"/>
             <w:vAlign w:val="center"/>
           </w:tcPr>
           <w:p>
@@ -4384,7 +3996,6 @@
               <w:left w:val="nil"/>
               <w:right w:val="single" w:sz="4" w:space="0" w:color="auto"/>
             </w:tcBorders>
-            <w:shd w:val="clear" w:color="auto" w:fill="auto"/>
           </w:tcPr>
           <w:p>
             <w:r>
@@ -4400,11 +4011,8 @@
               <w:left w:val="single" w:sz="4" w:space="0" w:color="auto"/>
               <w:right w:val="single" w:sz="4" w:space="0" w:color="auto"/>
             </w:tcBorders>
-            <w:shd w:val="clear" w:color="auto" w:fill="auto"/>
-          </w:tcPr>
-          <w:p>
-            <w:r/>
-          </w:p>
+          </w:tcPr>
+          <w:p/>
         </w:tc>
         <w:tc>
           <w:tcPr>
@@ -4414,7 +4022,6 @@
               <w:left w:val="single" w:sz="4" w:space="0" w:color="auto"/>
               <w:right w:val="single" w:sz="4" w:space="0" w:color="auto"/>
             </w:tcBorders>
-            <w:shd w:val="clear" w:color="auto" w:fill="auto"/>
           </w:tcPr>
           <w:p>
             <w:r>
@@ -4430,11 +4037,8 @@
               <w:left w:val="single" w:sz="4" w:space="0" w:color="auto"/>
               <w:right w:val="single" w:sz="4" w:space="0" w:color="auto"/>
             </w:tcBorders>
-            <w:shd w:val="clear" w:color="auto" w:fill="auto"/>
-          </w:tcPr>
-          <w:p>
-            <w:r/>
-          </w:p>
+          </w:tcPr>
+          <w:p/>
         </w:tc>
         <w:tc>
           <w:tcPr>
@@ -4444,11 +4048,8 @@
               <w:left w:val="single" w:sz="4" w:space="0" w:color="auto"/>
               <w:right w:val="single" w:sz="4" w:space="0" w:color="auto"/>
             </w:tcBorders>
-            <w:shd w:val="clear" w:color="auto" w:fill="auto"/>
-          </w:tcPr>
-          <w:p>
-            <w:r/>
-          </w:p>
+          </w:tcPr>
+          <w:p/>
         </w:tc>
         <w:tc>
           <w:tcPr>
@@ -4458,11 +4059,8 @@
               <w:left w:val="single" w:sz="4" w:space="0" w:color="auto"/>
               <w:right w:val="nil"/>
             </w:tcBorders>
-            <w:shd w:val="clear" w:color="auto" w:fill="auto"/>
-          </w:tcPr>
-          <w:p>
-            <w:r/>
-          </w:p>
+          </w:tcPr>
+          <w:p/>
         </w:tc>
       </w:tr>
       <w:tr>
@@ -4477,7 +4075,6 @@
               <w:left w:val="nil"/>
               <w:right w:val="single" w:sz="4" w:space="0" w:color="auto"/>
             </w:tcBorders>
-            <w:shd w:val="clear" w:color="auto" w:fill="auto"/>
           </w:tcPr>
           <w:p>
             <w:r>
@@ -4493,11 +4090,8 @@
               <w:left w:val="single" w:sz="4" w:space="0" w:color="auto"/>
               <w:right w:val="single" w:sz="4" w:space="0" w:color="auto"/>
             </w:tcBorders>
-            <w:shd w:val="clear" w:color="auto" w:fill="auto"/>
-          </w:tcPr>
-          <w:p>
-            <w:r/>
-          </w:p>
+          </w:tcPr>
+          <w:p/>
         </w:tc>
         <w:tc>
           <w:tcPr>
@@ -4507,7 +4101,6 @@
               <w:left w:val="single" w:sz="4" w:space="0" w:color="auto"/>
               <w:right w:val="single" w:sz="4" w:space="0" w:color="auto"/>
             </w:tcBorders>
-            <w:shd w:val="clear" w:color="auto" w:fill="auto"/>
           </w:tcPr>
           <w:p>
             <w:r>
@@ -4523,11 +4116,8 @@
               <w:left w:val="single" w:sz="4" w:space="0" w:color="auto"/>
               <w:right w:val="single" w:sz="4" w:space="0" w:color="auto"/>
             </w:tcBorders>
-            <w:shd w:val="clear" w:color="auto" w:fill="auto"/>
-          </w:tcPr>
-          <w:p>
-            <w:r/>
-          </w:p>
+          </w:tcPr>
+          <w:p/>
         </w:tc>
         <w:tc>
           <w:tcPr>
@@ -4537,11 +4127,8 @@
               <w:left w:val="single" w:sz="4" w:space="0" w:color="auto"/>
               <w:right w:val="single" w:sz="4" w:space="0" w:color="auto"/>
             </w:tcBorders>
-            <w:shd w:val="clear" w:color="auto" w:fill="auto"/>
-          </w:tcPr>
-          <w:p>
-            <w:r/>
-          </w:p>
+          </w:tcPr>
+          <w:p/>
         </w:tc>
         <w:tc>
           <w:tcPr>
@@ -4551,11 +4138,8 @@
               <w:left w:val="single" w:sz="4" w:space="0" w:color="auto"/>
               <w:right w:val="nil"/>
             </w:tcBorders>
-            <w:shd w:val="clear" w:color="auto" w:fill="auto"/>
-          </w:tcPr>
-          <w:p>
-            <w:r/>
-          </w:p>
+          </w:tcPr>
+          <w:p/>
         </w:tc>
       </w:tr>
       <w:tr>
@@ -4570,7 +4154,6 @@
               <w:left w:val="nil"/>
               <w:right w:val="single" w:sz="4" w:space="0" w:color="auto"/>
             </w:tcBorders>
-            <w:shd w:val="clear" w:color="auto" w:fill="auto"/>
           </w:tcPr>
           <w:p>
             <w:r>
@@ -4586,11 +4169,8 @@
               <w:left w:val="single" w:sz="4" w:space="0" w:color="auto"/>
               <w:right w:val="single" w:sz="4" w:space="0" w:color="auto"/>
             </w:tcBorders>
-            <w:shd w:val="clear" w:color="auto" w:fill="auto"/>
-          </w:tcPr>
-          <w:p>
-            <w:r/>
-          </w:p>
+          </w:tcPr>
+          <w:p/>
         </w:tc>
         <w:tc>
           <w:tcPr>
@@ -4600,7 +4180,6 @@
               <w:left w:val="single" w:sz="4" w:space="0" w:color="auto"/>
               <w:right w:val="single" w:sz="4" w:space="0" w:color="auto"/>
             </w:tcBorders>
-            <w:shd w:val="clear" w:color="auto" w:fill="auto"/>
           </w:tcPr>
           <w:p>
             <w:r>
@@ -4616,11 +4195,8 @@
               <w:left w:val="single" w:sz="4" w:space="0" w:color="auto"/>
               <w:right w:val="single" w:sz="4" w:space="0" w:color="auto"/>
             </w:tcBorders>
-            <w:shd w:val="clear" w:color="auto" w:fill="auto"/>
-          </w:tcPr>
-          <w:p>
-            <w:r/>
-          </w:p>
+          </w:tcPr>
+          <w:p/>
         </w:tc>
         <w:tc>
           <w:tcPr>
@@ -4630,11 +4206,8 @@
               <w:left w:val="single" w:sz="4" w:space="0" w:color="auto"/>
               <w:right w:val="single" w:sz="4" w:space="0" w:color="auto"/>
             </w:tcBorders>
-            <w:shd w:val="clear" w:color="auto" w:fill="auto"/>
-          </w:tcPr>
-          <w:p>
-            <w:r/>
-          </w:p>
+          </w:tcPr>
+          <w:p/>
         </w:tc>
         <w:tc>
           <w:tcPr>
@@ -4644,11 +4217,8 @@
               <w:left w:val="single" w:sz="4" w:space="0" w:color="auto"/>
               <w:right w:val="nil"/>
             </w:tcBorders>
-            <w:shd w:val="clear" w:color="auto" w:fill="auto"/>
-          </w:tcPr>
-          <w:p>
-            <w:r/>
-          </w:p>
+          </w:tcPr>
+          <w:p/>
         </w:tc>
       </w:tr>
     </w:tbl>
@@ -4827,7 +4397,6 @@
               <w:bottom w:val="single" w:sz="4" w:space="0" w:color="auto"/>
               <w:right w:val="single" w:sz="4" w:space="0" w:color="auto"/>
             </w:tcBorders>
-            <w:shd w:val="clear" w:color="auto" w:fill="auto"/>
             <w:vAlign w:val="center"/>
           </w:tcPr>
           <w:p>
@@ -4863,7 +4432,6 @@
               <w:bottom w:val="single" w:sz="4" w:space="0" w:color="auto"/>
               <w:right w:val="single" w:sz="4" w:space="0" w:color="auto"/>
             </w:tcBorders>
-            <w:shd w:val="clear" w:color="auto" w:fill="auto"/>
             <w:vAlign w:val="center"/>
           </w:tcPr>
           <w:p>
@@ -4885,7 +4453,6 @@
               <w:bottom w:val="single" w:sz="4" w:space="0" w:color="auto"/>
               <w:right w:val="single" w:sz="4" w:space="0" w:color="auto"/>
             </w:tcBorders>
-            <w:shd w:val="clear" w:color="auto" w:fill="auto"/>
             <w:vAlign w:val="center"/>
           </w:tcPr>
           <w:p>
@@ -4907,7 +4474,6 @@
               <w:bottom w:val="single" w:sz="4" w:space="0" w:color="auto"/>
               <w:right w:val="single" w:sz="4" w:space="0" w:color="auto"/>
             </w:tcBorders>
-            <w:shd w:val="clear" w:color="auto" w:fill="auto"/>
             <w:vAlign w:val="center"/>
           </w:tcPr>
           <w:p>
@@ -4929,7 +4495,6 @@
               <w:bottom w:val="single" w:sz="4" w:space="0" w:color="auto"/>
               <w:right w:val="single" w:sz="4" w:space="0" w:color="auto"/>
             </w:tcBorders>
-            <w:shd w:val="clear" w:color="auto" w:fill="auto"/>
             <w:vAlign w:val="center"/>
           </w:tcPr>
           <w:p>
@@ -4951,7 +4516,6 @@
               <w:bottom w:val="single" w:sz="4" w:space="0" w:color="auto"/>
               <w:right w:val="nil"/>
             </w:tcBorders>
-            <w:shd w:val="clear" w:color="auto" w:fill="auto"/>
             <w:vAlign w:val="center"/>
           </w:tcPr>
           <w:p>
@@ -4977,7 +4541,6 @@
               <w:left w:val="nil"/>
               <w:right w:val="single" w:sz="4" w:space="0" w:color="auto"/>
             </w:tcBorders>
-            <w:shd w:val="clear" w:color="auto" w:fill="auto"/>
             <w:vAlign w:val="center"/>
           </w:tcPr>
           <w:p>
@@ -4994,7 +4557,6 @@
               <w:left w:val="single" w:sz="4" w:space="0" w:color="auto"/>
               <w:right w:val="single" w:sz="4" w:space="0" w:color="auto"/>
             </w:tcBorders>
-            <w:shd w:val="clear" w:color="auto" w:fill="auto"/>
           </w:tcPr>
           <w:p>
             <w:r>
@@ -5010,11 +4572,8 @@
               <w:left w:val="single" w:sz="4" w:space="0" w:color="auto"/>
               <w:right w:val="single" w:sz="4" w:space="0" w:color="auto"/>
             </w:tcBorders>
-            <w:shd w:val="clear" w:color="auto" w:fill="auto"/>
-          </w:tcPr>
-          <w:p>
-            <w:r/>
-          </w:p>
+          </w:tcPr>
+          <w:p/>
         </w:tc>
         <w:tc>
           <w:tcPr>
@@ -5024,11 +4583,8 @@
               <w:left w:val="single" w:sz="4" w:space="0" w:color="auto"/>
               <w:right w:val="single" w:sz="4" w:space="0" w:color="auto"/>
             </w:tcBorders>
-            <w:shd w:val="clear" w:color="auto" w:fill="auto"/>
-          </w:tcPr>
-          <w:p>
-            <w:r/>
-          </w:p>
+          </w:tcPr>
+          <w:p/>
         </w:tc>
         <w:tc>
           <w:tcPr>
@@ -5038,11 +4594,8 @@
               <w:left w:val="single" w:sz="4" w:space="0" w:color="auto"/>
               <w:right w:val="single" w:sz="4" w:space="0" w:color="auto"/>
             </w:tcBorders>
-            <w:shd w:val="clear" w:color="auto" w:fill="auto"/>
-          </w:tcPr>
-          <w:p>
-            <w:r/>
-          </w:p>
+          </w:tcPr>
+          <w:p/>
         </w:tc>
         <w:tc>
           <w:tcPr>
@@ -5052,11 +4605,8 @@
               <w:left w:val="single" w:sz="4" w:space="0" w:color="auto"/>
               <w:right w:val="nil"/>
             </w:tcBorders>
-            <w:shd w:val="clear" w:color="auto" w:fill="auto"/>
-          </w:tcPr>
-          <w:p>
-            <w:r/>
-          </w:p>
+          </w:tcPr>
+          <w:p/>
         </w:tc>
       </w:tr>
       <w:tr>
@@ -5071,7 +4621,6 @@
               <w:left w:val="nil"/>
               <w:right w:val="single" w:sz="4" w:space="0" w:color="auto"/>
             </w:tcBorders>
-            <w:shd w:val="clear" w:color="auto" w:fill="auto"/>
             <w:vAlign w:val="center"/>
           </w:tcPr>
           <w:p>
@@ -5088,7 +4637,6 @@
               <w:left w:val="single" w:sz="4" w:space="0" w:color="auto"/>
               <w:right w:val="single" w:sz="4" w:space="0" w:color="auto"/>
             </w:tcBorders>
-            <w:shd w:val="clear" w:color="auto" w:fill="auto"/>
           </w:tcPr>
           <w:p>
             <w:r>
@@ -5104,11 +4652,8 @@
               <w:left w:val="single" w:sz="4" w:space="0" w:color="auto"/>
               <w:right w:val="single" w:sz="4" w:space="0" w:color="auto"/>
             </w:tcBorders>
-            <w:shd w:val="clear" w:color="auto" w:fill="auto"/>
-          </w:tcPr>
-          <w:p>
-            <w:r/>
-          </w:p>
+          </w:tcPr>
+          <w:p/>
         </w:tc>
         <w:tc>
           <w:tcPr>
@@ -5118,11 +4663,8 @@
               <w:left w:val="single" w:sz="4" w:space="0" w:color="auto"/>
               <w:right w:val="single" w:sz="4" w:space="0" w:color="auto"/>
             </w:tcBorders>
-            <w:shd w:val="clear" w:color="auto" w:fill="auto"/>
-          </w:tcPr>
-          <w:p>
-            <w:r/>
-          </w:p>
+          </w:tcPr>
+          <w:p/>
         </w:tc>
         <w:tc>
           <w:tcPr>
@@ -5132,11 +4674,8 @@
               <w:left w:val="single" w:sz="4" w:space="0" w:color="auto"/>
               <w:right w:val="single" w:sz="4" w:space="0" w:color="auto"/>
             </w:tcBorders>
-            <w:shd w:val="clear" w:color="auto" w:fill="auto"/>
-          </w:tcPr>
-          <w:p>
-            <w:r/>
-          </w:p>
+          </w:tcPr>
+          <w:p/>
         </w:tc>
         <w:tc>
           <w:tcPr>
@@ -5146,11 +4685,8 @@
               <w:left w:val="single" w:sz="4" w:space="0" w:color="auto"/>
               <w:right w:val="nil"/>
             </w:tcBorders>
-            <w:shd w:val="clear" w:color="auto" w:fill="auto"/>
-          </w:tcPr>
-          <w:p>
-            <w:r/>
-          </w:p>
+          </w:tcPr>
+          <w:p/>
         </w:tc>
       </w:tr>
       <w:tr>
@@ -5165,7 +4701,6 @@
               <w:left w:val="nil"/>
               <w:right w:val="single" w:sz="4" w:space="0" w:color="auto"/>
             </w:tcBorders>
-            <w:shd w:val="clear" w:color="auto" w:fill="auto"/>
             <w:vAlign w:val="center"/>
           </w:tcPr>
           <w:p>
@@ -5197,7 +4732,6 @@
               <w:left w:val="single" w:sz="4" w:space="0" w:color="auto"/>
               <w:right w:val="single" w:sz="4" w:space="0" w:color="auto"/>
             </w:tcBorders>
-            <w:shd w:val="clear" w:color="auto" w:fill="auto"/>
           </w:tcPr>
           <w:p>
             <w:r>
@@ -5213,11 +4747,8 @@
               <w:left w:val="single" w:sz="4" w:space="0" w:color="auto"/>
               <w:right w:val="single" w:sz="4" w:space="0" w:color="auto"/>
             </w:tcBorders>
-            <w:shd w:val="clear" w:color="auto" w:fill="auto"/>
-          </w:tcPr>
-          <w:p>
-            <w:r/>
-          </w:p>
+          </w:tcPr>
+          <w:p/>
         </w:tc>
         <w:tc>
           <w:tcPr>
@@ -5227,11 +4758,8 @@
               <w:left w:val="single" w:sz="4" w:space="0" w:color="auto"/>
               <w:right w:val="single" w:sz="4" w:space="0" w:color="auto"/>
             </w:tcBorders>
-            <w:shd w:val="clear" w:color="auto" w:fill="auto"/>
-          </w:tcPr>
-          <w:p>
-            <w:r/>
-          </w:p>
+          </w:tcPr>
+          <w:p/>
         </w:tc>
         <w:tc>
           <w:tcPr>
@@ -5241,11 +4769,8 @@
               <w:left w:val="single" w:sz="4" w:space="0" w:color="auto"/>
               <w:right w:val="single" w:sz="4" w:space="0" w:color="auto"/>
             </w:tcBorders>
-            <w:shd w:val="clear" w:color="auto" w:fill="auto"/>
-          </w:tcPr>
-          <w:p>
-            <w:r/>
-          </w:p>
+          </w:tcPr>
+          <w:p/>
         </w:tc>
         <w:tc>
           <w:tcPr>
@@ -5255,11 +4780,8 @@
               <w:left w:val="single" w:sz="4" w:space="0" w:color="auto"/>
               <w:right w:val="nil"/>
             </w:tcBorders>
-            <w:shd w:val="clear" w:color="auto" w:fill="auto"/>
-          </w:tcPr>
-          <w:p>
-            <w:r/>
-          </w:p>
+          </w:tcPr>
+          <w:p/>
         </w:tc>
       </w:tr>
       <w:tr>
@@ -5274,7 +4796,6 @@
               <w:left w:val="nil"/>
               <w:right w:val="single" w:sz="4" w:space="0" w:color="auto"/>
             </w:tcBorders>
-            <w:shd w:val="clear" w:color="auto" w:fill="auto"/>
             <w:vAlign w:val="center"/>
           </w:tcPr>
           <w:p>
@@ -5291,7 +4812,6 @@
               <w:left w:val="single" w:sz="4" w:space="0" w:color="auto"/>
               <w:right w:val="single" w:sz="4" w:space="0" w:color="auto"/>
             </w:tcBorders>
-            <w:shd w:val="clear" w:color="auto" w:fill="auto"/>
           </w:tcPr>
           <w:p>
             <w:r>
@@ -5307,11 +4827,8 @@
               <w:left w:val="single" w:sz="4" w:space="0" w:color="auto"/>
               <w:right w:val="single" w:sz="4" w:space="0" w:color="auto"/>
             </w:tcBorders>
-            <w:shd w:val="clear" w:color="auto" w:fill="auto"/>
-          </w:tcPr>
-          <w:p>
-            <w:r/>
-          </w:p>
+          </w:tcPr>
+          <w:p/>
         </w:tc>
         <w:tc>
           <w:tcPr>
@@ -5321,11 +4838,8 @@
               <w:left w:val="single" w:sz="4" w:space="0" w:color="auto"/>
               <w:right w:val="single" w:sz="4" w:space="0" w:color="auto"/>
             </w:tcBorders>
-            <w:shd w:val="clear" w:color="auto" w:fill="auto"/>
-          </w:tcPr>
-          <w:p>
-            <w:r/>
-          </w:p>
+          </w:tcPr>
+          <w:p/>
         </w:tc>
         <w:tc>
           <w:tcPr>
@@ -5335,11 +4849,8 @@
               <w:left w:val="single" w:sz="4" w:space="0" w:color="auto"/>
               <w:right w:val="single" w:sz="4" w:space="0" w:color="auto"/>
             </w:tcBorders>
-            <w:shd w:val="clear" w:color="auto" w:fill="auto"/>
-          </w:tcPr>
-          <w:p>
-            <w:r/>
-          </w:p>
+          </w:tcPr>
+          <w:p/>
         </w:tc>
         <w:tc>
           <w:tcPr>
@@ -5349,11 +4860,8 @@
               <w:left w:val="single" w:sz="4" w:space="0" w:color="auto"/>
               <w:right w:val="nil"/>
             </w:tcBorders>
-            <w:shd w:val="clear" w:color="auto" w:fill="auto"/>
-          </w:tcPr>
-          <w:p>
-            <w:r/>
-          </w:p>
+          </w:tcPr>
+          <w:p/>
         </w:tc>
       </w:tr>
       <w:tr>
@@ -5368,7 +4876,6 @@
               <w:left w:val="nil"/>
               <w:right w:val="single" w:sz="4" w:space="0" w:color="auto"/>
             </w:tcBorders>
-            <w:shd w:val="clear" w:color="auto" w:fill="auto"/>
             <w:vAlign w:val="center"/>
           </w:tcPr>
           <w:p>
@@ -5410,11 +4917,8 @@
               <w:left w:val="single" w:sz="4" w:space="0" w:color="auto"/>
               <w:right w:val="single" w:sz="4" w:space="0" w:color="auto"/>
             </w:tcBorders>
-            <w:shd w:val="clear" w:color="auto" w:fill="auto"/>
-          </w:tcPr>
-          <w:p>
-            <w:r/>
-          </w:p>
+          </w:tcPr>
+          <w:p/>
         </w:tc>
         <w:tc>
           <w:tcPr>
@@ -5424,7 +4928,6 @@
               <w:left w:val="single" w:sz="4" w:space="0" w:color="auto"/>
               <w:right w:val="single" w:sz="4" w:space="0" w:color="auto"/>
             </w:tcBorders>
-            <w:shd w:val="clear" w:color="auto" w:fill="auto"/>
           </w:tcPr>
           <w:p>
             <w:r>
@@ -5440,11 +4943,8 @@
               <w:left w:val="single" w:sz="4" w:space="0" w:color="auto"/>
               <w:right w:val="single" w:sz="4" w:space="0" w:color="auto"/>
             </w:tcBorders>
-            <w:shd w:val="clear" w:color="auto" w:fill="auto"/>
-          </w:tcPr>
-          <w:p>
-            <w:r/>
-          </w:p>
+          </w:tcPr>
+          <w:p/>
         </w:tc>
         <w:tc>
           <w:tcPr>
@@ -5454,11 +4954,8 @@
               <w:left w:val="single" w:sz="4" w:space="0" w:color="auto"/>
               <w:right w:val="single" w:sz="4" w:space="0" w:color="auto"/>
             </w:tcBorders>
-            <w:shd w:val="clear" w:color="auto" w:fill="auto"/>
-          </w:tcPr>
-          <w:p>
-            <w:r/>
-          </w:p>
+          </w:tcPr>
+          <w:p/>
         </w:tc>
         <w:tc>
           <w:tcPr>
@@ -5468,11 +4965,8 @@
               <w:left w:val="single" w:sz="4" w:space="0" w:color="auto"/>
               <w:right w:val="nil"/>
             </w:tcBorders>
-            <w:shd w:val="clear" w:color="auto" w:fill="auto"/>
-          </w:tcPr>
-          <w:p>
-            <w:r/>
-          </w:p>
+          </w:tcPr>
+          <w:p/>
         </w:tc>
       </w:tr>
       <w:tr>
@@ -5487,7 +4981,6 @@
               <w:left w:val="nil"/>
               <w:right w:val="single" w:sz="4" w:space="0" w:color="auto"/>
             </w:tcBorders>
-            <w:shd w:val="clear" w:color="auto" w:fill="auto"/>
             <w:vAlign w:val="center"/>
           </w:tcPr>
           <w:p>
@@ -5507,6 +5000,7 @@
           </w:p>
           <w:p>
             <w:r>
+              <w:lastRenderedPageBreak/>
               <w:t xml:space="preserve">  - relational, data warehouse and no SQL databases</w:t>
             </w:r>
           </w:p>
@@ -5549,11 +5043,8 @@
               <w:left w:val="single" w:sz="4" w:space="0" w:color="auto"/>
               <w:right w:val="single" w:sz="4" w:space="0" w:color="auto"/>
             </w:tcBorders>
-            <w:shd w:val="clear" w:color="auto" w:fill="auto"/>
-          </w:tcPr>
-          <w:p>
-            <w:r/>
-          </w:p>
+          </w:tcPr>
+          <w:p/>
         </w:tc>
         <w:tc>
           <w:tcPr>
@@ -5563,7 +5054,6 @@
               <w:left w:val="single" w:sz="4" w:space="0" w:color="auto"/>
               <w:right w:val="single" w:sz="4" w:space="0" w:color="auto"/>
             </w:tcBorders>
-            <w:shd w:val="clear" w:color="auto" w:fill="auto"/>
           </w:tcPr>
           <w:p>
             <w:r>
@@ -5579,11 +5069,8 @@
               <w:left w:val="single" w:sz="4" w:space="0" w:color="auto"/>
               <w:right w:val="single" w:sz="4" w:space="0" w:color="auto"/>
             </w:tcBorders>
-            <w:shd w:val="clear" w:color="auto" w:fill="auto"/>
-          </w:tcPr>
-          <w:p>
-            <w:r/>
-          </w:p>
+          </w:tcPr>
+          <w:p/>
         </w:tc>
         <w:tc>
           <w:tcPr>
@@ -5593,11 +5080,8 @@
               <w:left w:val="single" w:sz="4" w:space="0" w:color="auto"/>
               <w:right w:val="single" w:sz="4" w:space="0" w:color="auto"/>
             </w:tcBorders>
-            <w:shd w:val="clear" w:color="auto" w:fill="auto"/>
-          </w:tcPr>
-          <w:p>
-            <w:r/>
-          </w:p>
+          </w:tcPr>
+          <w:p/>
         </w:tc>
         <w:tc>
           <w:tcPr>
@@ -5607,11 +5091,8 @@
               <w:left w:val="single" w:sz="4" w:space="0" w:color="auto"/>
               <w:right w:val="nil"/>
             </w:tcBorders>
-            <w:shd w:val="clear" w:color="auto" w:fill="auto"/>
-          </w:tcPr>
-          <w:p>
-            <w:r/>
-          </w:p>
+          </w:tcPr>
+          <w:p/>
         </w:tc>
       </w:tr>
       <w:tr>
@@ -5626,7 +5107,6 @@
               <w:left w:val="nil"/>
               <w:right w:val="single" w:sz="4" w:space="0" w:color="auto"/>
             </w:tcBorders>
-            <w:shd w:val="clear" w:color="auto" w:fill="auto"/>
             <w:vAlign w:val="center"/>
           </w:tcPr>
           <w:p>
@@ -5643,11 +5123,8 @@
               <w:left w:val="single" w:sz="4" w:space="0" w:color="auto"/>
               <w:right w:val="single" w:sz="4" w:space="0" w:color="auto"/>
             </w:tcBorders>
-            <w:shd w:val="clear" w:color="auto" w:fill="auto"/>
-          </w:tcPr>
-          <w:p>
-            <w:r/>
-          </w:p>
+          </w:tcPr>
+          <w:p/>
         </w:tc>
         <w:tc>
           <w:tcPr>
@@ -5657,7 +5134,6 @@
               <w:left w:val="single" w:sz="4" w:space="0" w:color="auto"/>
               <w:right w:val="single" w:sz="4" w:space="0" w:color="auto"/>
             </w:tcBorders>
-            <w:shd w:val="clear" w:color="auto" w:fill="auto"/>
           </w:tcPr>
           <w:p>
             <w:r>
@@ -5673,11 +5149,8 @@
               <w:left w:val="single" w:sz="4" w:space="0" w:color="auto"/>
               <w:right w:val="single" w:sz="4" w:space="0" w:color="auto"/>
             </w:tcBorders>
-            <w:shd w:val="clear" w:color="auto" w:fill="auto"/>
-          </w:tcPr>
-          <w:p>
-            <w:r/>
-          </w:p>
+          </w:tcPr>
+          <w:p/>
         </w:tc>
         <w:tc>
           <w:tcPr>
@@ -5687,11 +5160,8 @@
               <w:left w:val="single" w:sz="4" w:space="0" w:color="auto"/>
               <w:right w:val="single" w:sz="4" w:space="0" w:color="auto"/>
             </w:tcBorders>
-            <w:shd w:val="clear" w:color="auto" w:fill="auto"/>
-          </w:tcPr>
-          <w:p>
-            <w:r/>
-          </w:p>
+          </w:tcPr>
+          <w:p/>
         </w:tc>
         <w:tc>
           <w:tcPr>
@@ -5701,11 +5171,8 @@
               <w:left w:val="single" w:sz="4" w:space="0" w:color="auto"/>
               <w:right w:val="nil"/>
             </w:tcBorders>
-            <w:shd w:val="clear" w:color="auto" w:fill="auto"/>
-          </w:tcPr>
-          <w:p>
-            <w:r/>
-          </w:p>
+          </w:tcPr>
+          <w:p/>
         </w:tc>
       </w:tr>
       <w:tr>
@@ -5720,7 +5187,6 @@
               <w:left w:val="nil"/>
               <w:right w:val="single" w:sz="4" w:space="0" w:color="auto"/>
             </w:tcBorders>
-            <w:shd w:val="clear" w:color="auto" w:fill="auto"/>
             <w:vAlign w:val="center"/>
           </w:tcPr>
           <w:p>
@@ -5737,11 +5203,8 @@
               <w:left w:val="single" w:sz="4" w:space="0" w:color="auto"/>
               <w:right w:val="single" w:sz="4" w:space="0" w:color="auto"/>
             </w:tcBorders>
-            <w:shd w:val="clear" w:color="auto" w:fill="auto"/>
-          </w:tcPr>
-          <w:p>
-            <w:r/>
-          </w:p>
+          </w:tcPr>
+          <w:p/>
         </w:tc>
         <w:tc>
           <w:tcPr>
@@ -5751,7 +5214,6 @@
               <w:left w:val="single" w:sz="4" w:space="0" w:color="auto"/>
               <w:right w:val="single" w:sz="4" w:space="0" w:color="auto"/>
             </w:tcBorders>
-            <w:shd w:val="clear" w:color="auto" w:fill="auto"/>
           </w:tcPr>
           <w:p>
             <w:r>
@@ -5767,11 +5229,8 @@
               <w:left w:val="single" w:sz="4" w:space="0" w:color="auto"/>
               <w:right w:val="single" w:sz="4" w:space="0" w:color="auto"/>
             </w:tcBorders>
-            <w:shd w:val="clear" w:color="auto" w:fill="auto"/>
-          </w:tcPr>
-          <w:p>
-            <w:r/>
-          </w:p>
+          </w:tcPr>
+          <w:p/>
         </w:tc>
         <w:tc>
           <w:tcPr>
@@ -5781,11 +5240,8 @@
               <w:left w:val="single" w:sz="4" w:space="0" w:color="auto"/>
               <w:right w:val="single" w:sz="4" w:space="0" w:color="auto"/>
             </w:tcBorders>
-            <w:shd w:val="clear" w:color="auto" w:fill="auto"/>
-          </w:tcPr>
-          <w:p>
-            <w:r/>
-          </w:p>
+          </w:tcPr>
+          <w:p/>
         </w:tc>
         <w:tc>
           <w:tcPr>
@@ -5795,11 +5251,8 @@
               <w:left w:val="single" w:sz="4" w:space="0" w:color="auto"/>
               <w:right w:val="nil"/>
             </w:tcBorders>
-            <w:shd w:val="clear" w:color="auto" w:fill="auto"/>
-          </w:tcPr>
-          <w:p>
-            <w:r/>
-          </w:p>
+          </w:tcPr>
+          <w:p/>
         </w:tc>
       </w:tr>
       <w:tr>
@@ -5814,7 +5267,6 @@
               <w:left w:val="nil"/>
               <w:right w:val="single" w:sz="4" w:space="0" w:color="auto"/>
             </w:tcBorders>
-            <w:shd w:val="clear" w:color="auto" w:fill="auto"/>
             <w:vAlign w:val="center"/>
           </w:tcPr>
           <w:p>
@@ -5841,11 +5293,8 @@
               <w:left w:val="single" w:sz="4" w:space="0" w:color="auto"/>
               <w:right w:val="single" w:sz="4" w:space="0" w:color="auto"/>
             </w:tcBorders>
-            <w:shd w:val="clear" w:color="auto" w:fill="auto"/>
-          </w:tcPr>
-          <w:p>
-            <w:r/>
-          </w:p>
+          </w:tcPr>
+          <w:p/>
         </w:tc>
         <w:tc>
           <w:tcPr>
@@ -5855,7 +5304,6 @@
               <w:left w:val="single" w:sz="4" w:space="0" w:color="auto"/>
               <w:right w:val="single" w:sz="4" w:space="0" w:color="auto"/>
             </w:tcBorders>
-            <w:shd w:val="clear" w:color="auto" w:fill="auto"/>
           </w:tcPr>
           <w:p>
             <w:r>
@@ -5871,11 +5319,8 @@
               <w:left w:val="single" w:sz="4" w:space="0" w:color="auto"/>
               <w:right w:val="single" w:sz="4" w:space="0" w:color="auto"/>
             </w:tcBorders>
-            <w:shd w:val="clear" w:color="auto" w:fill="auto"/>
-          </w:tcPr>
-          <w:p>
-            <w:r/>
-          </w:p>
+          </w:tcPr>
+          <w:p/>
         </w:tc>
         <w:tc>
           <w:tcPr>
@@ -5885,11 +5330,8 @@
               <w:left w:val="single" w:sz="4" w:space="0" w:color="auto"/>
               <w:right w:val="single" w:sz="4" w:space="0" w:color="auto"/>
             </w:tcBorders>
-            <w:shd w:val="clear" w:color="auto" w:fill="auto"/>
-          </w:tcPr>
-          <w:p>
-            <w:r/>
-          </w:p>
+          </w:tcPr>
+          <w:p/>
         </w:tc>
         <w:tc>
           <w:tcPr>
@@ -5899,11 +5341,8 @@
               <w:left w:val="single" w:sz="4" w:space="0" w:color="auto"/>
               <w:right w:val="nil"/>
             </w:tcBorders>
-            <w:shd w:val="clear" w:color="auto" w:fill="auto"/>
-          </w:tcPr>
-          <w:p>
-            <w:r/>
-          </w:p>
+          </w:tcPr>
+          <w:p/>
         </w:tc>
       </w:tr>
       <w:tr>
@@ -5918,7 +5357,6 @@
               <w:left w:val="nil"/>
               <w:right w:val="single" w:sz="4" w:space="0" w:color="auto"/>
             </w:tcBorders>
-            <w:shd w:val="clear" w:color="auto" w:fill="auto"/>
             <w:vAlign w:val="center"/>
           </w:tcPr>
           <w:p>
@@ -5935,11 +5373,8 @@
               <w:left w:val="single" w:sz="4" w:space="0" w:color="auto"/>
               <w:right w:val="single" w:sz="4" w:space="0" w:color="auto"/>
             </w:tcBorders>
-            <w:shd w:val="clear" w:color="auto" w:fill="auto"/>
-          </w:tcPr>
-          <w:p>
-            <w:r/>
-          </w:p>
+          </w:tcPr>
+          <w:p/>
         </w:tc>
         <w:tc>
           <w:tcPr>
@@ -5949,7 +5384,6 @@
               <w:left w:val="single" w:sz="4" w:space="0" w:color="auto"/>
               <w:right w:val="single" w:sz="4" w:space="0" w:color="auto"/>
             </w:tcBorders>
-            <w:shd w:val="clear" w:color="auto" w:fill="auto"/>
           </w:tcPr>
           <w:p>
             <w:r>
@@ -5965,11 +5399,8 @@
               <w:left w:val="single" w:sz="4" w:space="0" w:color="auto"/>
               <w:right w:val="single" w:sz="4" w:space="0" w:color="auto"/>
             </w:tcBorders>
-            <w:shd w:val="clear" w:color="auto" w:fill="auto"/>
-          </w:tcPr>
-          <w:p>
-            <w:r/>
-          </w:p>
+          </w:tcPr>
+          <w:p/>
         </w:tc>
         <w:tc>
           <w:tcPr>
@@ -5979,11 +5410,8 @@
               <w:left w:val="single" w:sz="4" w:space="0" w:color="auto"/>
               <w:right w:val="single" w:sz="4" w:space="0" w:color="auto"/>
             </w:tcBorders>
-            <w:shd w:val="clear" w:color="auto" w:fill="auto"/>
-          </w:tcPr>
-          <w:p>
-            <w:r/>
-          </w:p>
+          </w:tcPr>
+          <w:p/>
         </w:tc>
         <w:tc>
           <w:tcPr>
@@ -5993,11 +5421,8 @@
               <w:left w:val="single" w:sz="4" w:space="0" w:color="auto"/>
               <w:right w:val="nil"/>
             </w:tcBorders>
-            <w:shd w:val="clear" w:color="auto" w:fill="auto"/>
-          </w:tcPr>
-          <w:p>
-            <w:r/>
-          </w:p>
+          </w:tcPr>
+          <w:p/>
         </w:tc>
       </w:tr>
       <w:tr>
@@ -6012,7 +5437,6 @@
               <w:left w:val="nil"/>
               <w:right w:val="single" w:sz="4" w:space="0" w:color="auto"/>
             </w:tcBorders>
-            <w:shd w:val="clear" w:color="auto" w:fill="auto"/>
             <w:vAlign w:val="center"/>
           </w:tcPr>
           <w:p>
@@ -6044,7 +5468,6 @@
               <w:left w:val="single" w:sz="4" w:space="0" w:color="auto"/>
               <w:right w:val="single" w:sz="4" w:space="0" w:color="auto"/>
             </w:tcBorders>
-            <w:shd w:val="clear" w:color="auto" w:fill="auto"/>
           </w:tcPr>
           <w:p>
             <w:r>
@@ -6060,11 +5483,8 @@
               <w:left w:val="single" w:sz="4" w:space="0" w:color="auto"/>
               <w:right w:val="single" w:sz="4" w:space="0" w:color="auto"/>
             </w:tcBorders>
-            <w:shd w:val="clear" w:color="auto" w:fill="auto"/>
-          </w:tcPr>
-          <w:p>
-            <w:r/>
-          </w:p>
+          </w:tcPr>
+          <w:p/>
         </w:tc>
         <w:tc>
           <w:tcPr>
@@ -6074,11 +5494,8 @@
               <w:left w:val="single" w:sz="4" w:space="0" w:color="auto"/>
               <w:right w:val="single" w:sz="4" w:space="0" w:color="auto"/>
             </w:tcBorders>
-            <w:shd w:val="clear" w:color="auto" w:fill="auto"/>
-          </w:tcPr>
-          <w:p>
-            <w:r/>
-          </w:p>
+          </w:tcPr>
+          <w:p/>
         </w:tc>
         <w:tc>
           <w:tcPr>
@@ -6088,11 +5505,8 @@
               <w:left w:val="single" w:sz="4" w:space="0" w:color="auto"/>
               <w:right w:val="single" w:sz="4" w:space="0" w:color="auto"/>
             </w:tcBorders>
-            <w:shd w:val="clear" w:color="auto" w:fill="auto"/>
-          </w:tcPr>
-          <w:p>
-            <w:r/>
-          </w:p>
+          </w:tcPr>
+          <w:p/>
         </w:tc>
         <w:tc>
           <w:tcPr>
@@ -6102,11 +5516,8 @@
               <w:left w:val="single" w:sz="4" w:space="0" w:color="auto"/>
               <w:right w:val="nil"/>
             </w:tcBorders>
-            <w:shd w:val="clear" w:color="auto" w:fill="auto"/>
-          </w:tcPr>
-          <w:p>
-            <w:r/>
-          </w:p>
+          </w:tcPr>
+          <w:p/>
         </w:tc>
       </w:tr>
     </w:tbl>
@@ -6277,7 +5688,6 @@
               <w:bottom w:val="single" w:sz="4" w:space="0" w:color="auto"/>
               <w:right w:val="single" w:sz="4" w:space="0" w:color="auto"/>
             </w:tcBorders>
-            <w:shd w:val="clear" w:color="auto" w:fill="auto"/>
             <w:vAlign w:val="center"/>
           </w:tcPr>
           <w:p>
@@ -6307,7 +5717,6 @@
               <w:bottom w:val="single" w:sz="4" w:space="0" w:color="auto"/>
               <w:right w:val="single" w:sz="4" w:space="0" w:color="auto"/>
             </w:tcBorders>
-            <w:shd w:val="clear" w:color="auto" w:fill="auto"/>
             <w:vAlign w:val="center"/>
           </w:tcPr>
           <w:p>
@@ -6337,7 +5746,6 @@
               <w:bottom w:val="single" w:sz="4" w:space="0" w:color="auto"/>
               <w:right w:val="single" w:sz="4" w:space="0" w:color="auto"/>
             </w:tcBorders>
-            <w:shd w:val="clear" w:color="auto" w:fill="auto"/>
             <w:vAlign w:val="center"/>
           </w:tcPr>
           <w:p>
@@ -6367,7 +5775,6 @@
               <w:bottom w:val="single" w:sz="4" w:space="0" w:color="auto"/>
               <w:right w:val="single" w:sz="4" w:space="0" w:color="auto"/>
             </w:tcBorders>
-            <w:shd w:val="clear" w:color="auto" w:fill="auto"/>
             <w:vAlign w:val="center"/>
           </w:tcPr>
           <w:p>
@@ -6389,7 +5796,6 @@
               <w:bottom w:val="single" w:sz="4" w:space="0" w:color="auto"/>
               <w:right w:val="single" w:sz="4" w:space="0" w:color="auto"/>
             </w:tcBorders>
-            <w:shd w:val="clear" w:color="auto" w:fill="auto"/>
             <w:vAlign w:val="center"/>
           </w:tcPr>
           <w:p>
@@ -6411,7 +5817,6 @@
               <w:bottom w:val="single" w:sz="4" w:space="0" w:color="auto"/>
               <w:right w:val="single" w:sz="4" w:space="0" w:color="auto"/>
             </w:tcBorders>
-            <w:shd w:val="clear" w:color="auto" w:fill="auto"/>
             <w:vAlign w:val="center"/>
           </w:tcPr>
           <w:p>
@@ -6433,7 +5838,6 @@
               <w:bottom w:val="single" w:sz="4" w:space="0" w:color="auto"/>
               <w:right w:val="single" w:sz="4" w:space="0" w:color="auto"/>
             </w:tcBorders>
-            <w:shd w:val="clear" w:color="auto" w:fill="auto"/>
             <w:vAlign w:val="center"/>
           </w:tcPr>
           <w:p>
@@ -6455,7 +5859,6 @@
               <w:bottom w:val="single" w:sz="4" w:space="0" w:color="auto"/>
               <w:right w:val="nil"/>
             </w:tcBorders>
-            <w:shd w:val="clear" w:color="auto" w:fill="auto"/>
             <w:vAlign w:val="center"/>
           </w:tcPr>
           <w:p>
@@ -6481,7 +5884,6 @@
               <w:left w:val="nil"/>
               <w:right w:val="single" w:sz="4" w:space="0" w:color="auto"/>
             </w:tcBorders>
-            <w:shd w:val="clear" w:color="auto" w:fill="auto"/>
           </w:tcPr>
           <w:p>
             <w:r>
@@ -6497,11 +5899,8 @@
               <w:left w:val="single" w:sz="4" w:space="0" w:color="auto"/>
               <w:right w:val="single" w:sz="4" w:space="0" w:color="auto"/>
             </w:tcBorders>
-            <w:shd w:val="clear" w:color="auto" w:fill="auto"/>
-          </w:tcPr>
-          <w:p>
-            <w:r/>
-          </w:p>
+          </w:tcPr>
+          <w:p/>
         </w:tc>
         <w:tc>
           <w:tcPr>
@@ -6511,7 +5910,6 @@
               <w:left w:val="single" w:sz="4" w:space="0" w:color="auto"/>
               <w:right w:val="single" w:sz="4" w:space="0" w:color="auto"/>
             </w:tcBorders>
-            <w:shd w:val="clear" w:color="auto" w:fill="auto"/>
           </w:tcPr>
           <w:p>
             <w:r>
@@ -6526,11 +5924,8 @@
               <w:left w:val="single" w:sz="4" w:space="0" w:color="auto"/>
               <w:right w:val="single" w:sz="4" w:space="0" w:color="auto"/>
             </w:tcBorders>
-            <w:shd w:val="clear" w:color="auto" w:fill="auto"/>
-          </w:tcPr>
-          <w:p>
-            <w:r/>
-          </w:p>
+          </w:tcPr>
+          <w:p/>
         </w:tc>
         <w:tc>
           <w:tcPr>
@@ -6539,7 +5934,6 @@
               <w:left w:val="single" w:sz="4" w:space="0" w:color="auto"/>
               <w:right w:val="single" w:sz="4" w:space="0" w:color="auto"/>
             </w:tcBorders>
-            <w:shd w:val="clear" w:color="auto" w:fill="auto"/>
           </w:tcPr>
           <w:p>
             <w:r>
@@ -6554,7 +5948,6 @@
               <w:left w:val="single" w:sz="4" w:space="0" w:color="auto"/>
               <w:right w:val="single" w:sz="4" w:space="0" w:color="auto"/>
             </w:tcBorders>
-            <w:shd w:val="clear" w:color="auto" w:fill="auto"/>
           </w:tcPr>
           <w:p>
             <w:r>
@@ -6569,11 +5962,8 @@
               <w:left w:val="single" w:sz="4" w:space="0" w:color="auto"/>
               <w:right w:val="single" w:sz="4" w:space="0" w:color="auto"/>
             </w:tcBorders>
-            <w:shd w:val="clear" w:color="auto" w:fill="auto"/>
-          </w:tcPr>
-          <w:p>
-            <w:r/>
-          </w:p>
+          </w:tcPr>
+          <w:p/>
         </w:tc>
         <w:tc>
           <w:tcPr>
@@ -6582,11 +5972,8 @@
               <w:left w:val="single" w:sz="4" w:space="0" w:color="auto"/>
               <w:right w:val="nil"/>
             </w:tcBorders>
-            <w:shd w:val="clear" w:color="auto" w:fill="auto"/>
-          </w:tcPr>
-          <w:p>
-            <w:r/>
-          </w:p>
+          </w:tcPr>
+          <w:p/>
         </w:tc>
       </w:tr>
       <w:tr>
@@ -6601,7 +5988,6 @@
               <w:left w:val="nil"/>
               <w:right w:val="single" w:sz="4" w:space="0" w:color="auto"/>
             </w:tcBorders>
-            <w:shd w:val="clear" w:color="auto" w:fill="auto"/>
           </w:tcPr>
           <w:p>
             <w:r>
@@ -6617,11 +6003,8 @@
               <w:left w:val="single" w:sz="4" w:space="0" w:color="auto"/>
               <w:right w:val="single" w:sz="4" w:space="0" w:color="auto"/>
             </w:tcBorders>
-            <w:shd w:val="clear" w:color="auto" w:fill="auto"/>
-          </w:tcPr>
-          <w:p>
-            <w:r/>
-          </w:p>
+          </w:tcPr>
+          <w:p/>
         </w:tc>
         <w:tc>
           <w:tcPr>
@@ -6631,7 +6014,6 @@
               <w:left w:val="single" w:sz="4" w:space="0" w:color="auto"/>
               <w:right w:val="single" w:sz="4" w:space="0" w:color="auto"/>
             </w:tcBorders>
-            <w:shd w:val="clear" w:color="auto" w:fill="auto"/>
           </w:tcPr>
           <w:p>
             <w:r>
@@ -6646,11 +6028,8 @@
               <w:left w:val="single" w:sz="4" w:space="0" w:color="auto"/>
               <w:right w:val="single" w:sz="4" w:space="0" w:color="auto"/>
             </w:tcBorders>
-            <w:shd w:val="clear" w:color="auto" w:fill="auto"/>
-          </w:tcPr>
-          <w:p>
-            <w:r/>
-          </w:p>
+          </w:tcPr>
+          <w:p/>
         </w:tc>
         <w:tc>
           <w:tcPr>
@@ -6659,7 +6038,6 @@
               <w:left w:val="single" w:sz="4" w:space="0" w:color="auto"/>
               <w:right w:val="single" w:sz="4" w:space="0" w:color="auto"/>
             </w:tcBorders>
-            <w:shd w:val="clear" w:color="auto" w:fill="auto"/>
           </w:tcPr>
           <w:p>
             <w:r>
@@ -6674,7 +6052,6 @@
               <w:left w:val="single" w:sz="4" w:space="0" w:color="auto"/>
               <w:right w:val="single" w:sz="4" w:space="0" w:color="auto"/>
             </w:tcBorders>
-            <w:shd w:val="clear" w:color="auto" w:fill="auto"/>
           </w:tcPr>
           <w:p>
             <w:r>
@@ -6689,11 +6066,8 @@
               <w:left w:val="single" w:sz="4" w:space="0" w:color="auto"/>
               <w:right w:val="single" w:sz="4" w:space="0" w:color="auto"/>
             </w:tcBorders>
-            <w:shd w:val="clear" w:color="auto" w:fill="auto"/>
-          </w:tcPr>
-          <w:p>
-            <w:r/>
-          </w:p>
+          </w:tcPr>
+          <w:p/>
         </w:tc>
         <w:tc>
           <w:tcPr>
@@ -6702,11 +6076,8 @@
               <w:left w:val="single" w:sz="4" w:space="0" w:color="auto"/>
               <w:right w:val="nil"/>
             </w:tcBorders>
-            <w:shd w:val="clear" w:color="auto" w:fill="auto"/>
-          </w:tcPr>
-          <w:p>
-            <w:r/>
-          </w:p>
+          </w:tcPr>
+          <w:p/>
         </w:tc>
       </w:tr>
       <w:tr>
@@ -6721,10 +6092,10 @@
               <w:left w:val="nil"/>
               <w:right w:val="single" w:sz="4" w:space="0" w:color="auto"/>
             </w:tcBorders>
-            <w:shd w:val="clear" w:color="auto" w:fill="auto"/>
-          </w:tcPr>
-          <w:p>
-            <w:r>
+          </w:tcPr>
+          <w:p>
+            <w:r>
+              <w:lastRenderedPageBreak/>
               <w:t>Learning</w:t>
             </w:r>
           </w:p>
@@ -6737,11 +6108,8 @@
               <w:left w:val="single" w:sz="4" w:space="0" w:color="auto"/>
               <w:right w:val="single" w:sz="4" w:space="0" w:color="auto"/>
             </w:tcBorders>
-            <w:shd w:val="clear" w:color="auto" w:fill="auto"/>
-          </w:tcPr>
-          <w:p>
-            <w:r/>
-          </w:p>
+          </w:tcPr>
+          <w:p/>
         </w:tc>
         <w:tc>
           <w:tcPr>
@@ -6751,7 +6119,6 @@
               <w:left w:val="single" w:sz="4" w:space="0" w:color="auto"/>
               <w:right w:val="single" w:sz="4" w:space="0" w:color="auto"/>
             </w:tcBorders>
-            <w:shd w:val="clear" w:color="auto" w:fill="auto"/>
           </w:tcPr>
           <w:p>
             <w:r>
@@ -6766,11 +6133,8 @@
               <w:left w:val="single" w:sz="4" w:space="0" w:color="auto"/>
               <w:right w:val="single" w:sz="4" w:space="0" w:color="auto"/>
             </w:tcBorders>
-            <w:shd w:val="clear" w:color="auto" w:fill="auto"/>
-          </w:tcPr>
-          <w:p>
-            <w:r/>
-          </w:p>
+          </w:tcPr>
+          <w:p/>
         </w:tc>
         <w:tc>
           <w:tcPr>
@@ -6779,7 +6143,6 @@
               <w:left w:val="single" w:sz="4" w:space="0" w:color="auto"/>
               <w:right w:val="single" w:sz="4" w:space="0" w:color="auto"/>
             </w:tcBorders>
-            <w:shd w:val="clear" w:color="auto" w:fill="auto"/>
           </w:tcPr>
           <w:p>
             <w:r>
@@ -6794,7 +6157,6 @@
               <w:left w:val="single" w:sz="4" w:space="0" w:color="auto"/>
               <w:right w:val="single" w:sz="4" w:space="0" w:color="auto"/>
             </w:tcBorders>
-            <w:shd w:val="clear" w:color="auto" w:fill="auto"/>
           </w:tcPr>
           <w:p>
             <w:r>
@@ -6809,11 +6171,8 @@
               <w:left w:val="single" w:sz="4" w:space="0" w:color="auto"/>
               <w:right w:val="single" w:sz="4" w:space="0" w:color="auto"/>
             </w:tcBorders>
-            <w:shd w:val="clear" w:color="auto" w:fill="auto"/>
-          </w:tcPr>
-          <w:p>
-            <w:r/>
-          </w:p>
+          </w:tcPr>
+          <w:p/>
         </w:tc>
         <w:tc>
           <w:tcPr>
@@ -6822,11 +6181,8 @@
               <w:left w:val="single" w:sz="4" w:space="0" w:color="auto"/>
               <w:right w:val="nil"/>
             </w:tcBorders>
-            <w:shd w:val="clear" w:color="auto" w:fill="auto"/>
-          </w:tcPr>
-          <w:p>
-            <w:r/>
-          </w:p>
+          </w:tcPr>
+          <w:p/>
         </w:tc>
       </w:tr>
       <w:tr>
@@ -6841,7 +6197,6 @@
               <w:left w:val="nil"/>
               <w:right w:val="single" w:sz="4" w:space="0" w:color="auto"/>
             </w:tcBorders>
-            <w:shd w:val="clear" w:color="auto" w:fill="auto"/>
           </w:tcPr>
           <w:p>
             <w:r>
@@ -6857,11 +6212,8 @@
               <w:left w:val="single" w:sz="4" w:space="0" w:color="auto"/>
               <w:right w:val="single" w:sz="4" w:space="0" w:color="auto"/>
             </w:tcBorders>
-            <w:shd w:val="clear" w:color="auto" w:fill="auto"/>
-          </w:tcPr>
-          <w:p>
-            <w:r/>
-          </w:p>
+          </w:tcPr>
+          <w:p/>
         </w:tc>
         <w:tc>
           <w:tcPr>
@@ -6871,7 +6223,6 @@
               <w:left w:val="single" w:sz="4" w:space="0" w:color="auto"/>
               <w:right w:val="single" w:sz="4" w:space="0" w:color="auto"/>
             </w:tcBorders>
-            <w:shd w:val="clear" w:color="auto" w:fill="auto"/>
           </w:tcPr>
           <w:p>
             <w:r>
@@ -6886,11 +6237,8 @@
               <w:left w:val="single" w:sz="4" w:space="0" w:color="auto"/>
               <w:right w:val="single" w:sz="4" w:space="0" w:color="auto"/>
             </w:tcBorders>
-            <w:shd w:val="clear" w:color="auto" w:fill="auto"/>
-          </w:tcPr>
-          <w:p>
-            <w:r/>
-          </w:p>
+          </w:tcPr>
+          <w:p/>
         </w:tc>
         <w:tc>
           <w:tcPr>
@@ -6899,7 +6247,6 @@
               <w:left w:val="single" w:sz="4" w:space="0" w:color="auto"/>
               <w:right w:val="single" w:sz="4" w:space="0" w:color="auto"/>
             </w:tcBorders>
-            <w:shd w:val="clear" w:color="auto" w:fill="auto"/>
           </w:tcPr>
           <w:p>
             <w:r>
@@ -6914,7 +6261,6 @@
               <w:left w:val="single" w:sz="4" w:space="0" w:color="auto"/>
               <w:right w:val="single" w:sz="4" w:space="0" w:color="auto"/>
             </w:tcBorders>
-            <w:shd w:val="clear" w:color="auto" w:fill="auto"/>
           </w:tcPr>
           <w:p>
             <w:r>
@@ -6929,11 +6275,8 @@
               <w:left w:val="single" w:sz="4" w:space="0" w:color="auto"/>
               <w:right w:val="single" w:sz="4" w:space="0" w:color="auto"/>
             </w:tcBorders>
-            <w:shd w:val="clear" w:color="auto" w:fill="auto"/>
-          </w:tcPr>
-          <w:p>
-            <w:r/>
-          </w:p>
+          </w:tcPr>
+          <w:p/>
         </w:tc>
         <w:tc>
           <w:tcPr>
@@ -6942,11 +6285,8 @@
               <w:left w:val="single" w:sz="4" w:space="0" w:color="auto"/>
               <w:right w:val="nil"/>
             </w:tcBorders>
-            <w:shd w:val="clear" w:color="auto" w:fill="auto"/>
-          </w:tcPr>
-          <w:p>
-            <w:r/>
-          </w:p>
+          </w:tcPr>
+          <w:p/>
         </w:tc>
       </w:tr>
       <w:tr>
@@ -6961,7 +6301,6 @@
               <w:left w:val="nil"/>
               <w:right w:val="single" w:sz="4" w:space="0" w:color="auto"/>
             </w:tcBorders>
-            <w:shd w:val="clear" w:color="auto" w:fill="auto"/>
           </w:tcPr>
           <w:p>
             <w:r>
@@ -6977,11 +6316,8 @@
               <w:left w:val="single" w:sz="4" w:space="0" w:color="auto"/>
               <w:right w:val="single" w:sz="4" w:space="0" w:color="auto"/>
             </w:tcBorders>
-            <w:shd w:val="clear" w:color="auto" w:fill="auto"/>
-          </w:tcPr>
-          <w:p>
-            <w:r/>
-          </w:p>
+          </w:tcPr>
+          <w:p/>
         </w:tc>
         <w:tc>
           <w:tcPr>
@@ -6991,7 +6327,6 @@
               <w:left w:val="single" w:sz="4" w:space="0" w:color="auto"/>
               <w:right w:val="single" w:sz="4" w:space="0" w:color="auto"/>
             </w:tcBorders>
-            <w:shd w:val="clear" w:color="auto" w:fill="auto"/>
           </w:tcPr>
           <w:p>
             <w:r>
@@ -7006,11 +6341,8 @@
               <w:left w:val="single" w:sz="4" w:space="0" w:color="auto"/>
               <w:right w:val="single" w:sz="4" w:space="0" w:color="auto"/>
             </w:tcBorders>
-            <w:shd w:val="clear" w:color="auto" w:fill="auto"/>
-          </w:tcPr>
-          <w:p>
-            <w:r/>
-          </w:p>
+          </w:tcPr>
+          <w:p/>
         </w:tc>
         <w:tc>
           <w:tcPr>
@@ -7019,7 +6351,6 @@
               <w:left w:val="single" w:sz="4" w:space="0" w:color="auto"/>
               <w:right w:val="single" w:sz="4" w:space="0" w:color="auto"/>
             </w:tcBorders>
-            <w:shd w:val="clear" w:color="auto" w:fill="auto"/>
           </w:tcPr>
           <w:p>
             <w:r>
@@ -7034,7 +6365,6 @@
               <w:left w:val="single" w:sz="4" w:space="0" w:color="auto"/>
               <w:right w:val="single" w:sz="4" w:space="0" w:color="auto"/>
             </w:tcBorders>
-            <w:shd w:val="clear" w:color="auto" w:fill="auto"/>
           </w:tcPr>
           <w:p>
             <w:r>
@@ -7049,11 +6379,8 @@
               <w:left w:val="single" w:sz="4" w:space="0" w:color="auto"/>
               <w:right w:val="single" w:sz="4" w:space="0" w:color="auto"/>
             </w:tcBorders>
-            <w:shd w:val="clear" w:color="auto" w:fill="auto"/>
-          </w:tcPr>
-          <w:p>
-            <w:r/>
-          </w:p>
+          </w:tcPr>
+          <w:p/>
         </w:tc>
         <w:tc>
           <w:tcPr>
@@ -7062,11 +6389,8 @@
               <w:left w:val="single" w:sz="4" w:space="0" w:color="auto"/>
               <w:right w:val="nil"/>
             </w:tcBorders>
-            <w:shd w:val="clear" w:color="auto" w:fill="auto"/>
-          </w:tcPr>
-          <w:p>
-            <w:r/>
-          </w:p>
+          </w:tcPr>
+          <w:p/>
         </w:tc>
       </w:tr>
     </w:tbl>
@@ -7090,7 +6414,7 @@
 </file>
 
 <file path=word/endnotes.xml><?xml version="1.0" encoding="utf-8"?>
-<w:endnotes xmlns:wpc="http://schemas.microsoft.com/office/word/2010/wordprocessingCanvas" xmlns:cx="http://schemas.microsoft.com/office/drawing/2014/chartex" xmlns:cx1="http://schemas.microsoft.com/office/drawing/2015/9/8/chartex" xmlns:cx2="http://schemas.microsoft.com/office/drawing/2015/10/21/chartex" xmlns:cx3="http://schemas.microsoft.com/office/drawing/2016/5/9/chartex" xmlns:cx4="http://schemas.microsoft.com/office/drawing/2016/5/10/chartex" xmlns:cx5="http://schemas.microsoft.com/office/drawing/2016/5/11/chartex" xmlns:cx6="http://schemas.microsoft.com/office/drawing/2016/5/12/chartex" xmlns:cx7="http://schemas.microsoft.com/office/drawing/2016/5/13/chartex" xmlns:cx8="http://schemas.microsoft.com/office/drawing/2016/5/14/chartex" xmlns:mc="http://schemas.openxmlformats.org/markup-compatibility/2006" xmlns:aink="http://schemas.microsoft.com/office/drawing/2016/ink" xmlns:am3d="http://schemas.microsoft.com/office/drawing/2017/model3d" xmlns:o="urn:schemas-microsoft-com:office:office" xmlns:oel="http://schemas.microsoft.com/office/2019/extlst" xmlns:r="http://schemas.openxmlformats.org/officeDocument/2006/relationships" xmlns:m="http://schemas.openxmlformats.org/officeDocument/2006/math" xmlns:v="urn:schemas-microsoft-com:vml" xmlns:wp14="http://schemas.microsoft.com/office/word/2010/wordprocessingDrawing" xmlns:wp="http://schemas.openxmlformats.org/drawingml/2006/wordprocessingDrawing" xmlns:w10="urn:schemas-microsoft-com:office:word" xmlns:w="http://schemas.openxmlformats.org/wordprocessingml/2006/main" xmlns:w14="http://schemas.microsoft.com/office/word/2010/wordml" xmlns:w15="http://schemas.microsoft.com/office/word/2012/wordml" xmlns:w16cex="http://schemas.microsoft.com/office/word/2018/wordml/cex" xmlns:w16cid="http://schemas.microsoft.com/office/word/2016/wordml/cid" xmlns:w16="http://schemas.microsoft.com/office/word/2018/wordml" xmlns:w16sdtdh="http://schemas.microsoft.com/office/word/2020/wordml/sdtdatahash" xmlns:w16se="http://schemas.microsoft.com/office/word/2015/wordml/symex" xmlns:wpg="http://schemas.microsoft.com/office/word/2010/wordprocessingGroup" xmlns:wpi="http://schemas.microsoft.com/office/word/2010/wordprocessingInk" xmlns:wne="http://schemas.microsoft.com/office/word/2006/wordml" xmlns:wps="http://schemas.microsoft.com/office/word/2010/wordprocessingShape" mc:Ignorable="w14 w15 w16se w16cid w16 w16cex w16sdtdh wp14">
+<w:endnotes xmlns:wpc="http://schemas.microsoft.com/office/word/2010/wordprocessingCanvas" xmlns:cx="http://schemas.microsoft.com/office/drawing/2014/chartex" xmlns:cx1="http://schemas.microsoft.com/office/drawing/2015/9/8/chartex" xmlns:cx2="http://schemas.microsoft.com/office/drawing/2015/10/21/chartex" xmlns:cx3="http://schemas.microsoft.com/office/drawing/2016/5/9/chartex" xmlns:cx4="http://schemas.microsoft.com/office/drawing/2016/5/10/chartex" xmlns:cx5="http://schemas.microsoft.com/office/drawing/2016/5/11/chartex" xmlns:cx6="http://schemas.microsoft.com/office/drawing/2016/5/12/chartex" xmlns:cx7="http://schemas.microsoft.com/office/drawing/2016/5/13/chartex" xmlns:cx8="http://schemas.microsoft.com/office/drawing/2016/5/14/chartex" xmlns:mc="http://schemas.openxmlformats.org/markup-compatibility/2006" xmlns:m="http://schemas.openxmlformats.org/officeDocument/2006/math" xmlns:aink="http://schemas.microsoft.com/office/drawing/2016/ink" xmlns:am3d="http://schemas.microsoft.com/office/drawing/2017/model3d" xmlns:oel="http://schemas.microsoft.com/office/2019/extlst" xmlns:r="http://schemas.openxmlformats.org/officeDocument/2006/relationships" xmlns:wp14="http://schemas.microsoft.com/office/word/2010/wordprocessingDrawing" xmlns:wp="http://schemas.openxmlformats.org/drawingml/2006/wordprocessingDrawing" xmlns:wpg="http://schemas.microsoft.com/office/word/2010/wordprocessingGroup" xmlns:wpi="http://schemas.microsoft.com/office/word/2010/wordprocessingInk" xmlns:wps="http://schemas.microsoft.com/office/word/2010/wordprocessingShape" xmlns:o="urn:schemas-microsoft-com:office:office" xmlns:v="urn:schemas-microsoft-com:vml" xmlns:w10="urn:schemas-microsoft-com:office:word" xmlns:w="http://schemas.openxmlformats.org/wordprocessingml/2006/main" xmlns:w14="http://schemas.microsoft.com/office/word/2010/wordml" xmlns:w15="http://schemas.microsoft.com/office/word/2012/wordml" xmlns:w16cex="http://schemas.microsoft.com/office/word/2018/wordml/cex" xmlns:w16cid="http://schemas.microsoft.com/office/word/2016/wordml/cid" xmlns:w16="http://schemas.microsoft.com/office/word/2018/wordml" xmlns:w16sdtdh="http://schemas.microsoft.com/office/word/2020/wordml/sdtdatahash" xmlns:w16sdtfl="http://schemas.microsoft.com/office/word/2024/wordml/sdtformatlock" xmlns:w16se="http://schemas.microsoft.com/office/word/2015/wordml/symex" xmlns:w16du="http://schemas.microsoft.com/office/word/2023/wordml/word16du" xmlns:wne="http://schemas.microsoft.com/office/word/2006/wordml" mc:Ignorable="w14 w15 w16se w16cid w16 w16cex w16sdtdh w16sdtfl w16du wp14">
   <w:endnote w:type="separator" w:id="-1">
     <w:p>
       <w:r>
@@ -7109,7 +6433,7 @@
 </file>
 
 <file path=word/footer1.xml><?xml version="1.0" encoding="utf-8"?>
-<w:ftr xmlns:wpc="http://schemas.microsoft.com/office/word/2010/wordprocessingCanvas" xmlns:cx="http://schemas.microsoft.com/office/drawing/2014/chartex" xmlns:cx1="http://schemas.microsoft.com/office/drawing/2015/9/8/chartex" xmlns:cx2="http://schemas.microsoft.com/office/drawing/2015/10/21/chartex" xmlns:cx3="http://schemas.microsoft.com/office/drawing/2016/5/9/chartex" xmlns:cx4="http://schemas.microsoft.com/office/drawing/2016/5/10/chartex" xmlns:cx5="http://schemas.microsoft.com/office/drawing/2016/5/11/chartex" xmlns:cx6="http://schemas.microsoft.com/office/drawing/2016/5/12/chartex" xmlns:cx7="http://schemas.microsoft.com/office/drawing/2016/5/13/chartex" xmlns:cx8="http://schemas.microsoft.com/office/drawing/2016/5/14/chartex" xmlns:mc="http://schemas.openxmlformats.org/markup-compatibility/2006" xmlns:aink="http://schemas.microsoft.com/office/drawing/2016/ink" xmlns:am3d="http://schemas.microsoft.com/office/drawing/2017/model3d" xmlns:o="urn:schemas-microsoft-com:office:office" xmlns:oel="http://schemas.microsoft.com/office/2019/extlst" xmlns:r="http://schemas.openxmlformats.org/officeDocument/2006/relationships" xmlns:m="http://schemas.openxmlformats.org/officeDocument/2006/math" xmlns:v="urn:schemas-microsoft-com:vml" xmlns:wp14="http://schemas.microsoft.com/office/word/2010/wordprocessingDrawing" xmlns:wp="http://schemas.openxmlformats.org/drawingml/2006/wordprocessingDrawing" xmlns:w10="urn:schemas-microsoft-com:office:word" xmlns:w="http://schemas.openxmlformats.org/wordprocessingml/2006/main" xmlns:w14="http://schemas.microsoft.com/office/word/2010/wordml" xmlns:w15="http://schemas.microsoft.com/office/word/2012/wordml" xmlns:w16cex="http://schemas.microsoft.com/office/word/2018/wordml/cex" xmlns:w16cid="http://schemas.microsoft.com/office/word/2016/wordml/cid" xmlns:w16="http://schemas.microsoft.com/office/word/2018/wordml" xmlns:w16sdtdh="http://schemas.microsoft.com/office/word/2020/wordml/sdtdatahash" xmlns:w16se="http://schemas.microsoft.com/office/word/2015/wordml/symex" xmlns:wpg="http://schemas.microsoft.com/office/word/2010/wordprocessingGroup" xmlns:wpi="http://schemas.microsoft.com/office/word/2010/wordprocessingInk" xmlns:wne="http://schemas.microsoft.com/office/word/2006/wordml" xmlns:wps="http://schemas.microsoft.com/office/word/2010/wordprocessingShape" mc:Ignorable="w14 w15 w16se w16cid w16 w16cex w16sdtdh wp14">
+<w:ftr xmlns:wpc="http://schemas.microsoft.com/office/word/2010/wordprocessingCanvas" xmlns:cx="http://schemas.microsoft.com/office/drawing/2014/chartex" xmlns:cx1="http://schemas.microsoft.com/office/drawing/2015/9/8/chartex" xmlns:cx2="http://schemas.microsoft.com/office/drawing/2015/10/21/chartex" xmlns:cx3="http://schemas.microsoft.com/office/drawing/2016/5/9/chartex" xmlns:cx4="http://schemas.microsoft.com/office/drawing/2016/5/10/chartex" xmlns:cx5="http://schemas.microsoft.com/office/drawing/2016/5/11/chartex" xmlns:cx6="http://schemas.microsoft.com/office/drawing/2016/5/12/chartex" xmlns:cx7="http://schemas.microsoft.com/office/drawing/2016/5/13/chartex" xmlns:cx8="http://schemas.microsoft.com/office/drawing/2016/5/14/chartex" xmlns:mc="http://schemas.openxmlformats.org/markup-compatibility/2006" xmlns:m="http://schemas.openxmlformats.org/officeDocument/2006/math" xmlns:aink="http://schemas.microsoft.com/office/drawing/2016/ink" xmlns:am3d="http://schemas.microsoft.com/office/drawing/2017/model3d" xmlns:oel="http://schemas.microsoft.com/office/2019/extlst" xmlns:r="http://schemas.openxmlformats.org/officeDocument/2006/relationships" xmlns:wp14="http://schemas.microsoft.com/office/word/2010/wordprocessingDrawing" xmlns:wp="http://schemas.openxmlformats.org/drawingml/2006/wordprocessingDrawing" xmlns:wpg="http://schemas.microsoft.com/office/word/2010/wordprocessingGroup" xmlns:wpi="http://schemas.microsoft.com/office/word/2010/wordprocessingInk" xmlns:wps="http://schemas.microsoft.com/office/word/2010/wordprocessingShape" xmlns:o="urn:schemas-microsoft-com:office:office" xmlns:v="urn:schemas-microsoft-com:vml" xmlns:w10="urn:schemas-microsoft-com:office:word" xmlns:w="http://schemas.openxmlformats.org/wordprocessingml/2006/main" xmlns:w14="http://schemas.microsoft.com/office/word/2010/wordml" xmlns:w15="http://schemas.microsoft.com/office/word/2012/wordml" xmlns:w16cex="http://schemas.microsoft.com/office/word/2018/wordml/cex" xmlns:w16cid="http://schemas.microsoft.com/office/word/2016/wordml/cid" xmlns:w16="http://schemas.microsoft.com/office/word/2018/wordml" xmlns:w16sdtdh="http://schemas.microsoft.com/office/word/2020/wordml/sdtdatahash" xmlns:w16sdtfl="http://schemas.microsoft.com/office/word/2024/wordml/sdtformatlock" xmlns:w16se="http://schemas.microsoft.com/office/word/2015/wordml/symex" xmlns:w16du="http://schemas.microsoft.com/office/word/2023/wordml/word16du" xmlns:wne="http://schemas.microsoft.com/office/word/2006/wordml" mc:Ignorable="w14 w15 w16se w16cid w16 w16cex w16sdtdh w16sdtfl w16du wp14">
   <w:p>
     <w:pPr>
       <w:pStyle w:val="Footer"/>
@@ -7142,14 +6466,13 @@
     <w:r>
       <w:t>0</w:t>
     </w:r>
+    <w:proofErr w:type="gramStart"/>
     <w:r>
-      <w:t xml:space="preserve">   (Template Version 1.</w:t>
+      <w:t xml:space="preserve">   (</w:t>
     </w:r>
+    <w:proofErr w:type="gramEnd"/>
     <w:r>
-      <w:t>1</w:t>
-    </w:r>
-    <w:r>
-      <w:t>)</w:t>
+      <w:t>Template Version 1.1)</w:t>
     </w:r>
     <w:r>
       <w:tab/>
@@ -7168,7 +6491,7 @@
       <w:rPr>
         <w:noProof/>
       </w:rPr>
-      <w:t>9 February 2022</w:t>
+      <w:t>13 March 2024</w:t>
     </w:r>
     <w:r>
       <w:fldChar w:fldCharType="end"/>
@@ -7211,7 +6534,7 @@
 </file>
 
 <file path=word/footnotes.xml><?xml version="1.0" encoding="utf-8"?>
-<w:footnotes xmlns:wpc="http://schemas.microsoft.com/office/word/2010/wordprocessingCanvas" xmlns:cx="http://schemas.microsoft.com/office/drawing/2014/chartex" xmlns:cx1="http://schemas.microsoft.com/office/drawing/2015/9/8/chartex" xmlns:cx2="http://schemas.microsoft.com/office/drawing/2015/10/21/chartex" xmlns:cx3="http://schemas.microsoft.com/office/drawing/2016/5/9/chartex" xmlns:cx4="http://schemas.microsoft.com/office/drawing/2016/5/10/chartex" xmlns:cx5="http://schemas.microsoft.com/office/drawing/2016/5/11/chartex" xmlns:cx6="http://schemas.microsoft.com/office/drawing/2016/5/12/chartex" xmlns:cx7="http://schemas.microsoft.com/office/drawing/2016/5/13/chartex" xmlns:cx8="http://schemas.microsoft.com/office/drawing/2016/5/14/chartex" xmlns:mc="http://schemas.openxmlformats.org/markup-compatibility/2006" xmlns:aink="http://schemas.microsoft.com/office/drawing/2016/ink" xmlns:am3d="http://schemas.microsoft.com/office/drawing/2017/model3d" xmlns:o="urn:schemas-microsoft-com:office:office" xmlns:oel="http://schemas.microsoft.com/office/2019/extlst" xmlns:r="http://schemas.openxmlformats.org/officeDocument/2006/relationships" xmlns:m="http://schemas.openxmlformats.org/officeDocument/2006/math" xmlns:v="urn:schemas-microsoft-com:vml" xmlns:wp14="http://schemas.microsoft.com/office/word/2010/wordprocessingDrawing" xmlns:wp="http://schemas.openxmlformats.org/drawingml/2006/wordprocessingDrawing" xmlns:w10="urn:schemas-microsoft-com:office:word" xmlns:w="http://schemas.openxmlformats.org/wordprocessingml/2006/main" xmlns:w14="http://schemas.microsoft.com/office/word/2010/wordml" xmlns:w15="http://schemas.microsoft.com/office/word/2012/wordml" xmlns:w16cex="http://schemas.microsoft.com/office/word/2018/wordml/cex" xmlns:w16cid="http://schemas.microsoft.com/office/word/2016/wordml/cid" xmlns:w16="http://schemas.microsoft.com/office/word/2018/wordml" xmlns:w16sdtdh="http://schemas.microsoft.com/office/word/2020/wordml/sdtdatahash" xmlns:w16se="http://schemas.microsoft.com/office/word/2015/wordml/symex" xmlns:wpg="http://schemas.microsoft.com/office/word/2010/wordprocessingGroup" xmlns:wpi="http://schemas.microsoft.com/office/word/2010/wordprocessingInk" xmlns:wne="http://schemas.microsoft.com/office/word/2006/wordml" xmlns:wps="http://schemas.microsoft.com/office/word/2010/wordprocessingShape" mc:Ignorable="w14 w15 w16se w16cid w16 w16cex w16sdtdh wp14">
+<w:footnotes xmlns:wpc="http://schemas.microsoft.com/office/word/2010/wordprocessingCanvas" xmlns:cx="http://schemas.microsoft.com/office/drawing/2014/chartex" xmlns:cx1="http://schemas.microsoft.com/office/drawing/2015/9/8/chartex" xmlns:cx2="http://schemas.microsoft.com/office/drawing/2015/10/21/chartex" xmlns:cx3="http://schemas.microsoft.com/office/drawing/2016/5/9/chartex" xmlns:cx4="http://schemas.microsoft.com/office/drawing/2016/5/10/chartex" xmlns:cx5="http://schemas.microsoft.com/office/drawing/2016/5/11/chartex" xmlns:cx6="http://schemas.microsoft.com/office/drawing/2016/5/12/chartex" xmlns:cx7="http://schemas.microsoft.com/office/drawing/2016/5/13/chartex" xmlns:cx8="http://schemas.microsoft.com/office/drawing/2016/5/14/chartex" xmlns:mc="http://schemas.openxmlformats.org/markup-compatibility/2006" xmlns:m="http://schemas.openxmlformats.org/officeDocument/2006/math" xmlns:aink="http://schemas.microsoft.com/office/drawing/2016/ink" xmlns:am3d="http://schemas.microsoft.com/office/drawing/2017/model3d" xmlns:oel="http://schemas.microsoft.com/office/2019/extlst" xmlns:r="http://schemas.openxmlformats.org/officeDocument/2006/relationships" xmlns:wp14="http://schemas.microsoft.com/office/word/2010/wordprocessingDrawing" xmlns:wp="http://schemas.openxmlformats.org/drawingml/2006/wordprocessingDrawing" xmlns:wpg="http://schemas.microsoft.com/office/word/2010/wordprocessingGroup" xmlns:wpi="http://schemas.microsoft.com/office/word/2010/wordprocessingInk" xmlns:wps="http://schemas.microsoft.com/office/word/2010/wordprocessingShape" xmlns:o="urn:schemas-microsoft-com:office:office" xmlns:v="urn:schemas-microsoft-com:vml" xmlns:w10="urn:schemas-microsoft-com:office:word" xmlns:w="http://schemas.openxmlformats.org/wordprocessingml/2006/main" xmlns:w14="http://schemas.microsoft.com/office/word/2010/wordml" xmlns:w15="http://schemas.microsoft.com/office/word/2012/wordml" xmlns:w16cex="http://schemas.microsoft.com/office/word/2018/wordml/cex" xmlns:w16cid="http://schemas.microsoft.com/office/word/2016/wordml/cid" xmlns:w16="http://schemas.microsoft.com/office/word/2018/wordml" xmlns:w16sdtdh="http://schemas.microsoft.com/office/word/2020/wordml/sdtdatahash" xmlns:w16sdtfl="http://schemas.microsoft.com/office/word/2024/wordml/sdtformatlock" xmlns:w16se="http://schemas.microsoft.com/office/word/2015/wordml/symex" xmlns:w16du="http://schemas.microsoft.com/office/word/2023/wordml/word16du" xmlns:wne="http://schemas.microsoft.com/office/word/2006/wordml" mc:Ignorable="w14 w15 w16se w16cid w16 w16cex w16sdtdh w16sdtfl w16du wp14">
   <w:footnote w:type="separator" w:id="-1">
     <w:p>
       <w:r>
@@ -7230,7 +6553,7 @@
 </file>
 
 <file path=word/header1.xml><?xml version="1.0" encoding="utf-8"?>
-<w:hdr xmlns:wpc="http://schemas.microsoft.com/office/word/2010/wordprocessingCanvas" xmlns:cx="http://schemas.microsoft.com/office/drawing/2014/chartex" xmlns:cx1="http://schemas.microsoft.com/office/drawing/2015/9/8/chartex" xmlns:cx2="http://schemas.microsoft.com/office/drawing/2015/10/21/chartex" xmlns:cx3="http://schemas.microsoft.com/office/drawing/2016/5/9/chartex" xmlns:cx4="http://schemas.microsoft.com/office/drawing/2016/5/10/chartex" xmlns:cx5="http://schemas.microsoft.com/office/drawing/2016/5/11/chartex" xmlns:cx6="http://schemas.microsoft.com/office/drawing/2016/5/12/chartex" xmlns:cx7="http://schemas.microsoft.com/office/drawing/2016/5/13/chartex" xmlns:cx8="http://schemas.microsoft.com/office/drawing/2016/5/14/chartex" xmlns:mc="http://schemas.openxmlformats.org/markup-compatibility/2006" xmlns:aink="http://schemas.microsoft.com/office/drawing/2016/ink" xmlns:am3d="http://schemas.microsoft.com/office/drawing/2017/model3d" xmlns:o="urn:schemas-microsoft-com:office:office" xmlns:oel="http://schemas.microsoft.com/office/2019/extlst" xmlns:r="http://schemas.openxmlformats.org/officeDocument/2006/relationships" xmlns:m="http://schemas.openxmlformats.org/officeDocument/2006/math" xmlns:v="urn:schemas-microsoft-com:vml" xmlns:wp14="http://schemas.microsoft.com/office/word/2010/wordprocessingDrawing" xmlns:wp="http://schemas.openxmlformats.org/drawingml/2006/wordprocessingDrawing" xmlns:w10="urn:schemas-microsoft-com:office:word" xmlns:w="http://schemas.openxmlformats.org/wordprocessingml/2006/main" xmlns:w14="http://schemas.microsoft.com/office/word/2010/wordml" xmlns:w15="http://schemas.microsoft.com/office/word/2012/wordml" xmlns:w16cex="http://schemas.microsoft.com/office/word/2018/wordml/cex" xmlns:w16cid="http://schemas.microsoft.com/office/word/2016/wordml/cid" xmlns:w16="http://schemas.microsoft.com/office/word/2018/wordml" xmlns:w16sdtdh="http://schemas.microsoft.com/office/word/2020/wordml/sdtdatahash" xmlns:w16se="http://schemas.microsoft.com/office/word/2015/wordml/symex" xmlns:wpg="http://schemas.microsoft.com/office/word/2010/wordprocessingGroup" xmlns:wpi="http://schemas.microsoft.com/office/word/2010/wordprocessingInk" xmlns:wne="http://schemas.microsoft.com/office/word/2006/wordml" xmlns:wps="http://schemas.microsoft.com/office/word/2010/wordprocessingShape" mc:Ignorable="w14 w15 w16se w16cid w16 w16cex w16sdtdh wp14">
+<w:hdr xmlns:wpc="http://schemas.microsoft.com/office/word/2010/wordprocessingCanvas" xmlns:cx="http://schemas.microsoft.com/office/drawing/2014/chartex" xmlns:cx1="http://schemas.microsoft.com/office/drawing/2015/9/8/chartex" xmlns:cx2="http://schemas.microsoft.com/office/drawing/2015/10/21/chartex" xmlns:cx3="http://schemas.microsoft.com/office/drawing/2016/5/9/chartex" xmlns:cx4="http://schemas.microsoft.com/office/drawing/2016/5/10/chartex" xmlns:cx5="http://schemas.microsoft.com/office/drawing/2016/5/11/chartex" xmlns:cx6="http://schemas.microsoft.com/office/drawing/2016/5/12/chartex" xmlns:cx7="http://schemas.microsoft.com/office/drawing/2016/5/13/chartex" xmlns:cx8="http://schemas.microsoft.com/office/drawing/2016/5/14/chartex" xmlns:mc="http://schemas.openxmlformats.org/markup-compatibility/2006" xmlns:m="http://schemas.openxmlformats.org/officeDocument/2006/math" xmlns:aink="http://schemas.microsoft.com/office/drawing/2016/ink" xmlns:am3d="http://schemas.microsoft.com/office/drawing/2017/model3d" xmlns:oel="http://schemas.microsoft.com/office/2019/extlst" xmlns:r="http://schemas.openxmlformats.org/officeDocument/2006/relationships" xmlns:wp14="http://schemas.microsoft.com/office/word/2010/wordprocessingDrawing" xmlns:wp="http://schemas.openxmlformats.org/drawingml/2006/wordprocessingDrawing" xmlns:wpg="http://schemas.microsoft.com/office/word/2010/wordprocessingGroup" xmlns:wpi="http://schemas.microsoft.com/office/word/2010/wordprocessingInk" xmlns:wps="http://schemas.microsoft.com/office/word/2010/wordprocessingShape" xmlns:o="urn:schemas-microsoft-com:office:office" xmlns:v="urn:schemas-microsoft-com:vml" xmlns:w10="urn:schemas-microsoft-com:office:word" xmlns:w="http://schemas.openxmlformats.org/wordprocessingml/2006/main" xmlns:w14="http://schemas.microsoft.com/office/word/2010/wordml" xmlns:w15="http://schemas.microsoft.com/office/word/2012/wordml" xmlns:w16cex="http://schemas.microsoft.com/office/word/2018/wordml/cex" xmlns:w16cid="http://schemas.microsoft.com/office/word/2016/wordml/cid" xmlns:w16="http://schemas.microsoft.com/office/word/2018/wordml" xmlns:w16sdtdh="http://schemas.microsoft.com/office/word/2020/wordml/sdtdatahash" xmlns:w16sdtfl="http://schemas.microsoft.com/office/word/2024/wordml/sdtformatlock" xmlns:w16se="http://schemas.microsoft.com/office/word/2015/wordml/symex" xmlns:w16du="http://schemas.microsoft.com/office/word/2023/wordml/word16du" xmlns:wne="http://schemas.microsoft.com/office/word/2006/wordml" mc:Ignorable="w14 w15 w16se w16cid w16 w16cex w16sdtdh w16sdtfl w16du wp14">
   <w:p>
     <w:pPr>
       <w:pStyle w:val="Header"/>
@@ -7359,7 +6682,7 @@
 </file>
 
 <file path=word/header2.xml><?xml version="1.0" encoding="utf-8"?>
-<w:hdr xmlns:wpc="http://schemas.microsoft.com/office/word/2010/wordprocessingCanvas" xmlns:cx="http://schemas.microsoft.com/office/drawing/2014/chartex" xmlns:cx1="http://schemas.microsoft.com/office/drawing/2015/9/8/chartex" xmlns:cx2="http://schemas.microsoft.com/office/drawing/2015/10/21/chartex" xmlns:cx3="http://schemas.microsoft.com/office/drawing/2016/5/9/chartex" xmlns:cx4="http://schemas.microsoft.com/office/drawing/2016/5/10/chartex" xmlns:cx5="http://schemas.microsoft.com/office/drawing/2016/5/11/chartex" xmlns:cx6="http://schemas.microsoft.com/office/drawing/2016/5/12/chartex" xmlns:cx7="http://schemas.microsoft.com/office/drawing/2016/5/13/chartex" xmlns:cx8="http://schemas.microsoft.com/office/drawing/2016/5/14/chartex" xmlns:mc="http://schemas.openxmlformats.org/markup-compatibility/2006" xmlns:aink="http://schemas.microsoft.com/office/drawing/2016/ink" xmlns:am3d="http://schemas.microsoft.com/office/drawing/2017/model3d" xmlns:o="urn:schemas-microsoft-com:office:office" xmlns:oel="http://schemas.microsoft.com/office/2019/extlst" xmlns:r="http://schemas.openxmlformats.org/officeDocument/2006/relationships" xmlns:m="http://schemas.openxmlformats.org/officeDocument/2006/math" xmlns:v="urn:schemas-microsoft-com:vml" xmlns:wp14="http://schemas.microsoft.com/office/word/2010/wordprocessingDrawing" xmlns:wp="http://schemas.openxmlformats.org/drawingml/2006/wordprocessingDrawing" xmlns:w10="urn:schemas-microsoft-com:office:word" xmlns:w="http://schemas.openxmlformats.org/wordprocessingml/2006/main" xmlns:w14="http://schemas.microsoft.com/office/word/2010/wordml" xmlns:w15="http://schemas.microsoft.com/office/word/2012/wordml" xmlns:w16cex="http://schemas.microsoft.com/office/word/2018/wordml/cex" xmlns:w16cid="http://schemas.microsoft.com/office/word/2016/wordml/cid" xmlns:w16="http://schemas.microsoft.com/office/word/2018/wordml" xmlns:w16sdtdh="http://schemas.microsoft.com/office/word/2020/wordml/sdtdatahash" xmlns:w16se="http://schemas.microsoft.com/office/word/2015/wordml/symex" xmlns:wpg="http://schemas.microsoft.com/office/word/2010/wordprocessingGroup" xmlns:wpi="http://schemas.microsoft.com/office/word/2010/wordprocessingInk" xmlns:wne="http://schemas.microsoft.com/office/word/2006/wordml" xmlns:wps="http://schemas.microsoft.com/office/word/2010/wordprocessingShape" mc:Ignorable="w14 w15 w16se w16cid w16 w16cex w16sdtdh wp14">
+<w:hdr xmlns:wpc="http://schemas.microsoft.com/office/word/2010/wordprocessingCanvas" xmlns:cx="http://schemas.microsoft.com/office/drawing/2014/chartex" xmlns:cx1="http://schemas.microsoft.com/office/drawing/2015/9/8/chartex" xmlns:cx2="http://schemas.microsoft.com/office/drawing/2015/10/21/chartex" xmlns:cx3="http://schemas.microsoft.com/office/drawing/2016/5/9/chartex" xmlns:cx4="http://schemas.microsoft.com/office/drawing/2016/5/10/chartex" xmlns:cx5="http://schemas.microsoft.com/office/drawing/2016/5/11/chartex" xmlns:cx6="http://schemas.microsoft.com/office/drawing/2016/5/12/chartex" xmlns:cx7="http://schemas.microsoft.com/office/drawing/2016/5/13/chartex" xmlns:cx8="http://schemas.microsoft.com/office/drawing/2016/5/14/chartex" xmlns:mc="http://schemas.openxmlformats.org/markup-compatibility/2006" xmlns:m="http://schemas.openxmlformats.org/officeDocument/2006/math" xmlns:aink="http://schemas.microsoft.com/office/drawing/2016/ink" xmlns:am3d="http://schemas.microsoft.com/office/drawing/2017/model3d" xmlns:oel="http://schemas.microsoft.com/office/2019/extlst" xmlns:r="http://schemas.openxmlformats.org/officeDocument/2006/relationships" xmlns:wp14="http://schemas.microsoft.com/office/word/2010/wordprocessingDrawing" xmlns:wp="http://schemas.openxmlformats.org/drawingml/2006/wordprocessingDrawing" xmlns:wpg="http://schemas.microsoft.com/office/word/2010/wordprocessingGroup" xmlns:wpi="http://schemas.microsoft.com/office/word/2010/wordprocessingInk" xmlns:wps="http://schemas.microsoft.com/office/word/2010/wordprocessingShape" xmlns:o="urn:schemas-microsoft-com:office:office" xmlns:v="urn:schemas-microsoft-com:vml" xmlns:w10="urn:schemas-microsoft-com:office:word" xmlns:w="http://schemas.openxmlformats.org/wordprocessingml/2006/main" xmlns:w14="http://schemas.microsoft.com/office/word/2010/wordml" xmlns:w15="http://schemas.microsoft.com/office/word/2012/wordml" xmlns:w16cex="http://schemas.microsoft.com/office/word/2018/wordml/cex" xmlns:w16cid="http://schemas.microsoft.com/office/word/2016/wordml/cid" xmlns:w16="http://schemas.microsoft.com/office/word/2018/wordml" xmlns:w16sdtdh="http://schemas.microsoft.com/office/word/2020/wordml/sdtdatahash" xmlns:w16sdtfl="http://schemas.microsoft.com/office/word/2024/wordml/sdtformatlock" xmlns:w16se="http://schemas.microsoft.com/office/word/2015/wordml/symex" xmlns:w16du="http://schemas.microsoft.com/office/word/2023/wordml/word16du" xmlns:wne="http://schemas.microsoft.com/office/word/2006/wordml" mc:Ignorable="w14 w15 w16se w16cid w16 w16cex w16sdtdh w16sdtfl w16du wp14">
   <w:p>
     <w:pPr>
       <w:pStyle w:val="Header"/>
@@ -7488,7 +6811,7 @@
 </file>
 
 <file path=word/header3.xml><?xml version="1.0" encoding="utf-8"?>
-<w:hdr xmlns:wpc="http://schemas.microsoft.com/office/word/2010/wordprocessingCanvas" xmlns:cx="http://schemas.microsoft.com/office/drawing/2014/chartex" xmlns:cx1="http://schemas.microsoft.com/office/drawing/2015/9/8/chartex" xmlns:cx2="http://schemas.microsoft.com/office/drawing/2015/10/21/chartex" xmlns:cx3="http://schemas.microsoft.com/office/drawing/2016/5/9/chartex" xmlns:cx4="http://schemas.microsoft.com/office/drawing/2016/5/10/chartex" xmlns:cx5="http://schemas.microsoft.com/office/drawing/2016/5/11/chartex" xmlns:cx6="http://schemas.microsoft.com/office/drawing/2016/5/12/chartex" xmlns:cx7="http://schemas.microsoft.com/office/drawing/2016/5/13/chartex" xmlns:cx8="http://schemas.microsoft.com/office/drawing/2016/5/14/chartex" xmlns:mc="http://schemas.openxmlformats.org/markup-compatibility/2006" xmlns:aink="http://schemas.microsoft.com/office/drawing/2016/ink" xmlns:am3d="http://schemas.microsoft.com/office/drawing/2017/model3d" xmlns:o="urn:schemas-microsoft-com:office:office" xmlns:oel="http://schemas.microsoft.com/office/2019/extlst" xmlns:r="http://schemas.openxmlformats.org/officeDocument/2006/relationships" xmlns:m="http://schemas.openxmlformats.org/officeDocument/2006/math" xmlns:v="urn:schemas-microsoft-com:vml" xmlns:wp14="http://schemas.microsoft.com/office/word/2010/wordprocessingDrawing" xmlns:wp="http://schemas.openxmlformats.org/drawingml/2006/wordprocessingDrawing" xmlns:w10="urn:schemas-microsoft-com:office:word" xmlns:w="http://schemas.openxmlformats.org/wordprocessingml/2006/main" xmlns:w14="http://schemas.microsoft.com/office/word/2010/wordml" xmlns:w15="http://schemas.microsoft.com/office/word/2012/wordml" xmlns:w16cex="http://schemas.microsoft.com/office/word/2018/wordml/cex" xmlns:w16cid="http://schemas.microsoft.com/office/word/2016/wordml/cid" xmlns:w16="http://schemas.microsoft.com/office/word/2018/wordml" xmlns:w16sdtdh="http://schemas.microsoft.com/office/word/2020/wordml/sdtdatahash" xmlns:w16se="http://schemas.microsoft.com/office/word/2015/wordml/symex" xmlns:wpg="http://schemas.microsoft.com/office/word/2010/wordprocessingGroup" xmlns:wpi="http://schemas.microsoft.com/office/word/2010/wordprocessingInk" xmlns:wne="http://schemas.microsoft.com/office/word/2006/wordml" xmlns:wps="http://schemas.microsoft.com/office/word/2010/wordprocessingShape" mc:Ignorable="w14 w15 w16se w16cid w16 w16cex w16sdtdh wp14">
+<w:hdr xmlns:wpc="http://schemas.microsoft.com/office/word/2010/wordprocessingCanvas" xmlns:cx="http://schemas.microsoft.com/office/drawing/2014/chartex" xmlns:cx1="http://schemas.microsoft.com/office/drawing/2015/9/8/chartex" xmlns:cx2="http://schemas.microsoft.com/office/drawing/2015/10/21/chartex" xmlns:cx3="http://schemas.microsoft.com/office/drawing/2016/5/9/chartex" xmlns:cx4="http://schemas.microsoft.com/office/drawing/2016/5/10/chartex" xmlns:cx5="http://schemas.microsoft.com/office/drawing/2016/5/11/chartex" xmlns:cx6="http://schemas.microsoft.com/office/drawing/2016/5/12/chartex" xmlns:cx7="http://schemas.microsoft.com/office/drawing/2016/5/13/chartex" xmlns:cx8="http://schemas.microsoft.com/office/drawing/2016/5/14/chartex" xmlns:mc="http://schemas.openxmlformats.org/markup-compatibility/2006" xmlns:m="http://schemas.openxmlformats.org/officeDocument/2006/math" xmlns:aink="http://schemas.microsoft.com/office/drawing/2016/ink" xmlns:am3d="http://schemas.microsoft.com/office/drawing/2017/model3d" xmlns:oel="http://schemas.microsoft.com/office/2019/extlst" xmlns:r="http://schemas.openxmlformats.org/officeDocument/2006/relationships" xmlns:wp14="http://schemas.microsoft.com/office/word/2010/wordprocessingDrawing" xmlns:wp="http://schemas.openxmlformats.org/drawingml/2006/wordprocessingDrawing" xmlns:wpg="http://schemas.microsoft.com/office/word/2010/wordprocessingGroup" xmlns:wpi="http://schemas.microsoft.com/office/word/2010/wordprocessingInk" xmlns:wps="http://schemas.microsoft.com/office/word/2010/wordprocessingShape" xmlns:o="urn:schemas-microsoft-com:office:office" xmlns:v="urn:schemas-microsoft-com:vml" xmlns:w10="urn:schemas-microsoft-com:office:word" xmlns:w="http://schemas.openxmlformats.org/wordprocessingml/2006/main" xmlns:w14="http://schemas.microsoft.com/office/word/2010/wordml" xmlns:w15="http://schemas.microsoft.com/office/word/2012/wordml" xmlns:w16cex="http://schemas.microsoft.com/office/word/2018/wordml/cex" xmlns:w16cid="http://schemas.microsoft.com/office/word/2016/wordml/cid" xmlns:w16="http://schemas.microsoft.com/office/word/2018/wordml" xmlns:w16sdtdh="http://schemas.microsoft.com/office/word/2020/wordml/sdtdatahash" xmlns:w16sdtfl="http://schemas.microsoft.com/office/word/2024/wordml/sdtformatlock" xmlns:w16se="http://schemas.microsoft.com/office/word/2015/wordml/symex" xmlns:w16du="http://schemas.microsoft.com/office/word/2023/wordml/word16du" xmlns:wne="http://schemas.microsoft.com/office/word/2006/wordml" mc:Ignorable="w14 w15 w16se w16cid w16 w16cex w16sdtdh w16sdtfl w16du wp14">
   <w:p>
     <w:pPr>
       <w:pStyle w:val="Header"/>
@@ -7617,7 +6940,7 @@
 </file>
 
 <file path=word/numbering.xml><?xml version="1.0" encoding="utf-8"?>
-<w:numbering xmlns:wpc="http://schemas.microsoft.com/office/word/2010/wordprocessingCanvas" xmlns:cx="http://schemas.microsoft.com/office/drawing/2014/chartex" xmlns:cx1="http://schemas.microsoft.com/office/drawing/2015/9/8/chartex" xmlns:cx2="http://schemas.microsoft.com/office/drawing/2015/10/21/chartex" xmlns:cx3="http://schemas.microsoft.com/office/drawing/2016/5/9/chartex" xmlns:cx4="http://schemas.microsoft.com/office/drawing/2016/5/10/chartex" xmlns:cx5="http://schemas.microsoft.com/office/drawing/2016/5/11/chartex" xmlns:cx6="http://schemas.microsoft.com/office/drawing/2016/5/12/chartex" xmlns:cx7="http://schemas.microsoft.com/office/drawing/2016/5/13/chartex" xmlns:cx8="http://schemas.microsoft.com/office/drawing/2016/5/14/chartex" xmlns:mc="http://schemas.openxmlformats.org/markup-compatibility/2006" xmlns:aink="http://schemas.microsoft.com/office/drawing/2016/ink" xmlns:am3d="http://schemas.microsoft.com/office/drawing/2017/model3d" xmlns:o="urn:schemas-microsoft-com:office:office" xmlns:oel="http://schemas.microsoft.com/office/2019/extlst" xmlns:r="http://schemas.openxmlformats.org/officeDocument/2006/relationships" xmlns:m="http://schemas.openxmlformats.org/officeDocument/2006/math" xmlns:v="urn:schemas-microsoft-com:vml" xmlns:wp14="http://schemas.microsoft.com/office/word/2010/wordprocessingDrawing" xmlns:wp="http://schemas.openxmlformats.org/drawingml/2006/wordprocessingDrawing" xmlns:w10="urn:schemas-microsoft-com:office:word" xmlns:w="http://schemas.openxmlformats.org/wordprocessingml/2006/main" xmlns:w14="http://schemas.microsoft.com/office/word/2010/wordml" xmlns:w15="http://schemas.microsoft.com/office/word/2012/wordml" xmlns:w16cex="http://schemas.microsoft.com/office/word/2018/wordml/cex" xmlns:w16cid="http://schemas.microsoft.com/office/word/2016/wordml/cid" xmlns:w16="http://schemas.microsoft.com/office/word/2018/wordml" xmlns:w16sdtdh="http://schemas.microsoft.com/office/word/2020/wordml/sdtdatahash" xmlns:w16se="http://schemas.microsoft.com/office/word/2015/wordml/symex" xmlns:wpg="http://schemas.microsoft.com/office/word/2010/wordprocessingGroup" xmlns:wpi="http://schemas.microsoft.com/office/word/2010/wordprocessingInk" xmlns:wne="http://schemas.microsoft.com/office/word/2006/wordml" xmlns:wps="http://schemas.microsoft.com/office/word/2010/wordprocessingShape" mc:Ignorable="w14 w15 w16se w16cid w16 w16cex w16sdtdh wp14">
+<w:numbering xmlns:wpc="http://schemas.microsoft.com/office/word/2010/wordprocessingCanvas" xmlns:cx="http://schemas.microsoft.com/office/drawing/2014/chartex" xmlns:cx1="http://schemas.microsoft.com/office/drawing/2015/9/8/chartex" xmlns:cx2="http://schemas.microsoft.com/office/drawing/2015/10/21/chartex" xmlns:cx3="http://schemas.microsoft.com/office/drawing/2016/5/9/chartex" xmlns:cx4="http://schemas.microsoft.com/office/drawing/2016/5/10/chartex" xmlns:cx5="http://schemas.microsoft.com/office/drawing/2016/5/11/chartex" xmlns:cx6="http://schemas.microsoft.com/office/drawing/2016/5/12/chartex" xmlns:cx7="http://schemas.microsoft.com/office/drawing/2016/5/13/chartex" xmlns:cx8="http://schemas.microsoft.com/office/drawing/2016/5/14/chartex" xmlns:mc="http://schemas.openxmlformats.org/markup-compatibility/2006" xmlns:m="http://schemas.openxmlformats.org/officeDocument/2006/math" xmlns:aink="http://schemas.microsoft.com/office/drawing/2016/ink" xmlns:am3d="http://schemas.microsoft.com/office/drawing/2017/model3d" xmlns:oel="http://schemas.microsoft.com/office/2019/extlst" xmlns:r="http://schemas.openxmlformats.org/officeDocument/2006/relationships" xmlns:wp14="http://schemas.microsoft.com/office/word/2010/wordprocessingDrawing" xmlns:wp="http://schemas.openxmlformats.org/drawingml/2006/wordprocessingDrawing" xmlns:wpg="http://schemas.microsoft.com/office/word/2010/wordprocessingGroup" xmlns:wpi="http://schemas.microsoft.com/office/word/2010/wordprocessingInk" xmlns:wps="http://schemas.microsoft.com/office/word/2010/wordprocessingShape" xmlns:o="urn:schemas-microsoft-com:office:office" xmlns:v="urn:schemas-microsoft-com:vml" xmlns:w10="urn:schemas-microsoft-com:office:word" xmlns:w="http://schemas.openxmlformats.org/wordprocessingml/2006/main" xmlns:w14="http://schemas.microsoft.com/office/word/2010/wordml" xmlns:w15="http://schemas.microsoft.com/office/word/2012/wordml" xmlns:w16cex="http://schemas.microsoft.com/office/word/2018/wordml/cex" xmlns:w16cid="http://schemas.microsoft.com/office/word/2016/wordml/cid" xmlns:w16="http://schemas.microsoft.com/office/word/2018/wordml" xmlns:w16sdtdh="http://schemas.microsoft.com/office/word/2020/wordml/sdtdatahash" xmlns:w16sdtfl="http://schemas.microsoft.com/office/word/2024/wordml/sdtformatlock" xmlns:w16se="http://schemas.microsoft.com/office/word/2015/wordml/symex" xmlns:w16du="http://schemas.microsoft.com/office/word/2023/wordml/word16du" xmlns:wne="http://schemas.microsoft.com/office/word/2006/wordml" mc:Ignorable="w14 w15 w16se w16cid w16 w16cex w16sdtdh w16sdtfl w16du wp14">
   <w:abstractNum w:abstractNumId="0" w15:restartNumberingAfterBreak="0">
     <w:nsid w:val="008C174E"/>
     <w:multiLevelType w:val="hybridMultilevel"/>
@@ -11701,7 +11024,7 @@
 </file>
 
 <file path=word/styles.xml><?xml version="1.0" encoding="utf-8"?>
-<w:styles xmlns:mc="http://schemas.openxmlformats.org/markup-compatibility/2006" xmlns:r="http://schemas.openxmlformats.org/officeDocument/2006/relationships" xmlns:w="http://schemas.openxmlformats.org/wordprocessingml/2006/main" xmlns:w14="http://schemas.microsoft.com/office/word/2010/wordml" xmlns:w15="http://schemas.microsoft.com/office/word/2012/wordml" xmlns:w16cex="http://schemas.microsoft.com/office/word/2018/wordml/cex" xmlns:w16cid="http://schemas.microsoft.com/office/word/2016/wordml/cid" xmlns:w16="http://schemas.microsoft.com/office/word/2018/wordml" xmlns:w16sdtdh="http://schemas.microsoft.com/office/word/2020/wordml/sdtdatahash" xmlns:w16se="http://schemas.microsoft.com/office/word/2015/wordml/symex" mc:Ignorable="w14 w15 w16se w16cid w16 w16cex w16sdtdh">
+<w:styles xmlns:mc="http://schemas.openxmlformats.org/markup-compatibility/2006" xmlns:r="http://schemas.openxmlformats.org/officeDocument/2006/relationships" xmlns:w="http://schemas.openxmlformats.org/wordprocessingml/2006/main" xmlns:w14="http://schemas.microsoft.com/office/word/2010/wordml" xmlns:w15="http://schemas.microsoft.com/office/word/2012/wordml" xmlns:w16cex="http://schemas.microsoft.com/office/word/2018/wordml/cex" xmlns:w16cid="http://schemas.microsoft.com/office/word/2016/wordml/cid" xmlns:w16="http://schemas.microsoft.com/office/word/2018/wordml" xmlns:w16sdtdh="http://schemas.microsoft.com/office/word/2020/wordml/sdtdatahash" xmlns:w16sdtfl="http://schemas.microsoft.com/office/word/2024/wordml/sdtformatlock" xmlns:w16se="http://schemas.microsoft.com/office/word/2015/wordml/symex" xmlns:w16du="http://schemas.microsoft.com/office/word/2023/wordml/word16du" mc:Ignorable="w14 w15 w16se w16cid w16 w16cex w16sdtdh w16sdtfl w16du">
   <w:docDefaults>
     <w:rPrDefault>
       <w:rPr>
@@ -12988,19 +12311,25 @@
 </file>
 
 <file path=customXml/item1.xml><?xml version="1.0" encoding="utf-8"?>
-<b:Sources xmlns:b="http://schemas.openxmlformats.org/officeDocument/2006/bibliography" xmlns="http://schemas.openxmlformats.org/officeDocument/2006/bibliography" SelectedStyle="\APA.XSL" StyleName="APA"/>
+<p:properties xmlns:p="http://schemas.microsoft.com/office/2006/metadata/properties" xmlns:xsi="http://www.w3.org/2001/XMLSchema-instance" xmlns:pc="http://schemas.microsoft.com/office/infopath/2007/PartnerControls">
+  <documentManagement>
+    <Category0 xmlns="bef73783-b83a-4f38-94d5-1aaaa1b3b0a2">1</Category0>
+    <i0f84bba906045b4af568ee102a52dcb xmlns="2933ac1b-cace-482f-bed9-bf9b7d80f34a">
+      <Terms xmlns="http://schemas.microsoft.com/office/infopath/2007/PartnerControls">
+        <TermInfo xmlns="http://schemas.microsoft.com/office/infopath/2007/PartnerControls">
+          <TermName xmlns="http://schemas.microsoft.com/office/infopath/2007/PartnerControls">Corporate Records</TermName>
+          <TermId xmlns="http://schemas.microsoft.com/office/infopath/2007/PartnerControls">2c702203-4f28-4769-bfc5-dad5ef3425c7</TermId>
+        </TermInfo>
+      </Terms>
+    </i0f84bba906045b4af568ee102a52dcb>
+    <TaxCatchAll xmlns="2933ac1b-cace-482f-bed9-bf9b7d80f34a">
+      <Value>1</Value>
+    </TaxCatchAll>
+  </documentManagement>
+</p:properties>
 </file>
 
 <file path=customXml/item2.xml><?xml version="1.0" encoding="utf-8"?>
-<?mso-contentType ?>
-<FormTemplates xmlns="http://schemas.microsoft.com/sharepoint/v3/contenttype/forms">
-  <Display>DocumentLibraryForm</Display>
-  <Edit>DocumentLibraryForm</Edit>
-  <New>DocumentLibraryForm</New>
-</FormTemplates>
-</file>
-
-<file path=customXml/item3.xml><?xml version="1.0" encoding="utf-8"?>
 <ct:contentTypeSchema xmlns:ct="http://schemas.microsoft.com/office/2006/metadata/contentType" xmlns:ma="http://schemas.microsoft.com/office/2006/metadata/properties/metaAttributes" ct:_="" ma:_="" ma:contentTypeName="Document" ma:contentTypeID="0x010100D17E1B4D89D91D49A316865B50B76B78" ma:contentTypeVersion="26" ma:contentTypeDescription="Create a new document." ma:contentTypeScope="" ma:versionID="2e43e94bda34b09537a48d601b321f81">
   <xsd:schema xmlns:xsd="http://www.w3.org/2001/XMLSchema" xmlns:xs="http://www.w3.org/2001/XMLSchema" xmlns:p="http://schemas.microsoft.com/office/2006/metadata/properties" xmlns:ns2="bef73783-b83a-4f38-94d5-1aaaa1b3b0a2" xmlns:ns3="2933ac1b-cace-482f-bed9-bf9b7d80f34a" targetNamespace="http://schemas.microsoft.com/office/2006/metadata/properties" ma:root="true" ma:fieldsID="68ad2338b471bae35515ce7eaf1f964b" ns2:_="" ns3:_="">
     <xsd:import namespace="bef73783-b83a-4f38-94d5-1aaaa1b3b0a2"/>
@@ -13215,46 +12544,20 @@
 </ct:contentTypeSchema>
 </file>
 
+<file path=customXml/item3.xml><?xml version="1.0" encoding="utf-8"?>
+<?mso-contentType ?>
+<FormTemplates xmlns="http://schemas.microsoft.com/sharepoint/v3/contenttype/forms">
+  <Display>DocumentLibraryForm</Display>
+  <Edit>DocumentLibraryForm</Edit>
+  <New>DocumentLibraryForm</New>
+</FormTemplates>
+</file>
+
 <file path=customXml/item4.xml><?xml version="1.0" encoding="utf-8"?>
-<p:properties xmlns:p="http://schemas.microsoft.com/office/2006/metadata/properties" xmlns:xsi="http://www.w3.org/2001/XMLSchema-instance" xmlns:pc="http://schemas.microsoft.com/office/infopath/2007/PartnerControls">
-  <documentManagement>
-    <Category0 xmlns="bef73783-b83a-4f38-94d5-1aaaa1b3b0a2">1</Category0>
-    <i0f84bba906045b4af568ee102a52dcb xmlns="2933ac1b-cace-482f-bed9-bf9b7d80f34a">
-      <Terms xmlns="http://schemas.microsoft.com/office/infopath/2007/PartnerControls">
-        <TermInfo xmlns="http://schemas.microsoft.com/office/infopath/2007/PartnerControls">
-          <TermName xmlns="http://schemas.microsoft.com/office/infopath/2007/PartnerControls">Corporate Records</TermName>
-          <TermId xmlns="http://schemas.microsoft.com/office/infopath/2007/PartnerControls">2c702203-4f28-4769-bfc5-dad5ef3425c7</TermId>
-        </TermInfo>
-      </Terms>
-    </i0f84bba906045b4af568ee102a52dcb>
-    <TaxCatchAll xmlns="2933ac1b-cace-482f-bed9-bf9b7d80f34a">
-      <Value>1</Value>
-    </TaxCatchAll>
-  </documentManagement>
-</p:properties>
+<b:Sources xmlns:b="http://schemas.openxmlformats.org/officeDocument/2006/bibliography" xmlns="http://schemas.openxmlformats.org/officeDocument/2006/bibliography" SelectedStyle="\APA.XSL" StyleName="APA"/>
 </file>
 
 <file path=customXml/itemProps1.xml><?xml version="1.0" encoding="utf-8"?>
-<ds:datastoreItem xmlns:ds="http://schemas.openxmlformats.org/officeDocument/2006/customXml" ds:itemID="{7769C2E1-50C7-4AF2-861B-F52E75CE3623}">
-  <ds:schemaRefs>
-    <ds:schemaRef ds:uri="http://schemas.openxmlformats.org/officeDocument/2006/bibliography"/>
-  </ds:schemaRefs>
-</ds:datastoreItem>
-</file>
-
-<file path=customXml/itemProps2.xml><?xml version="1.0" encoding="utf-8"?>
-<ds:datastoreItem xmlns:ds="http://schemas.openxmlformats.org/officeDocument/2006/customXml" ds:itemID="{93737E1E-B456-42C7-9F02-6B7D736E2393}">
-  <ds:schemaRefs>
-    <ds:schemaRef ds:uri="http://schemas.microsoft.com/sharepoint/v3/contenttype/forms"/>
-  </ds:schemaRefs>
-</ds:datastoreItem>
-</file>
-
-<file path=customXml/itemProps3.xml><?xml version="1.0" encoding="utf-8"?>
-<ds:datastoreItem xmlns:ds="http://schemas.openxmlformats.org/officeDocument/2006/customXml" ds:itemID="{05C235B8-E803-46E7-B24C-80752B1E7EE4}"/>
-</file>
-
-<file path=customXml/itemProps4.xml><?xml version="1.0" encoding="utf-8"?>
 <ds:datastoreItem xmlns:ds="http://schemas.openxmlformats.org/officeDocument/2006/customXml" ds:itemID="{88E25B5C-5BD7-403A-8876-7F03EDF4549D}">
   <ds:schemaRefs>
     <ds:schemaRef ds:uri="http://schemas.microsoft.com/office/2006/metadata/properties"/>
@@ -13263,4 +12566,39 @@
     <ds:schemaRef ds:uri="2933ac1b-cace-482f-bed9-bf9b7d80f34a"/>
   </ds:schemaRefs>
 </ds:datastoreItem>
+</file>
+
+<file path=customXml/itemProps2.xml><?xml version="1.0" encoding="utf-8"?>
+<ds:datastoreItem xmlns:ds="http://schemas.openxmlformats.org/officeDocument/2006/customXml" ds:itemID="{05C235B8-E803-46E7-B24C-80752B1E7EE4}">
+  <ds:schemaRefs>
+    <ds:schemaRef ds:uri="http://schemas.microsoft.com/office/2006/metadata/contentType"/>
+    <ds:schemaRef ds:uri="http://schemas.microsoft.com/office/2006/metadata/properties/metaAttributes"/>
+    <ds:schemaRef ds:uri="http://www.w3.org/2001/XMLSchema"/>
+    <ds:schemaRef ds:uri="http://schemas.microsoft.com/office/2006/metadata/properties"/>
+    <ds:schemaRef ds:uri="bef73783-b83a-4f38-94d5-1aaaa1b3b0a2"/>
+    <ds:schemaRef ds:uri="2933ac1b-cace-482f-bed9-bf9b7d80f34a"/>
+    <ds:schemaRef ds:uri="http://schemas.microsoft.com/office/2006/documentManagement/types"/>
+    <ds:schemaRef ds:uri="http://schemas.microsoft.com/office/infopath/2007/PartnerControls"/>
+    <ds:schemaRef ds:uri="http://schemas.openxmlformats.org/package/2006/metadata/core-properties"/>
+    <ds:schemaRef ds:uri="http://purl.org/dc/elements/1.1/"/>
+    <ds:schemaRef ds:uri="http://purl.org/dc/terms/"/>
+    <ds:schemaRef ds:uri="http://schemas.microsoft.com/internal/obd"/>
+  </ds:schemaRefs>
+</ds:datastoreItem>
+</file>
+
+<file path=customXml/itemProps3.xml><?xml version="1.0" encoding="utf-8"?>
+<ds:datastoreItem xmlns:ds="http://schemas.openxmlformats.org/officeDocument/2006/customXml" ds:itemID="{93737E1E-B456-42C7-9F02-6B7D736E2393}">
+  <ds:schemaRefs>
+    <ds:schemaRef ds:uri="http://schemas.microsoft.com/sharepoint/v3/contenttype/forms"/>
+  </ds:schemaRefs>
+</ds:datastoreItem>
+</file>
+
+<file path=customXml/itemProps4.xml><?xml version="1.0" encoding="utf-8"?>
+<ds:datastoreItem xmlns:ds="http://schemas.openxmlformats.org/officeDocument/2006/customXml" ds:itemID="{7769C2E1-50C7-4AF2-861B-F52E75CE3623}">
+  <ds:schemaRefs>
+    <ds:schemaRef ds:uri="http://schemas.openxmlformats.org/officeDocument/2006/bibliography"/>
+  </ds:schemaRefs>
+</ds:datastoreItem>
 </file>
</xml_diff>